<commit_message>
Finalize 2026 application documents
</commit_message>
<xml_diff>
--- a/downloads/2026_V-LEAD_kiso-chousahyo.docx
+++ b/downloads/2026_V-LEAD_kiso-chousahyo.docx
@@ -1,6 +1,6 @@
 
 <file path=word/document.xml><?xml version="1.0" encoding="utf-8"?>
-<w:document xmlns:wpc="http://schemas.microsoft.com/office/word/2010/wordprocessingCanvas" xmlns:cx="http://schemas.microsoft.com/office/drawing/2014/chartex" xmlns:cx1="http://schemas.microsoft.com/office/drawing/2015/9/8/chartex" xmlns:cx2="http://schemas.microsoft.com/office/drawing/2015/10/21/chartex" xmlns:cx3="http://schemas.microsoft.com/office/drawing/2016/5/9/chartex" xmlns:cx4="http://schemas.microsoft.com/office/drawing/2016/5/10/chartex" xmlns:cx5="http://schemas.microsoft.com/office/drawing/2016/5/11/chartex" xmlns:cx6="http://schemas.microsoft.com/office/drawing/2016/5/12/chartex" xmlns:cx7="http://schemas.microsoft.com/office/drawing/2016/5/13/chartex" xmlns:cx8="http://schemas.microsoft.com/office/drawing/2016/5/14/chartex" xmlns:mc="http://schemas.openxmlformats.org/markup-compatibility/2006" xmlns:aink="http://schemas.microsoft.com/office/drawing/2016/ink" xmlns:am3d="http://schemas.microsoft.com/office/drawing/2017/model3d" xmlns:o="urn:schemas-microsoft-com:office:office" xmlns:oel="http://schemas.microsoft.com/office/2019/extlst" xmlns:r="http://schemas.openxmlformats.org/officeDocument/2006/relationships" xmlns:m="http://schemas.openxmlformats.org/officeDocument/2006/math" xmlns:v="urn:schemas-microsoft-com:vml" xmlns:wp14="http://schemas.microsoft.com/office/word/2010/wordprocessingDrawing" xmlns:wp="http://schemas.openxmlformats.org/drawingml/2006/wordprocessingDrawing" xmlns:w10="urn:schemas-microsoft-com:office:word" xmlns:w="http://schemas.openxmlformats.org/wordprocessingml/2006/main" xmlns:w14="http://schemas.microsoft.com/office/word/2010/wordml" xmlns:w15="http://schemas.microsoft.com/office/word/2012/wordml" xmlns:w16cex="http://schemas.microsoft.com/office/word/2018/wordml/cex" xmlns:w16cid="http://schemas.microsoft.com/office/word/2016/wordml/cid" xmlns:w16="http://schemas.microsoft.com/office/word/2018/wordml" xmlns:w16du="http://schemas.microsoft.com/office/word/2023/wordml/word16du" xmlns:w16sdtdh="http://schemas.microsoft.com/office/word/2020/wordml/sdtdatahash" xmlns:w16sdtfl="http://schemas.microsoft.com/office/word/2024/wordml/sdtformatlock" xmlns:w16se="http://schemas.microsoft.com/office/word/2015/wordml/symex" xmlns:wpg="http://schemas.microsoft.com/office/word/2010/wordprocessingGroup" xmlns:wpi="http://schemas.microsoft.com/office/word/2010/wordprocessingInk" xmlns:wne="http://schemas.microsoft.com/office/word/2006/wordml" xmlns:wps="http://schemas.microsoft.com/office/word/2010/wordprocessingShape" mc:Ignorable="w14 w15 w16se w16cid w16 w16cex w16sdtdh w16sdtfl w16du wp14">
+<w:document xmlns:a="http://schemas.openxmlformats.org/drawingml/2006/main" xmlns:mc="http://schemas.openxmlformats.org/markup-compatibility/2006" xmlns:ns4="http://schemas.microsoft.com/office/word/2010/wordprocessingDrawing" xmlns:ns6="http://schemas.microsoft.com/office/word/2010/wordprocessingShape" xmlns:o="urn:schemas-microsoft-com:office:office" xmlns:r="http://schemas.openxmlformats.org/officeDocument/2006/relationships" xmlns:v="urn:schemas-microsoft-com:vml" xmlns:w="http://schemas.openxmlformats.org/wordprocessingml/2006/main" xmlns:w14="http://schemas.microsoft.com/office/word/2010/wordml" xmlns:wp="http://schemas.openxmlformats.org/drawingml/2006/wordprocessingDrawing" mc:Ignorable="w14 w15 w16se w16cid w16 w16cex w16sdtdh w16sdtfl w16du wp14">
   <w:body>
     <w:p>
       <w:pPr>
@@ -24,33 +24,20 @@
         <w:spacing w:line="324" w:lineRule="auto"/>
         <w:jc w:val="center"/>
         <w:rPr>
-          <w:ins w:id="0" w:author="s s" w:date="2026-04-08T11:36:00Z" w16du:dateUtc="2026-04-08T02:36:00Z"/>
           <w:rFonts w:ascii="Century" w:eastAsia="ＭＳ 明朝" w:hAnsi="Century"/>
           <w:sz w:val="28"/>
           <w:szCs w:val="28"/>
         </w:rPr>
       </w:pPr>
       <w:bookmarkStart w:id="1" w:name="_Hlk495997791"/>
-      <w:ins w:id="2" w:author="s s" w:date="2026-04-07T17:53:00Z" w16du:dateUtc="2026-04-07T08:53:00Z">
-        <w:r>
-          <w:rPr>
-            <w:rFonts w:ascii="Century" w:eastAsia="ＭＳ 明朝" w:hAnsi="Century" w:hint="eastAsia"/>
-            <w:sz w:val="28"/>
-            <w:szCs w:val="28"/>
-          </w:rPr>
-          <w:t>火山ハザード対策研究人材育成プログラム</w:t>
-        </w:r>
-      </w:ins>
-      <w:del w:id="3" w:author="s s" w:date="2026-04-06T17:02:00Z" w16du:dateUtc="2026-04-06T08:02:00Z">
-        <w:r>
-          <w:rPr>
-            <w:rFonts w:ascii="Century" w:eastAsia="ＭＳ 明朝" w:hAnsi="Century" w:hint="eastAsia"/>
-            <w:sz w:val="28"/>
-            <w:szCs w:val="28"/>
-          </w:rPr>
-          <w:delText>次世代火山研究者育成プログラム</w:delText>
-        </w:r>
-      </w:del>
+      <w:r>
+        <w:rPr>
+          <w:rFonts w:ascii="Century" w:eastAsia="ＭＳ 明朝" w:hAnsi="Century" w:hint="eastAsia"/>
+          <w:sz w:val="28"/>
+          <w:szCs w:val="28"/>
+        </w:rPr>
+        <w:t>火山ハザード対策研究人材育成プログラム</w:t>
+      </w:r>
       <w:r>
         <w:rPr>
           <w:rFonts w:ascii="Century" w:eastAsia="ＭＳ 明朝" w:hAnsi="Century" w:hint="eastAsia"/>
@@ -85,7 +72,6 @@
         <w:spacing w:line="324" w:lineRule="auto"/>
         <w:jc w:val="center"/>
         <w:rPr>
-          <w:del w:id="4" w:author="s s" w:date="2026-04-07T13:47:00Z" w16du:dateUtc="2026-04-07T04:47:00Z"/>
           <w:rFonts w:ascii="Century" w:eastAsia="ＭＳ 明朝" w:hAnsi="Century"/>
           <w:sz w:val="22"/>
         </w:rPr>
@@ -538,7 +524,6 @@
         <w:snapToGrid w:val="0"/>
         <w:spacing w:line="324" w:lineRule="auto"/>
         <w:rPr>
-          <w:ins w:id="5" w:author="s s" w:date="2026-04-08T11:36:00Z" w16du:dateUtc="2026-04-08T02:36:00Z"/>
           <w:rFonts w:ascii="Century" w:eastAsia="ＭＳ 明朝" w:hAnsi="Century"/>
           <w:sz w:val="22"/>
         </w:rPr>
@@ -549,7 +534,6 @@
         <w:snapToGrid w:val="0"/>
         <w:spacing w:line="324" w:lineRule="auto"/>
         <w:rPr>
-          <w:ins w:id="6" w:author="s s" w:date="2026-04-06T23:12:00Z" w16du:dateUtc="2026-04-06T14:12:00Z"/>
           <w:rFonts w:ascii="Century" w:eastAsia="ＭＳ 明朝" w:hAnsi="Century"/>
           <w:sz w:val="22"/>
         </w:rPr>
@@ -560,129 +544,108 @@
         <w:snapToGrid w:val="0"/>
         <w:spacing w:line="324" w:lineRule="auto"/>
         <w:rPr>
-          <w:ins w:id="7" w:author="s s" w:date="2026-04-06T23:13:00Z" w16du:dateUtc="2026-04-06T14:13:00Z"/>
           <w:rFonts w:ascii="Century" w:eastAsia="ＭＳ 明朝" w:hAnsi="Century"/>
           <w:sz w:val="22"/>
         </w:rPr>
       </w:pPr>
-      <w:ins w:id="8" w:author="s s" w:date="2026-04-07T13:44:00Z" w16du:dateUtc="2026-04-07T04:44:00Z">
-        <w:r>
-          <w:rPr>
-            <w:rFonts w:ascii="Century" w:eastAsia="ＭＳ 明朝" w:hAnsi="Century" w:hint="eastAsia"/>
-            <w:sz w:val="22"/>
-          </w:rPr>
-          <w:t>・</w:t>
-        </w:r>
-      </w:ins>
-      <w:ins w:id="9" w:author="s s" w:date="2026-04-06T23:12:00Z" w16du:dateUtc="2026-04-06T14:12:00Z">
-        <w:r>
-          <w:rPr>
-            <w:rFonts w:ascii="Century" w:eastAsia="ＭＳ 明朝" w:hAnsi="Century" w:hint="eastAsia"/>
-            <w:sz w:val="22"/>
-          </w:rPr>
-          <w:t>調査票</w:t>
-        </w:r>
-      </w:ins>
-      <w:ins w:id="10" w:author="s s" w:date="2026-04-08T11:36:00Z" w16du:dateUtc="2026-04-08T02:36:00Z">
-        <w:r>
-          <w:rPr>
-            <w:rFonts w:ascii="Century" w:eastAsia="ＭＳ 明朝" w:hAnsi="Century" w:hint="eastAsia"/>
-            <w:sz w:val="22"/>
-          </w:rPr>
-          <w:t>を</w:t>
-        </w:r>
-      </w:ins>
-      <w:ins w:id="11" w:author="s s" w:date="2026-04-06T23:12:00Z" w16du:dateUtc="2026-04-06T14:12:00Z">
-        <w:r>
-          <w:rPr>
-            <w:rFonts w:ascii="Century" w:eastAsia="ＭＳ 明朝" w:hAnsi="Century" w:hint="eastAsia"/>
-            <w:sz w:val="22"/>
-          </w:rPr>
-          <w:t>作成するにあたり、</w:t>
-        </w:r>
-      </w:ins>
-      <w:ins w:id="12" w:author="s s" w:date="2026-04-07T13:44:00Z" w16du:dateUtc="2026-04-07T04:44:00Z">
-        <w:r>
-          <w:rPr>
-            <w:rFonts w:ascii="Century" w:eastAsia="ＭＳ 明朝" w:hAnsi="Century" w:hint="eastAsia"/>
-            <w:sz w:val="22"/>
-          </w:rPr>
-          <w:t>以下の</w:t>
-        </w:r>
-        <w:r>
-          <w:rPr>
-            <w:rFonts w:ascii="Century" w:eastAsia="ＭＳ 明朝" w:hAnsi="Century" w:hint="eastAsia"/>
-            <w:sz w:val="22"/>
-          </w:rPr>
-          <w:t>1.</w:t>
-        </w:r>
-        <w:r>
-          <w:rPr>
-            <w:rFonts w:ascii="Century" w:eastAsia="ＭＳ 明朝" w:hAnsi="Century" w:hint="eastAsia"/>
-            <w:sz w:val="22"/>
-          </w:rPr>
-          <w:t>～</w:t>
-        </w:r>
-        <w:r>
-          <w:rPr>
-            <w:rFonts w:ascii="Century" w:eastAsia="ＭＳ 明朝" w:hAnsi="Century" w:hint="eastAsia"/>
-            <w:sz w:val="22"/>
-          </w:rPr>
-          <w:t>3.</w:t>
-        </w:r>
-        <w:r>
-          <w:rPr>
-            <w:rFonts w:ascii="Century" w:eastAsia="ＭＳ 明朝" w:hAnsi="Century" w:hint="eastAsia"/>
-            <w:sz w:val="22"/>
-          </w:rPr>
-          <w:t>を</w:t>
-        </w:r>
-      </w:ins>
-      <w:ins w:id="13" w:author="s s" w:date="2026-04-06T23:12:00Z" w16du:dateUtc="2026-04-06T14:12:00Z">
-        <w:r>
-          <w:rPr>
-            <w:rFonts w:ascii="Century" w:eastAsia="ＭＳ 明朝" w:hAnsi="Century" w:hint="eastAsia"/>
-            <w:sz w:val="22"/>
-          </w:rPr>
-          <w:t>宣誓</w:t>
-        </w:r>
-      </w:ins>
-      <w:ins w:id="14" w:author="s s" w:date="2026-04-07T13:44:00Z" w16du:dateUtc="2026-04-07T04:44:00Z">
-        <w:r>
-          <w:rPr>
-            <w:rFonts w:ascii="Century" w:eastAsia="ＭＳ 明朝" w:hAnsi="Century" w:hint="eastAsia"/>
-            <w:sz w:val="22"/>
-          </w:rPr>
-          <w:t>いた</w:t>
-        </w:r>
-      </w:ins>
-      <w:ins w:id="15" w:author="s s" w:date="2026-04-06T23:12:00Z" w16du:dateUtc="2026-04-06T14:12:00Z">
-        <w:r>
-          <w:rPr>
-            <w:rFonts w:ascii="Century" w:eastAsia="ＭＳ 明朝" w:hAnsi="Century" w:hint="eastAsia"/>
-            <w:sz w:val="22"/>
-          </w:rPr>
-          <w:t>します。（確認後☑とする</w:t>
-        </w:r>
-      </w:ins>
-      <w:ins w:id="16" w:author="s s" w:date="2026-04-07T13:44:00Z" w16du:dateUtc="2026-04-07T04:44:00Z">
-        <w:r>
-          <w:rPr>
-            <w:rFonts w:ascii="Century" w:eastAsia="ＭＳ 明朝" w:hAnsi="Century" w:hint="eastAsia"/>
-            <w:sz w:val="22"/>
-          </w:rPr>
-          <w:t>こと</w:t>
-        </w:r>
-      </w:ins>
-      <w:ins w:id="17" w:author="s s" w:date="2026-04-06T23:12:00Z" w16du:dateUtc="2026-04-06T14:12:00Z">
-        <w:r>
-          <w:rPr>
-            <w:rFonts w:ascii="Century" w:eastAsia="ＭＳ 明朝" w:hAnsi="Century" w:hint="eastAsia"/>
-            <w:sz w:val="22"/>
-          </w:rPr>
-          <w:t>）</w:t>
-        </w:r>
-      </w:ins>
+      <w:r>
+        <w:rPr>
+          <w:rFonts w:ascii="Century" w:eastAsia="ＭＳ 明朝" w:hAnsi="Century" w:hint="eastAsia"/>
+          <w:sz w:val="22"/>
+        </w:rPr>
+        <w:t>・</w:t>
+      </w:r>
+      <w:r>
+        <w:rPr>
+          <w:rFonts w:ascii="Century" w:eastAsia="ＭＳ 明朝" w:hAnsi="Century" w:hint="eastAsia"/>
+          <w:sz w:val="22"/>
+        </w:rPr>
+        <w:t>調査票</w:t>
+      </w:r>
+      <w:r>
+        <w:rPr>
+          <w:rFonts w:ascii="Century" w:eastAsia="ＭＳ 明朝" w:hAnsi="Century" w:hint="eastAsia"/>
+          <w:sz w:val="22"/>
+        </w:rPr>
+        <w:t>を</w:t>
+      </w:r>
+      <w:r>
+        <w:rPr>
+          <w:rFonts w:ascii="Century" w:eastAsia="ＭＳ 明朝" w:hAnsi="Century" w:hint="eastAsia"/>
+          <w:sz w:val="22"/>
+        </w:rPr>
+        <w:t>作成するにあたり、</w:t>
+      </w:r>
+      <w:r>
+        <w:rPr>
+          <w:rFonts w:ascii="Century" w:eastAsia="ＭＳ 明朝" w:hAnsi="Century" w:hint="eastAsia"/>
+          <w:sz w:val="22"/>
+        </w:rPr>
+        <w:t>以下の</w:t>
+      </w:r>
+      <w:r>
+        <w:rPr>
+          <w:rFonts w:ascii="Century" w:eastAsia="ＭＳ 明朝" w:hAnsi="Century" w:hint="eastAsia"/>
+          <w:sz w:val="22"/>
+        </w:rPr>
+        <w:t>1.</w:t>
+      </w:r>
+      <w:r>
+        <w:rPr>
+          <w:rFonts w:ascii="Century" w:eastAsia="ＭＳ 明朝" w:hAnsi="Century" w:hint="eastAsia"/>
+          <w:sz w:val="22"/>
+        </w:rPr>
+        <w:t>～</w:t>
+      </w:r>
+      <w:r>
+        <w:rPr>
+          <w:rFonts w:ascii="Century" w:eastAsia="ＭＳ 明朝" w:hAnsi="Century" w:hint="eastAsia"/>
+          <w:sz w:val="22"/>
+        </w:rPr>
+        <w:t>3.</w:t>
+      </w:r>
+      <w:r>
+        <w:rPr>
+          <w:rFonts w:ascii="Century" w:eastAsia="ＭＳ 明朝" w:hAnsi="Century" w:hint="eastAsia"/>
+          <w:sz w:val="22"/>
+        </w:rPr>
+        <w:t>を</w:t>
+      </w:r>
+      <w:r>
+        <w:rPr>
+          <w:rFonts w:ascii="Century" w:eastAsia="ＭＳ 明朝" w:hAnsi="Century" w:hint="eastAsia"/>
+          <w:sz w:val="22"/>
+        </w:rPr>
+        <w:t>宣誓</w:t>
+      </w:r>
+      <w:r>
+        <w:rPr>
+          <w:rFonts w:ascii="Century" w:eastAsia="ＭＳ 明朝" w:hAnsi="Century" w:hint="eastAsia"/>
+          <w:sz w:val="22"/>
+        </w:rPr>
+        <w:t>いた</w:t>
+      </w:r>
+      <w:r>
+        <w:rPr>
+          <w:rFonts w:ascii="Century" w:eastAsia="ＭＳ 明朝" w:hAnsi="Century" w:hint="eastAsia"/>
+          <w:sz w:val="22"/>
+        </w:rPr>
+        <w:t>します。（確認後☑とする</w:t>
+      </w:r>
+      <w:r>
+        <w:rPr>
+          <w:rFonts w:ascii="Century" w:eastAsia="ＭＳ 明朝" w:hAnsi="Century" w:hint="eastAsia"/>
+          <w:sz w:val="22"/>
+        </w:rPr>
+        <w:t>こと</w:t>
+      </w:r>
+      <w:r>
+        <w:rPr>
+          <w:rFonts w:ascii="Century" w:eastAsia="ＭＳ 明朝" w:hAnsi="Century" w:hint="eastAsia"/>
+          <w:sz w:val="22"/>
+        </w:rPr>
+        <w:t>）</w:t>
+      </w:r>
     </w:p>
     <w:p>
       <w:pPr>
@@ -690,93 +653,80 @@
         <w:spacing w:line="324" w:lineRule="auto"/>
         <w:ind w:left="220" w:hangingChars="100" w:hanging="220"/>
         <w:rPr>
-          <w:ins w:id="18" w:author="s s" w:date="2026-04-06T23:13:00Z" w16du:dateUtc="2026-04-06T14:13:00Z"/>
           <w:rFonts w:ascii="Century" w:eastAsia="ＭＳ 明朝" w:hAnsi="Century"/>
           <w:sz w:val="22"/>
         </w:rPr>
-        <w:pPrChange w:id="19" w:author="s s" w:date="2026-04-08T11:37:00Z" w16du:dateUtc="2026-04-08T02:37:00Z">
-          <w:pPr>
-            <w:snapToGrid w:val="0"/>
-            <w:spacing w:line="324" w:lineRule="auto"/>
-          </w:pPr>
-        </w:pPrChange>
-      </w:pPr>
-      <w:ins w:id="20" w:author="s s" w:date="2026-04-06T23:13:00Z" w16du:dateUtc="2026-04-06T14:13:00Z">
-        <w:r>
-          <w:rPr>
-            <w:rFonts w:ascii="Century" w:eastAsia="ＭＳ 明朝" w:hAnsi="Century" w:hint="eastAsia"/>
-            <w:sz w:val="22"/>
-          </w:rPr>
-          <w:t>□</w:t>
-        </w:r>
-      </w:ins>
-      <w:ins w:id="21" w:author="s s" w:date="2026-04-07T13:45:00Z" w16du:dateUtc="2026-04-07T04:45:00Z">
-        <w:r>
-          <w:rPr>
-            <w:rFonts w:ascii="Century" w:eastAsia="ＭＳ 明朝" w:hAnsi="Century" w:hint="eastAsia"/>
-            <w:sz w:val="22"/>
-          </w:rPr>
-          <w:t xml:space="preserve">1. </w:t>
-        </w:r>
-      </w:ins>
-      <w:ins w:id="22" w:author="s s" w:date="2026-04-06T23:13:00Z" w16du:dateUtc="2026-04-06T14:13:00Z">
-        <w:r>
-          <w:rPr>
-            <w:rFonts w:ascii="Century" w:eastAsia="ＭＳ 明朝" w:hAnsi="Century" w:hint="eastAsia"/>
-            <w:sz w:val="22"/>
-          </w:rPr>
-          <w:t>本プログラムへ申し込</w:t>
-        </w:r>
-        <w:r>
-          <w:rPr>
-            <w:rFonts w:ascii="Century" w:eastAsia="ＭＳ 明朝" w:hAnsi="Century" w:hint="eastAsia"/>
-            <w:sz w:val="22"/>
-          </w:rPr>
-          <w:t>むことについて、</w:t>
-        </w:r>
-        <w:r>
-          <w:rPr>
-            <w:rFonts w:ascii="Century" w:eastAsia="ＭＳ 明朝" w:hAnsi="Century"/>
-            <w:sz w:val="22"/>
-          </w:rPr>
-          <w:t>202</w:t>
-        </w:r>
-        <w:r>
-          <w:rPr>
-            <w:rFonts w:ascii="Century" w:eastAsia="ＭＳ 明朝" w:hAnsi="Century" w:hint="eastAsia"/>
-            <w:sz w:val="22"/>
-          </w:rPr>
-          <w:t>6</w:t>
-        </w:r>
-        <w:r>
-          <w:rPr>
-            <w:rFonts w:ascii="Century" w:eastAsia="ＭＳ 明朝" w:hAnsi="Century" w:hint="eastAsia"/>
-            <w:sz w:val="22"/>
-          </w:rPr>
-          <w:t>年</w:t>
-        </w:r>
-        <w:r>
-          <w:rPr>
-            <w:rFonts w:ascii="Century" w:eastAsia="ＭＳ 明朝" w:hAnsi="Century"/>
-            <w:sz w:val="22"/>
-          </w:rPr>
-          <w:t>4</w:t>
-        </w:r>
-        <w:r>
-          <w:rPr>
-            <w:rFonts w:ascii="Century" w:eastAsia="ＭＳ 明朝" w:hAnsi="Century" w:hint="eastAsia"/>
-            <w:sz w:val="22"/>
-          </w:rPr>
-          <w:t>月に所属する大学院の指導教員</w:t>
-        </w:r>
-        <w:r>
-          <w:rPr>
-            <w:rFonts w:ascii="Century" w:eastAsia="ＭＳ 明朝" w:hAnsi="Century" w:hint="eastAsia"/>
-            <w:sz w:val="22"/>
-          </w:rPr>
-          <w:t>から承諾を得ました。</w:t>
-        </w:r>
-      </w:ins>
+      </w:pPr>
+      <w:r>
+        <w:rPr>
+          <w:rFonts w:ascii="Century" w:eastAsia="ＭＳ 明朝" w:hAnsi="Century" w:hint="eastAsia"/>
+          <w:sz w:val="22"/>
+        </w:rPr>
+        <w:t>□</w:t>
+      </w:r>
+      <w:r>
+        <w:rPr>
+          <w:rFonts w:ascii="Century" w:eastAsia="ＭＳ 明朝" w:hAnsi="Century" w:hint="eastAsia"/>
+          <w:sz w:val="22"/>
+        </w:rPr>
+        <w:t xml:space="preserve">1. </w:t>
+      </w:r>
+      <w:r>
+        <w:rPr>
+          <w:rFonts w:ascii="Century" w:eastAsia="ＭＳ 明朝" w:hAnsi="Century" w:hint="eastAsia"/>
+          <w:sz w:val="22"/>
+        </w:rPr>
+        <w:t>本プログラムへ申し込</w:t>
+      </w:r>
+      <w:r>
+        <w:rPr>
+          <w:rFonts w:ascii="Century" w:eastAsia="ＭＳ 明朝" w:hAnsi="Century" w:hint="eastAsia"/>
+          <w:sz w:val="22"/>
+        </w:rPr>
+        <w:t>むことについて、</w:t>
+      </w:r>
+      <w:r>
+        <w:rPr>
+          <w:rFonts w:ascii="Century" w:eastAsia="ＭＳ 明朝" w:hAnsi="Century"/>
+          <w:sz w:val="22"/>
+        </w:rPr>
+        <w:t>202</w:t>
+      </w:r>
+      <w:r>
+        <w:rPr>
+          <w:rFonts w:ascii="Century" w:eastAsia="ＭＳ 明朝" w:hAnsi="Century" w:hint="eastAsia"/>
+          <w:sz w:val="22"/>
+        </w:rPr>
+        <w:t>6</w:t>
+      </w:r>
+      <w:r>
+        <w:rPr>
+          <w:rFonts w:ascii="Century" w:eastAsia="ＭＳ 明朝" w:hAnsi="Century" w:hint="eastAsia"/>
+          <w:sz w:val="22"/>
+        </w:rPr>
+        <w:t>年</w:t>
+      </w:r>
+      <w:r>
+        <w:rPr>
+          <w:rFonts w:ascii="Century" w:eastAsia="ＭＳ 明朝" w:hAnsi="Century"/>
+          <w:sz w:val="22"/>
+        </w:rPr>
+        <w:t>4</w:t>
+      </w:r>
+      <w:r>
+        <w:rPr>
+          <w:rFonts w:ascii="Century" w:eastAsia="ＭＳ 明朝" w:hAnsi="Century" w:hint="eastAsia"/>
+          <w:sz w:val="22"/>
+        </w:rPr>
+        <w:t>月に所属する大学院の指導教員</w:t>
+      </w:r>
+      <w:r>
+        <w:rPr>
+          <w:rFonts w:ascii="Century" w:eastAsia="ＭＳ 明朝" w:hAnsi="Century" w:hint="eastAsia"/>
+          <w:sz w:val="22"/>
+        </w:rPr>
+        <w:t>から承諾を得ました。</w:t>
+      </w:r>
     </w:p>
     <w:p>
       <w:pPr>
@@ -784,143 +734,108 @@
         <w:spacing w:line="324" w:lineRule="auto"/>
         <w:ind w:left="220" w:hangingChars="100" w:hanging="220"/>
         <w:rPr>
-          <w:ins w:id="23" w:author="s s" w:date="2026-04-06T23:13:00Z" w16du:dateUtc="2026-04-06T14:13:00Z"/>
           <w:rFonts w:ascii="Century" w:eastAsia="ＭＳ 明朝" w:hAnsi="Century"/>
           <w:sz w:val="22"/>
         </w:rPr>
-        <w:pPrChange w:id="24" w:author="s s" w:date="2026-04-08T11:37:00Z" w16du:dateUtc="2026-04-08T02:37:00Z">
-          <w:pPr>
-            <w:snapToGrid w:val="0"/>
-            <w:spacing w:beforeLines="50" w:before="180" w:line="324" w:lineRule="auto"/>
-          </w:pPr>
-        </w:pPrChange>
-      </w:pPr>
-      <w:ins w:id="25" w:author="s s" w:date="2026-04-06T23:13:00Z" w16du:dateUtc="2026-04-06T14:13:00Z">
-        <w:r>
-          <w:rPr>
-            <w:rFonts w:ascii="Century" w:eastAsia="ＭＳ 明朝" w:hAnsi="Century" w:hint="eastAsia"/>
-            <w:sz w:val="22"/>
-          </w:rPr>
-          <w:t>□</w:t>
-        </w:r>
-      </w:ins>
-      <w:ins w:id="26" w:author="s s" w:date="2026-04-07T13:45:00Z" w16du:dateUtc="2026-04-07T04:45:00Z">
-        <w:r>
-          <w:rPr>
-            <w:rFonts w:ascii="Century" w:eastAsia="ＭＳ 明朝" w:hAnsi="Century" w:hint="eastAsia"/>
-            <w:sz w:val="22"/>
-          </w:rPr>
-          <w:t xml:space="preserve">2. </w:t>
-        </w:r>
-      </w:ins>
-      <w:ins w:id="27" w:author="s s" w:date="2026-04-10T11:42:00Z" w16du:dateUtc="2026-04-10T02:42:00Z">
-        <w:r>
-          <w:rPr>
-            <w:rFonts w:ascii="Century" w:eastAsia="ＭＳ 明朝" w:hAnsi="Century" w:hint="eastAsia"/>
-            <w:sz w:val="22"/>
-          </w:rPr>
-          <w:t>教員等</w:t>
-        </w:r>
-      </w:ins>
-      <w:ins w:id="28" w:author="s s" w:date="2026-04-06T23:13:00Z" w16du:dateUtc="2026-04-06T14:13:00Z">
-        <w:r>
-          <w:rPr>
-            <w:rFonts w:ascii="Century" w:eastAsia="ＭＳ 明朝" w:hAnsi="Century" w:hint="eastAsia"/>
-            <w:sz w:val="22"/>
-          </w:rPr>
-          <w:t>によ</w:t>
-        </w:r>
-      </w:ins>
-      <w:ins w:id="29" w:author="s s" w:date="2026-04-07T13:46:00Z" w16du:dateUtc="2026-04-07T04:46:00Z">
-        <w:r>
-          <w:rPr>
-            <w:rFonts w:ascii="Century" w:eastAsia="ＭＳ 明朝" w:hAnsi="Century" w:hint="eastAsia"/>
-            <w:sz w:val="22"/>
-          </w:rPr>
-          <w:t>る</w:t>
-        </w:r>
-      </w:ins>
-      <w:ins w:id="30" w:author="s s" w:date="2026-04-06T23:13:00Z" w16du:dateUtc="2026-04-06T14:13:00Z">
-        <w:r>
-          <w:rPr>
-            <w:rFonts w:ascii="Century" w:eastAsia="ＭＳ 明朝" w:hAnsi="Century" w:hint="eastAsia"/>
-            <w:sz w:val="22"/>
-          </w:rPr>
-          <w:t>、直接的な</w:t>
-        </w:r>
-      </w:ins>
-      <w:ins w:id="31" w:author="s s" w:date="2026-04-07T17:59:00Z" w16du:dateUtc="2026-04-07T08:59:00Z">
-        <w:r>
-          <w:rPr>
-            <w:rFonts w:ascii="Century" w:eastAsia="ＭＳ 明朝" w:hAnsi="Century" w:hint="eastAsia"/>
-            <w:sz w:val="22"/>
-          </w:rPr>
-          <w:t>添削</w:t>
-        </w:r>
-      </w:ins>
-      <w:ins w:id="32" w:author="s s" w:date="2026-04-06T23:13:00Z" w16du:dateUtc="2026-04-06T14:13:00Z">
-        <w:r>
-          <w:rPr>
-            <w:rFonts w:ascii="Century" w:eastAsia="ＭＳ 明朝" w:hAnsi="Century" w:hint="eastAsia"/>
-            <w:sz w:val="22"/>
-          </w:rPr>
-          <w:t>は</w:t>
-        </w:r>
-      </w:ins>
-      <w:ins w:id="33" w:author="s s" w:date="2026-04-07T13:47:00Z" w16du:dateUtc="2026-04-07T04:47:00Z">
-        <w:r>
-          <w:rPr>
-            <w:rFonts w:ascii="Century" w:eastAsia="ＭＳ 明朝" w:hAnsi="Century" w:hint="eastAsia"/>
-            <w:sz w:val="22"/>
-          </w:rPr>
-          <w:t>行</w:t>
-        </w:r>
-      </w:ins>
-      <w:ins w:id="34" w:author="s s" w:date="2026-04-10T11:42:00Z" w16du:dateUtc="2026-04-10T02:42:00Z">
-        <w:r>
-          <w:rPr>
-            <w:rFonts w:ascii="Century" w:eastAsia="ＭＳ 明朝" w:hAnsi="Century" w:hint="eastAsia"/>
-            <w:sz w:val="22"/>
-          </w:rPr>
-          <w:t>われ</w:t>
-        </w:r>
-      </w:ins>
-      <w:ins w:id="35" w:author="s s" w:date="2026-04-07T13:47:00Z" w16du:dateUtc="2026-04-07T04:47:00Z">
-        <w:r>
-          <w:rPr>
-            <w:rFonts w:ascii="Century" w:eastAsia="ＭＳ 明朝" w:hAnsi="Century" w:hint="eastAsia"/>
-            <w:sz w:val="22"/>
-          </w:rPr>
-          <w:t>て</w:t>
-        </w:r>
-      </w:ins>
-      <w:ins w:id="36" w:author="s s" w:date="2026-04-07T13:46:00Z" w16du:dateUtc="2026-04-07T04:46:00Z">
-        <w:r>
-          <w:rPr>
-            <w:rFonts w:ascii="Century" w:eastAsia="ＭＳ 明朝" w:hAnsi="Century" w:hint="eastAsia"/>
-            <w:sz w:val="22"/>
-          </w:rPr>
-          <w:t>いません（</w:t>
-        </w:r>
-      </w:ins>
-      <w:ins w:id="37" w:author="s s" w:date="2026-04-18T20:11:00Z" w16du:dateUtc="2026-04-18T11:11:00Z">
-        <w:r>
-          <w:rPr>
-            <w:rFonts w:ascii="Century" w:eastAsia="ＭＳ 明朝" w:hAnsi="Century" w:hint="eastAsia"/>
-            <w:sz w:val="22"/>
-          </w:rPr>
-          <w:t>文章の一般的な書き方に関する</w:t>
-        </w:r>
-      </w:ins>
-      <w:ins w:id="38" w:author="s s" w:date="2026-04-07T13:46:00Z" w16du:dateUtc="2026-04-07T04:46:00Z">
-        <w:r>
-          <w:rPr>
-            <w:rFonts w:ascii="Century" w:eastAsia="ＭＳ 明朝" w:hAnsi="Century" w:hint="eastAsia"/>
-            <w:sz w:val="22"/>
-          </w:rPr>
-          <w:t>助言を受けることは可）。</w:t>
-        </w:r>
-      </w:ins>
+      </w:pPr>
+      <w:r>
+        <w:rPr>
+          <w:rFonts w:ascii="Century" w:eastAsia="ＭＳ 明朝" w:hAnsi="Century" w:hint="eastAsia"/>
+          <w:sz w:val="22"/>
+        </w:rPr>
+        <w:t>□</w:t>
+      </w:r>
+      <w:r>
+        <w:rPr>
+          <w:rFonts w:ascii="Century" w:eastAsia="ＭＳ 明朝" w:hAnsi="Century" w:hint="eastAsia"/>
+          <w:sz w:val="22"/>
+        </w:rPr>
+        <w:t xml:space="preserve">2. </w:t>
+      </w:r>
+      <w:r>
+        <w:rPr>
+          <w:rFonts w:ascii="Century" w:eastAsia="ＭＳ 明朝" w:hAnsi="Century" w:hint="eastAsia"/>
+          <w:sz w:val="22"/>
+        </w:rPr>
+        <w:t>教員等</w:t>
+      </w:r>
+      <w:r>
+        <w:rPr>
+          <w:rFonts w:ascii="Century" w:eastAsia="ＭＳ 明朝" w:hAnsi="Century" w:hint="eastAsia"/>
+          <w:sz w:val="22"/>
+        </w:rPr>
+        <w:t>によ</w:t>
+      </w:r>
+      <w:r>
+        <w:rPr>
+          <w:rFonts w:ascii="Century" w:eastAsia="ＭＳ 明朝" w:hAnsi="Century" w:hint="eastAsia"/>
+          <w:sz w:val="22"/>
+        </w:rPr>
+        <w:t>る</w:t>
+      </w:r>
+      <w:r>
+        <w:rPr>
+          <w:rFonts w:ascii="Century" w:eastAsia="ＭＳ 明朝" w:hAnsi="Century" w:hint="eastAsia"/>
+          <w:sz w:val="22"/>
+        </w:rPr>
+        <w:t>、直接的な</w:t>
+      </w:r>
+      <w:r>
+        <w:rPr>
+          <w:rFonts w:ascii="Century" w:eastAsia="ＭＳ 明朝" w:hAnsi="Century" w:hint="eastAsia"/>
+          <w:sz w:val="22"/>
+        </w:rPr>
+        <w:t>添削</w:t>
+      </w:r>
+      <w:r>
+        <w:rPr>
+          <w:rFonts w:ascii="Century" w:eastAsia="ＭＳ 明朝" w:hAnsi="Century" w:hint="eastAsia"/>
+          <w:sz w:val="22"/>
+        </w:rPr>
+        <w:t>は</w:t>
+      </w:r>
+      <w:r>
+        <w:rPr>
+          <w:rFonts w:ascii="Century" w:eastAsia="ＭＳ 明朝" w:hAnsi="Century" w:hint="eastAsia"/>
+          <w:sz w:val="22"/>
+        </w:rPr>
+        <w:t>行</w:t>
+      </w:r>
+      <w:r>
+        <w:rPr>
+          <w:rFonts w:ascii="Century" w:eastAsia="ＭＳ 明朝" w:hAnsi="Century" w:hint="eastAsia"/>
+          <w:sz w:val="22"/>
+        </w:rPr>
+        <w:t>われ</w:t>
+      </w:r>
+      <w:r>
+        <w:rPr>
+          <w:rFonts w:ascii="Century" w:eastAsia="ＭＳ 明朝" w:hAnsi="Century" w:hint="eastAsia"/>
+          <w:sz w:val="22"/>
+        </w:rPr>
+        <w:t>て</w:t>
+      </w:r>
+      <w:r>
+        <w:rPr>
+          <w:rFonts w:ascii="Century" w:eastAsia="ＭＳ 明朝" w:hAnsi="Century" w:hint="eastAsia"/>
+          <w:sz w:val="22"/>
+        </w:rPr>
+        <w:t>いません（</w:t>
+      </w:r>
+      <w:r>
+        <w:rPr>
+          <w:rFonts w:ascii="Century" w:eastAsia="ＭＳ 明朝" w:hAnsi="Century" w:hint="eastAsia"/>
+          <w:sz w:val="22"/>
+        </w:rPr>
+        <w:t>文章の一般的な書き方に関する</w:t>
+      </w:r>
+      <w:r>
+        <w:rPr>
+          <w:rFonts w:ascii="Century" w:eastAsia="ＭＳ 明朝" w:hAnsi="Century" w:hint="eastAsia"/>
+          <w:sz w:val="22"/>
+        </w:rPr>
+        <w:t>助言を受けることは可）。</w:t>
+      </w:r>
     </w:p>
     <w:p>
       <w:pPr>
@@ -928,200 +843,89 @@
         <w:spacing w:line="324" w:lineRule="auto"/>
         <w:ind w:left="220" w:hangingChars="100" w:hanging="220"/>
         <w:rPr>
-          <w:ins w:id="39" w:author="s s" w:date="2026-04-06T23:12:00Z" w16du:dateUtc="2026-04-06T14:12:00Z"/>
           <w:rFonts w:ascii="Century" w:eastAsia="ＭＳ 明朝" w:hAnsi="Century"/>
           <w:szCs w:val="21"/>
         </w:rPr>
-        <w:pPrChange w:id="40" w:author="s s" w:date="2026-04-08T11:38:00Z" w16du:dateUtc="2026-04-08T02:38:00Z">
-          <w:pPr>
-            <w:snapToGrid w:val="0"/>
-            <w:spacing w:line="324" w:lineRule="auto"/>
-          </w:pPr>
-        </w:pPrChange>
-      </w:pPr>
-      <w:ins w:id="41" w:author="s s" w:date="2026-04-06T23:12:00Z" w16du:dateUtc="2026-04-06T14:12:00Z">
-        <w:r>
-          <w:rPr>
-            <w:rFonts w:ascii="Century" w:eastAsia="ＭＳ 明朝" w:hAnsi="Century" w:hint="eastAsia"/>
-            <w:sz w:val="22"/>
-          </w:rPr>
-          <w:t>□</w:t>
-        </w:r>
-      </w:ins>
-      <w:ins w:id="42" w:author="s s" w:date="2026-04-07T13:52:00Z" w16du:dateUtc="2026-04-07T04:52:00Z">
-        <w:r>
-          <w:rPr>
-            <w:rFonts w:ascii="Century" w:eastAsia="ＭＳ 明朝" w:hAnsi="Century" w:hint="eastAsia"/>
-            <w:sz w:val="22"/>
-          </w:rPr>
-          <w:t xml:space="preserve">3. </w:t>
-        </w:r>
-      </w:ins>
-      <w:ins w:id="43" w:author="s s" w:date="2026-04-06T23:12:00Z" w16du:dateUtc="2026-04-06T14:12:00Z">
-        <w:r>
-          <w:rPr>
-            <w:rFonts w:ascii="Century" w:eastAsia="ＭＳ 明朝" w:hAnsi="Century" w:hint="eastAsia"/>
-            <w:sz w:val="22"/>
-          </w:rPr>
-          <w:t>ChatGPT</w:t>
-        </w:r>
-        <w:r>
-          <w:rPr>
-            <w:rFonts w:ascii="Century" w:eastAsia="ＭＳ 明朝" w:hAnsi="Century" w:hint="eastAsia"/>
-            <w:sz w:val="22"/>
-          </w:rPr>
-          <w:t>等、生成</w:t>
-        </w:r>
-        <w:r>
-          <w:rPr>
-            <w:rFonts w:ascii="Century" w:eastAsia="ＭＳ 明朝" w:hAnsi="Century" w:hint="eastAsia"/>
-            <w:sz w:val="22"/>
-          </w:rPr>
-          <w:t>AI</w:t>
-        </w:r>
-        <w:r>
-          <w:rPr>
-            <w:rFonts w:ascii="Century" w:eastAsia="ＭＳ 明朝" w:hAnsi="Century" w:hint="eastAsia"/>
-            <w:sz w:val="22"/>
-          </w:rPr>
-          <w:t>を利用した作文は</w:t>
-        </w:r>
-      </w:ins>
-      <w:ins w:id="44" w:author="s s" w:date="2026-04-07T13:47:00Z" w16du:dateUtc="2026-04-07T04:47:00Z">
-        <w:r>
-          <w:rPr>
-            <w:rFonts w:ascii="Century" w:eastAsia="ＭＳ 明朝" w:hAnsi="Century" w:hint="eastAsia"/>
-            <w:sz w:val="22"/>
-          </w:rPr>
-          <w:t>してい</w:t>
-        </w:r>
-      </w:ins>
-      <w:ins w:id="45" w:author="s s" w:date="2026-04-06T23:12:00Z" w16du:dateUtc="2026-04-06T14:12:00Z">
-        <w:r>
-          <w:rPr>
-            <w:rFonts w:ascii="Century" w:eastAsia="ＭＳ 明朝" w:hAnsi="Century" w:hint="eastAsia"/>
-            <w:sz w:val="22"/>
-          </w:rPr>
-          <w:t>ません</w:t>
-        </w:r>
-      </w:ins>
-      <w:ins w:id="46" w:author="s s" w:date="2026-04-07T13:47:00Z" w16du:dateUtc="2026-04-07T04:47:00Z">
-        <w:r>
-          <w:rPr>
-            <w:rFonts w:ascii="Century" w:eastAsia="ＭＳ 明朝" w:hAnsi="Century" w:hint="eastAsia"/>
-            <w:szCs w:val="21"/>
-          </w:rPr>
-          <w:t>。</w:t>
-        </w:r>
-      </w:ins>
+      </w:pPr>
+      <w:r>
+        <w:rPr>
+          <w:rFonts w:ascii="Century" w:eastAsia="ＭＳ 明朝" w:hAnsi="Century" w:hint="eastAsia"/>
+          <w:sz w:val="22"/>
+        </w:rPr>
+        <w:t>□</w:t>
+      </w:r>
+      <w:r>
+        <w:rPr>
+          <w:rFonts w:ascii="Century" w:eastAsia="ＭＳ 明朝" w:hAnsi="Century" w:hint="eastAsia"/>
+          <w:sz w:val="22"/>
+        </w:rPr>
+        <w:t xml:space="preserve">3. </w:t>
+      </w:r>
+      <w:r>
+        <w:rPr>
+          <w:rFonts w:ascii="Century" w:eastAsia="ＭＳ 明朝" w:hAnsi="Century" w:hint="eastAsia"/>
+          <w:sz w:val="22"/>
+        </w:rPr>
+        <w:t>ChatGPT</w:t>
+      </w:r>
+      <w:r>
+        <w:rPr>
+          <w:rFonts w:ascii="Century" w:eastAsia="ＭＳ 明朝" w:hAnsi="Century" w:hint="eastAsia"/>
+          <w:sz w:val="22"/>
+        </w:rPr>
+        <w:t>等、生成</w:t>
+      </w:r>
+      <w:r>
+        <w:rPr>
+          <w:rFonts w:ascii="Century" w:eastAsia="ＭＳ 明朝" w:hAnsi="Century" w:hint="eastAsia"/>
+          <w:sz w:val="22"/>
+        </w:rPr>
+        <w:t>AI</w:t>
+      </w:r>
+      <w:r>
+        <w:rPr>
+          <w:rFonts w:ascii="Century" w:eastAsia="ＭＳ 明朝" w:hAnsi="Century" w:hint="eastAsia"/>
+          <w:sz w:val="22"/>
+        </w:rPr>
+        <w:t>を利用した作文は</w:t>
+      </w:r>
+      <w:r>
+        <w:rPr>
+          <w:rFonts w:ascii="Century" w:eastAsia="ＭＳ 明朝" w:hAnsi="Century" w:hint="eastAsia"/>
+          <w:sz w:val="22"/>
+        </w:rPr>
+        <w:t>してい</w:t>
+      </w:r>
+      <w:r>
+        <w:rPr>
+          <w:rFonts w:ascii="Century" w:eastAsia="ＭＳ 明朝" w:hAnsi="Century" w:hint="eastAsia"/>
+          <w:sz w:val="22"/>
+        </w:rPr>
+        <w:t>ません</w:t>
+      </w:r>
+      <w:r>
+        <w:rPr>
+          <w:rFonts w:ascii="Century" w:eastAsia="ＭＳ 明朝" w:hAnsi="Century" w:hint="eastAsia"/>
+          <w:szCs w:val="21"/>
+        </w:rPr>
+        <w:t>。</w:t>
+      </w:r>
     </w:p>
     <w:p>
       <w:pPr>
         <w:snapToGrid w:val="0"/>
         <w:spacing w:beforeLines="50" w:before="180" w:line="324" w:lineRule="auto"/>
         <w:rPr>
-          <w:del w:id="47" w:author="s s" w:date="2026-04-06T23:13:00Z" w16du:dateUtc="2026-04-06T14:13:00Z"/>
           <w:rFonts w:ascii="Century" w:eastAsia="ＭＳ 明朝" w:hAnsi="Century"/>
           <w:sz w:val="22"/>
         </w:rPr>
       </w:pPr>
-      <w:del w:id="48" w:author="s s" w:date="2026-04-06T23:13:00Z" w16du:dateUtc="2026-04-06T14:13:00Z">
-        <w:r>
-          <w:rPr>
-            <w:rFonts w:ascii="Century" w:eastAsia="ＭＳ 明朝" w:hAnsi="Century" w:hint="eastAsia"/>
-            <w:sz w:val="22"/>
-          </w:rPr>
-          <w:delText>本プログラムへ申し込</w:delText>
-        </w:r>
-        <w:r>
-          <w:rPr>
-            <w:rFonts w:ascii="Century" w:eastAsia="ＭＳ 明朝" w:hAnsi="Century" w:hint="eastAsia"/>
-            <w:sz w:val="22"/>
-          </w:rPr>
-          <w:delText>むことについて、</w:delText>
-        </w:r>
-        <w:r>
-          <w:rPr>
-            <w:rFonts w:ascii="Century" w:eastAsia="ＭＳ 明朝" w:hAnsi="Century"/>
-            <w:sz w:val="22"/>
-          </w:rPr>
-          <w:delText>202</w:delText>
-        </w:r>
-      </w:del>
-      <w:del w:id="49" w:author="s s" w:date="2026-04-06T17:07:00Z" w16du:dateUtc="2026-04-06T08:07:00Z">
-        <w:r>
-          <w:rPr>
-            <w:rFonts w:ascii="Century" w:eastAsia="ＭＳ 明朝" w:hAnsi="Century"/>
-            <w:sz w:val="22"/>
-          </w:rPr>
-          <w:delText>5</w:delText>
-        </w:r>
-      </w:del>
-      <w:del w:id="50" w:author="s s" w:date="2026-04-06T23:13:00Z" w16du:dateUtc="2026-04-06T14:13:00Z">
-        <w:r>
-          <w:rPr>
-            <w:rFonts w:ascii="Century" w:eastAsia="ＭＳ 明朝" w:hAnsi="Century" w:hint="eastAsia"/>
-            <w:sz w:val="22"/>
-          </w:rPr>
-          <w:delText>年</w:delText>
-        </w:r>
-        <w:r>
-          <w:rPr>
-            <w:rFonts w:ascii="Century" w:eastAsia="ＭＳ 明朝" w:hAnsi="Century"/>
-            <w:sz w:val="22"/>
-          </w:rPr>
-          <w:delText>4</w:delText>
-        </w:r>
-        <w:r>
-          <w:rPr>
-            <w:rFonts w:ascii="Century" w:eastAsia="ＭＳ 明朝" w:hAnsi="Century" w:hint="eastAsia"/>
-            <w:sz w:val="22"/>
-          </w:rPr>
-          <w:delText>月に所属する大学院の指導教員</w:delText>
-        </w:r>
-        <w:r>
-          <w:rPr>
-            <w:rFonts w:ascii="Century" w:eastAsia="ＭＳ 明朝" w:hAnsi="Century" w:hint="eastAsia"/>
-            <w:sz w:val="22"/>
-          </w:rPr>
-          <w:delText>から</w:delText>
-        </w:r>
-        <w:r>
-          <w:rPr>
-            <w:rFonts w:ascii="Century" w:eastAsia="ＭＳ 明朝" w:hAnsi="Century" w:hint="eastAsia"/>
-            <w:sz w:val="22"/>
-          </w:rPr>
-          <w:delText>承諾を</w:delText>
-        </w:r>
-        <w:r>
-          <w:rPr>
-            <w:rFonts w:ascii="Century" w:eastAsia="ＭＳ 明朝" w:hAnsi="Century" w:hint="eastAsia"/>
-            <w:sz w:val="22"/>
-          </w:rPr>
-          <w:delText>得ました</w:delText>
-        </w:r>
-        <w:r>
-          <w:rPr>
-            <w:rFonts w:ascii="Century" w:eastAsia="ＭＳ 明朝" w:hAnsi="Century" w:hint="eastAsia"/>
-            <w:sz w:val="22"/>
-          </w:rPr>
-          <w:delText>。</w:delText>
-        </w:r>
-        <w:r>
-          <w:rPr>
-            <w:rFonts w:ascii="Century" w:eastAsia="ＭＳ 明朝" w:hAnsi="Century" w:hint="eastAsia"/>
-            <w:sz w:val="22"/>
-          </w:rPr>
-          <w:delText>□はい　□いいえ</w:delText>
-        </w:r>
-      </w:del>
     </w:p>
     <w:p>
       <w:pPr>
         <w:snapToGrid w:val="0"/>
         <w:spacing w:line="324" w:lineRule="auto"/>
         <w:rPr>
-          <w:del w:id="51" w:author="s s" w:date="2026-04-06T23:14:00Z" w16du:dateUtc="2026-04-06T14:14:00Z"/>
           <w:rFonts w:ascii="Century" w:eastAsia="ＭＳ 明朝" w:hAnsi="Century"/>
           <w:sz w:val="22"/>
         </w:rPr>
@@ -1188,24 +992,13 @@
         </w:rPr>
         <w:t>－</w:t>
       </w:r>
-      <w:ins w:id="52" w:author="s s" w:date="2026-04-10T11:59:00Z" w16du:dateUtc="2026-04-10T02:59:00Z">
-        <w:r>
-          <w:rPr>
-            <w:rFonts w:ascii="Century" w:eastAsia="ＭＳ 明朝" w:hAnsi="Century" w:hint="eastAsia"/>
-            <w:sz w:val="22"/>
-          </w:rPr>
-          <w:t>5</w:t>
-        </w:r>
-      </w:ins>
-      <w:del w:id="53" w:author="s s" w:date="2026-04-10T11:59:00Z" w16du:dateUtc="2026-04-10T02:59:00Z">
-        <w:r>
-          <w:rPr>
-            <w:rFonts w:ascii="Century" w:eastAsia="ＭＳ 明朝" w:hAnsi="Century" w:hint="eastAsia"/>
-            <w:sz w:val="22"/>
-          </w:rPr>
-          <w:delText>6</w:delText>
-        </w:r>
-      </w:del>
+      <w:r>
+        <w:rPr>
+          <w:rFonts w:ascii="Century" w:eastAsia="ＭＳ 明朝" w:hAnsi="Century" w:hint="eastAsia"/>
+          <w:sz w:val="22"/>
+        </w:rPr>
+        <w:t>5</w:t>
+      </w:r>
       <w:r>
         <w:rPr>
           <w:rFonts w:ascii="Century" w:eastAsia="ＭＳ 明朝" w:hAnsi="Century" w:hint="eastAsia"/>
@@ -1272,24 +1065,13 @@
         </w:rPr>
         <w:t>指定された</w:t>
       </w:r>
-      <w:del w:id="54" w:author="s s" w:date="2026-04-07T17:59:00Z" w16du:dateUtc="2026-04-07T08:59:00Z">
-        <w:r>
-          <w:rPr>
-            <w:rFonts w:ascii="Century" w:eastAsia="ＭＳ 明朝" w:hAnsi="Century" w:hint="eastAsia"/>
-            <w:sz w:val="22"/>
-          </w:rPr>
-          <w:delText>範囲</w:delText>
-        </w:r>
-      </w:del>
-      <w:ins w:id="55" w:author="s s" w:date="2026-04-07T17:59:00Z" w16du:dateUtc="2026-04-07T08:59:00Z">
-        <w:r>
-          <w:rPr>
-            <w:rFonts w:ascii="Century" w:eastAsia="ＭＳ 明朝" w:hAnsi="Century" w:hint="eastAsia"/>
-            <w:sz w:val="22"/>
-          </w:rPr>
-          <w:t>枠内</w:t>
-        </w:r>
-      </w:ins>
+      <w:r>
+        <w:rPr>
+          <w:rFonts w:ascii="Century" w:eastAsia="ＭＳ 明朝" w:hAnsi="Century" w:hint="eastAsia"/>
+          <w:sz w:val="22"/>
+        </w:rPr>
+        <w:t>枠内</w:t>
+      </w:r>
       <w:r>
         <w:rPr>
           <w:rFonts w:ascii="Century" w:eastAsia="ＭＳ 明朝" w:hAnsi="Century" w:hint="eastAsia"/>
@@ -1303,7 +1085,6 @@
         <w:snapToGrid w:val="0"/>
         <w:spacing w:line="324" w:lineRule="auto"/>
         <w:rPr>
-          <w:del w:id="56" w:author="s s" w:date="2026-04-06T23:12:00Z" w16du:dateUtc="2026-04-06T14:12:00Z"/>
           <w:rFonts w:ascii="Century" w:eastAsia="ＭＳ 明朝" w:hAnsi="Century"/>
           <w:sz w:val="22"/>
         </w:rPr>
@@ -1314,7 +1095,6 @@
         <w:snapToGrid w:val="0"/>
         <w:spacing w:line="324" w:lineRule="auto"/>
         <w:rPr>
-          <w:del w:id="57" w:author="s s" w:date="2026-04-06T23:12:00Z" w16du:dateUtc="2026-04-06T14:12:00Z"/>
           <w:rFonts w:ascii="Century" w:eastAsia="ＭＳ 明朝" w:hAnsi="Century"/>
           <w:sz w:val="22"/>
         </w:rPr>
@@ -1325,7 +1105,6 @@
         <w:snapToGrid w:val="0"/>
         <w:spacing w:line="324" w:lineRule="auto"/>
         <w:rPr>
-          <w:del w:id="58" w:author="s s" w:date="2026-04-06T23:12:00Z" w16du:dateUtc="2026-04-06T14:12:00Z"/>
           <w:rFonts w:ascii="Century" w:eastAsia="ＭＳ 明朝" w:hAnsi="Century"/>
           <w:sz w:val="22"/>
         </w:rPr>
@@ -1336,7 +1115,6 @@
         <w:snapToGrid w:val="0"/>
         <w:spacing w:line="324" w:lineRule="auto"/>
         <w:rPr>
-          <w:del w:id="59" w:author="s s" w:date="2026-04-06T23:12:00Z" w16du:dateUtc="2026-04-06T14:12:00Z"/>
           <w:rFonts w:ascii="Century" w:eastAsia="ＭＳ 明朝" w:hAnsi="Century"/>
           <w:sz w:val="22"/>
         </w:rPr>
@@ -1349,45 +1127,17 @@
         <w:tblInd w:w="-459" w:type="dxa"/>
         <w:tblLayout w:type="fixed"/>
         <w:tblLook w:val="04A0" w:firstRow="1" w:lastRow="0" w:firstColumn="1" w:lastColumn="0" w:noHBand="0" w:noVBand="1"/>
-        <w:tblPrChange w:id="60" w:author="s s" w:date="2026-04-10T11:47:00Z" w16du:dateUtc="2026-04-10T02:47:00Z">
-          <w:tblPr>
-            <w:tblStyle w:val="a3"/>
-            <w:tblW w:w="9639" w:type="dxa"/>
-            <w:tblInd w:w="-459" w:type="dxa"/>
-            <w:tblLayout w:type="fixed"/>
-            <w:tblLook w:val="04A0" w:firstRow="1" w:lastRow="0" w:firstColumn="1" w:lastColumn="0" w:noHBand="0" w:noVBand="1"/>
-          </w:tblPr>
-        </w:tblPrChange>
       </w:tblPr>
       <w:tblGrid>
         <w:gridCol w:w="9639"/>
-        <w:tblGridChange w:id="61">
-          <w:tblGrid>
-            <w:gridCol w:w="2295"/>
-            <w:gridCol w:w="7344"/>
-            <w:gridCol w:w="2295"/>
-          </w:tblGrid>
-        </w:tblGridChange>
       </w:tblGrid>
       <w:tr>
         <w:trPr>
           <w:trHeight w:val="9062"/>
-          <w:trPrChange w:id="62" w:author="s s" w:date="2026-04-10T11:47:00Z" w16du:dateUtc="2026-04-10T02:47:00Z">
-            <w:trPr>
-              <w:gridBefore w:val="1"/>
-              <w:trHeight w:val="5944"/>
-            </w:trPr>
-          </w:trPrChange>
         </w:trPr>
         <w:tc>
           <w:tcPr>
             <w:tcW w:w="9639" w:type="dxa"/>
-            <w:tcPrChange w:id="63" w:author="s s" w:date="2026-04-10T11:47:00Z" w16du:dateUtc="2026-04-10T02:47:00Z">
-              <w:tcPr>
-                <w:tcW w:w="9639" w:type="dxa"/>
-                <w:gridSpan w:val="2"/>
-              </w:tcPr>
-            </w:tcPrChange>
           </w:tcPr>
           <w:p>
             <w:pPr>
@@ -1404,16 +1154,14 @@
                 <w:sz w:val="22"/>
               </w:rPr>
             </w:pPr>
-            <w:ins w:id="64" w:author="s s" w:date="2026-04-10T11:43:00Z" w16du:dateUtc="2026-04-10T02:43:00Z">
-              <w:r>
-                <w:rPr>
-                  <w:rFonts w:ascii="Century" w:eastAsia="ＭＳ 明朝" w:hAnsi="Century" w:hint="eastAsia"/>
-                  <w:sz w:val="22"/>
-                </w:rPr>
-                <w:lastRenderedPageBreak/>
-                <w:t>今まで力を入れて取り組んできたことの内容と、</w:t>
-              </w:r>
-            </w:ins>
+            <w:r>
+              <w:rPr>
+                <w:rFonts w:ascii="Century" w:eastAsia="ＭＳ 明朝" w:hAnsi="Century" w:hint="eastAsia"/>
+                <w:sz w:val="22"/>
+              </w:rPr>
+              <w:lastRenderedPageBreak/>
+              <w:t>今まで力を入れて取り組んできたことの内容と、</w:t>
+            </w:r>
             <w:r>
               <w:rPr>
                 <w:rFonts w:ascii="Century" w:eastAsia="ＭＳ 明朝" w:hAnsi="Century" w:hint="eastAsia"/>
@@ -1450,7 +1198,6 @@
         <w:snapToGrid w:val="0"/>
         <w:spacing w:line="276" w:lineRule="auto"/>
         <w:rPr>
-          <w:del w:id="65" w:author="s s" w:date="2026-04-10T11:47:00Z" w16du:dateUtc="2026-04-10T02:47:00Z"/>
           <w:rFonts w:ascii="Century" w:eastAsia="ＭＳ 明朝" w:hAnsi="Century"/>
           <w:sz w:val="22"/>
         </w:rPr>
@@ -1470,7 +1217,6 @@
       <w:tr>
         <w:trPr>
           <w:trHeight w:val="6416"/>
-          <w:del w:id="66" w:author="s s" w:date="2026-04-10T11:46:00Z"/>
         </w:trPr>
         <w:tc>
           <w:tcPr>
@@ -1487,59 +1233,16 @@
               <w:spacing w:line="324" w:lineRule="auto"/>
               <w:ind w:leftChars="0"/>
               <w:rPr>
-                <w:del w:id="67" w:author="s s" w:date="2026-04-10T11:46:00Z" w16du:dateUtc="2026-04-10T02:46:00Z"/>
                 <w:rFonts w:ascii="Century" w:eastAsia="ＭＳ 明朝" w:hAnsi="Century"/>
                 <w:sz w:val="22"/>
               </w:rPr>
             </w:pPr>
-            <w:del w:id="68" w:author="s s" w:date="2026-04-10T11:46:00Z" w16du:dateUtc="2026-04-10T02:46:00Z">
-              <w:r>
-                <w:rPr>
-                  <w:rFonts w:ascii="Century" w:eastAsia="ＭＳ 明朝" w:hAnsi="Century" w:hint="eastAsia"/>
-                  <w:sz w:val="22"/>
-                </w:rPr>
-                <w:delText>今まで力を入れて</w:delText>
-              </w:r>
-              <w:r>
-                <w:rPr>
-                  <w:rFonts w:ascii="Century" w:eastAsia="ＭＳ 明朝" w:hAnsi="Century" w:hint="eastAsia"/>
-                  <w:sz w:val="22"/>
-                </w:rPr>
-                <w:delText>取り組んで</w:delText>
-              </w:r>
-              <w:r>
-                <w:rPr>
-                  <w:rFonts w:ascii="Century" w:eastAsia="ＭＳ 明朝" w:hAnsi="Century" w:hint="eastAsia"/>
-                  <w:sz w:val="22"/>
-                </w:rPr>
-                <w:delText>きたことの内容と、本プログラム</w:delText>
-              </w:r>
-            </w:del>
-            <w:del w:id="69" w:author="s s" w:date="2026-04-06T17:08:00Z" w16du:dateUtc="2026-04-06T08:08:00Z">
-              <w:r>
-                <w:rPr>
-                  <w:rFonts w:ascii="Century" w:eastAsia="ＭＳ 明朝" w:hAnsi="Century" w:hint="eastAsia"/>
-                  <w:sz w:val="22"/>
-                </w:rPr>
-                <w:delText>を</w:delText>
-              </w:r>
-            </w:del>
-            <w:del w:id="70" w:author="s s" w:date="2026-04-10T11:46:00Z" w16du:dateUtc="2026-04-10T02:46:00Z">
-              <w:r>
-                <w:rPr>
-                  <w:rFonts w:ascii="Century" w:eastAsia="ＭＳ 明朝" w:hAnsi="Century" w:hint="eastAsia"/>
-                  <w:sz w:val="22"/>
-                </w:rPr>
-                <w:delText>参加するにあたりそれらをどのように活用していきたいかを記載してください。</w:delText>
-              </w:r>
-            </w:del>
           </w:p>
           <w:p>
             <w:pPr>
               <w:snapToGrid w:val="0"/>
               <w:spacing w:line="324" w:lineRule="auto"/>
               <w:rPr>
-                <w:del w:id="71" w:author="s s" w:date="2026-04-10T11:46:00Z" w16du:dateUtc="2026-04-10T02:46:00Z"/>
                 <w:rFonts w:ascii="Century" w:eastAsia="ＭＳ 明朝" w:hAnsi="Century"/>
                 <w:sz w:val="22"/>
               </w:rPr>
@@ -1550,7 +1253,6 @@
               <w:snapToGrid w:val="0"/>
               <w:spacing w:line="324" w:lineRule="auto"/>
               <w:rPr>
-                <w:del w:id="72" w:author="s s" w:date="2026-04-10T11:46:00Z" w16du:dateUtc="2026-04-10T02:46:00Z"/>
                 <w:rFonts w:ascii="Century" w:eastAsia="ＭＳ 明朝" w:hAnsi="Century"/>
                 <w:sz w:val="22"/>
               </w:rPr>
@@ -1788,42 +1490,27 @@
               </w:rPr>
               <w:t>述べた研究は、</w:t>
             </w:r>
-            <w:ins w:id="73" w:author="s s" w:date="2026-04-06T17:10:00Z">
-              <w:r>
-                <w:rPr>
-                  <w:rFonts w:ascii="Century" w:eastAsia="ＭＳ 明朝" w:hAnsi="Century"/>
-                  <w:sz w:val="22"/>
-                </w:rPr>
-                <w:t>火山</w:t>
-              </w:r>
-            </w:ins>
-            <w:ins w:id="74" w:author="s s" w:date="2026-04-07T18:00:00Z" w16du:dateUtc="2026-04-07T09:00:00Z">
-              <w:r>
-                <w:rPr>
-                  <w:rFonts w:ascii="Century" w:eastAsia="ＭＳ 明朝" w:hAnsi="Century" w:hint="eastAsia"/>
-                  <w:sz w:val="22"/>
-                </w:rPr>
-                <w:t>現象・</w:t>
-              </w:r>
-            </w:ins>
-            <w:ins w:id="75" w:author="s s" w:date="2026-04-06T17:10:00Z">
-              <w:r>
-                <w:rPr>
-                  <w:rFonts w:ascii="Century" w:eastAsia="ＭＳ 明朝" w:hAnsi="Century"/>
-                  <w:sz w:val="22"/>
-                </w:rPr>
-                <w:t>ハザードの理解や火山防災に対して</w:t>
-              </w:r>
-            </w:ins>
-            <w:del w:id="76" w:author="s s" w:date="2026-04-06T17:10:00Z" w16du:dateUtc="2026-04-06T08:10:00Z">
-              <w:r>
-                <w:rPr>
-                  <w:rFonts w:ascii="Century" w:eastAsia="ＭＳ 明朝" w:hAnsi="Century" w:hint="eastAsia"/>
-                  <w:sz w:val="22"/>
-                </w:rPr>
-                <w:delText>火山の理解や社会に対して</w:delText>
-              </w:r>
-            </w:del>
+            <w:r>
+              <w:rPr>
+                <w:rFonts w:ascii="Century" w:eastAsia="ＭＳ 明朝" w:hAnsi="Century"/>
+                <w:sz w:val="22"/>
+              </w:rPr>
+              <w:t>火山</w:t>
+            </w:r>
+            <w:r>
+              <w:rPr>
+                <w:rFonts w:ascii="Century" w:eastAsia="ＭＳ 明朝" w:hAnsi="Century" w:hint="eastAsia"/>
+                <w:sz w:val="22"/>
+              </w:rPr>
+              <w:t>現象・</w:t>
+            </w:r>
+            <w:r>
+              <w:rPr>
+                <w:rFonts w:ascii="Century" w:eastAsia="ＭＳ 明朝" w:hAnsi="Century"/>
+                <w:sz w:val="22"/>
+              </w:rPr>
+              <w:t>ハザードの理解や火山防災に対して</w:t>
+            </w:r>
             <w:r>
               <w:rPr>
                 <w:rFonts w:ascii="Century" w:eastAsia="ＭＳ 明朝" w:hAnsi="Century" w:hint="eastAsia"/>
@@ -1888,555 +1575,293 @@
             <w:pPr>
               <w:ind w:left="220" w:hangingChars="100" w:hanging="220"/>
               <w:rPr>
-                <w:ins w:id="77" w:author="s s" w:date="2026-04-18T20:21:00Z" w16du:dateUtc="2026-04-18T11:21:00Z"/>
                 <w:rFonts w:ascii="ＭＳ 明朝" w:eastAsia="ＭＳ 明朝" w:hAnsi="ＭＳ 明朝"/>
                 <w:sz w:val="22"/>
               </w:rPr>
             </w:pPr>
-            <w:ins w:id="78" w:author="s s" w:date="2026-04-18T20:18:00Z">
-              <w:r>
-                <w:rPr>
-                  <w:rFonts w:ascii="ＭＳ 明朝" w:eastAsia="ＭＳ 明朝" w:hAnsi="ＭＳ 明朝"/>
-                  <w:sz w:val="22"/>
-                  <w:rPrChange w:id="79" w:author="s s" w:date="2026-04-18T20:19:00Z" w16du:dateUtc="2026-04-18T11:19:00Z">
-                    <w:rPr/>
-                  </w:rPrChange>
-                </w:rPr>
-                <w:lastRenderedPageBreak/>
-                <w:t>5．以下の動画は</w:t>
-              </w:r>
-            </w:ins>
-            <w:ins w:id="80" w:author="s s" w:date="2026-04-18T20:19:00Z" w16du:dateUtc="2026-04-18T11:19:00Z">
-              <w:r>
-                <w:rPr>
-                  <w:rFonts w:ascii="ＭＳ 明朝" w:eastAsia="ＭＳ 明朝" w:hAnsi="ＭＳ 明朝" w:hint="eastAsia"/>
-                  <w:sz w:val="22"/>
-                </w:rPr>
-                <w:t>、</w:t>
-              </w:r>
-            </w:ins>
-            <w:ins w:id="81" w:author="s s" w:date="2026-04-18T20:18:00Z">
-              <w:r>
-                <w:rPr>
-                  <w:rFonts w:ascii="ＭＳ 明朝" w:eastAsia="ＭＳ 明朝" w:hAnsi="ＭＳ 明朝"/>
-                  <w:sz w:val="22"/>
-                  <w:rPrChange w:id="82" w:author="s s" w:date="2026-04-18T20:19:00Z" w16du:dateUtc="2026-04-18T11:19:00Z">
-                    <w:rPr/>
-                  </w:rPrChange>
-                </w:rPr>
-                <w:t>富士山の大規模噴火（宝永噴火規模）を想定し</w:t>
-              </w:r>
-            </w:ins>
-            <w:ins w:id="83" w:author="s s" w:date="2026-04-18T20:20:00Z" w16du:dateUtc="2026-04-18T11:20:00Z">
-              <w:r>
-                <w:rPr>
-                  <w:rFonts w:ascii="ＭＳ 明朝" w:eastAsia="ＭＳ 明朝" w:hAnsi="ＭＳ 明朝" w:hint="eastAsia"/>
-                  <w:sz w:val="22"/>
-                </w:rPr>
-                <w:t>、</w:t>
-              </w:r>
-            </w:ins>
-            <w:ins w:id="84" w:author="s s" w:date="2026-04-18T20:18:00Z">
-              <w:r>
-                <w:rPr>
-                  <w:rFonts w:ascii="ＭＳ 明朝" w:eastAsia="ＭＳ 明朝" w:hAnsi="ＭＳ 明朝"/>
-                  <w:sz w:val="22"/>
-                  <w:rPrChange w:id="85" w:author="s s" w:date="2026-04-18T20:19:00Z" w16du:dateUtc="2026-04-18T11:19:00Z">
-                    <w:rPr/>
-                  </w:rPrChange>
-                </w:rPr>
-                <w:t>噴火現象および広域に及ぶ降灰の影響について</w:t>
-              </w:r>
-            </w:ins>
-            <w:ins w:id="86" w:author="s s" w:date="2026-04-18T20:20:00Z" w16du:dateUtc="2026-04-18T11:20:00Z">
-              <w:r>
-                <w:rPr>
-                  <w:rFonts w:ascii="ＭＳ 明朝" w:eastAsia="ＭＳ 明朝" w:hAnsi="ＭＳ 明朝" w:hint="eastAsia"/>
-                  <w:sz w:val="22"/>
-                </w:rPr>
-                <w:t>、</w:t>
-              </w:r>
-            </w:ins>
-            <w:ins w:id="87" w:author="s s" w:date="2026-04-18T20:18:00Z">
-              <w:r>
-                <w:rPr>
-                  <w:rFonts w:ascii="ＭＳ 明朝" w:eastAsia="ＭＳ 明朝" w:hAnsi="ＭＳ 明朝"/>
-                  <w:sz w:val="22"/>
-                  <w:rPrChange w:id="88" w:author="s s" w:date="2026-04-18T20:19:00Z" w16du:dateUtc="2026-04-18T11:19:00Z">
-                    <w:rPr/>
-                  </w:rPrChange>
-                </w:rPr>
-                <w:t>科学的な知見に基づいて整理した内閣府防災の資料映像です。</w:t>
-              </w:r>
-              <w:r>
-                <w:rPr>
-                  <w:rFonts w:ascii="ＭＳ 明朝" w:eastAsia="ＭＳ 明朝" w:hAnsi="ＭＳ 明朝"/>
-                  <w:sz w:val="22"/>
-                  <w:rPrChange w:id="89" w:author="s s" w:date="2026-04-18T20:19:00Z" w16du:dateUtc="2026-04-18T11:19:00Z">
-                    <w:rPr/>
-                  </w:rPrChange>
-                </w:rPr>
-                <w:br/>
-              </w:r>
-            </w:ins>
-            <w:ins w:id="90" w:author="s s" w:date="2026-04-18T20:20:00Z" w16du:dateUtc="2026-04-18T11:20:00Z">
-              <w:r>
-                <w:rPr>
-                  <w:rFonts w:ascii="ＭＳ 明朝" w:eastAsia="ＭＳ 明朝" w:hAnsi="ＭＳ 明朝"/>
-                  <w:sz w:val="22"/>
-                </w:rPr>
-                <w:fldChar w:fldCharType="begin"/>
-              </w:r>
-              <w:r>
-                <w:rPr>
-                  <w:rFonts w:ascii="ＭＳ 明朝" w:eastAsia="ＭＳ 明朝" w:hAnsi="ＭＳ 明朝"/>
-                  <w:sz w:val="22"/>
-                </w:rPr>
-                <w:instrText>HYPERLINK "</w:instrText>
-              </w:r>
-            </w:ins>
-            <w:ins w:id="91" w:author="s s" w:date="2026-04-18T20:18:00Z">
-              <w:r>
-                <w:rPr>
-                  <w:rFonts w:ascii="ＭＳ 明朝" w:eastAsia="ＭＳ 明朝" w:hAnsi="ＭＳ 明朝"/>
-                  <w:sz w:val="22"/>
-                  <w:rPrChange w:id="92" w:author="s s" w:date="2026-04-18T20:20:00Z" w16du:dateUtc="2026-04-18T11:20:00Z">
-                    <w:rPr>
-                      <w:rStyle w:val="a9"/>
-                      <w:rFonts w:ascii="ＭＳ 明朝" w:eastAsia="ＭＳ 明朝" w:hAnsi="ＭＳ 明朝"/>
-                      <w:sz w:val="22"/>
-                    </w:rPr>
-                  </w:rPrChange>
-                </w:rPr>
-                <w:instrText>https://www.youtube.com/watch?v=2tYpUXiw4-0</w:instrText>
-              </w:r>
-            </w:ins>
-            <w:ins w:id="93" w:author="s s" w:date="2026-04-18T20:20:00Z" w16du:dateUtc="2026-04-18T11:20:00Z">
-              <w:r>
-                <w:rPr>
-                  <w:rFonts w:ascii="ＭＳ 明朝" w:eastAsia="ＭＳ 明朝" w:hAnsi="ＭＳ 明朝"/>
-                  <w:sz w:val="22"/>
-                </w:rPr>
-                <w:instrText>"</w:instrText>
-              </w:r>
-              <w:r>
-                <w:rPr>
-                  <w:rFonts w:ascii="ＭＳ 明朝" w:eastAsia="ＭＳ 明朝" w:hAnsi="ＭＳ 明朝"/>
-                  <w:sz w:val="22"/>
-                </w:rPr>
-                <w:fldChar w:fldCharType="separate"/>
-              </w:r>
-            </w:ins>
-            <w:ins w:id="94" w:author="s s" w:date="2026-04-18T20:18:00Z">
-              <w:r>
-                <w:rPr>
-                  <w:rStyle w:val="a9"/>
-                  <w:rFonts w:ascii="ＭＳ 明朝" w:eastAsia="ＭＳ 明朝" w:hAnsi="ＭＳ 明朝"/>
-                  <w:sz w:val="22"/>
-                </w:rPr>
-                <w:t>https://www.youtube.com/watch?v=2tYpUXiw4-0</w:t>
-              </w:r>
-            </w:ins>
-            <w:ins w:id="95" w:author="s s" w:date="2026-04-18T20:20:00Z" w16du:dateUtc="2026-04-18T11:20:00Z">
-              <w:r>
-                <w:rPr>
-                  <w:rFonts w:ascii="ＭＳ 明朝" w:eastAsia="ＭＳ 明朝" w:hAnsi="ＭＳ 明朝"/>
-                  <w:sz w:val="22"/>
-                </w:rPr>
-                <w:fldChar w:fldCharType="end"/>
-              </w:r>
-            </w:ins>
-            <w:ins w:id="96" w:author="s s" w:date="2026-04-18T20:18:00Z">
-              <w:r>
-                <w:rPr>
-                  <w:rFonts w:ascii="ＭＳ 明朝" w:eastAsia="ＭＳ 明朝" w:hAnsi="ＭＳ 明朝"/>
-                  <w:szCs w:val="21"/>
-                  <w:rPrChange w:id="97" w:author="s s" w:date="2026-04-18T20:20:00Z" w16du:dateUtc="2026-04-18T11:20:00Z">
-                    <w:rPr/>
-                  </w:rPrChange>
-                </w:rPr>
-                <w:t>「富士山の大規模噴火と降灰の影響（内閣府防災）」</w:t>
-              </w:r>
-              <w:r>
-                <w:rPr>
-                  <w:rFonts w:ascii="ＭＳ 明朝" w:eastAsia="ＭＳ 明朝" w:hAnsi="ＭＳ 明朝"/>
-                  <w:szCs w:val="21"/>
-                  <w:rPrChange w:id="98" w:author="s s" w:date="2026-04-18T20:20:00Z" w16du:dateUtc="2026-04-18T11:20:00Z">
-                    <w:rPr/>
-                  </w:rPrChange>
-                </w:rPr>
-                <w:br/>
-              </w:r>
-            </w:ins>
-            <w:ins w:id="99" w:author="s s" w:date="2026-04-18T20:20:00Z" w16du:dateUtc="2026-04-18T11:20:00Z">
-              <w:r>
-                <w:rPr>
-                  <w:rFonts w:ascii="ＭＳ 明朝" w:eastAsia="ＭＳ 明朝" w:hAnsi="ＭＳ 明朝" w:hint="eastAsia"/>
-                  <w:sz w:val="22"/>
-                </w:rPr>
-                <w:t xml:space="preserve">　</w:t>
-              </w:r>
-            </w:ins>
-            <w:ins w:id="100" w:author="s s" w:date="2026-04-18T20:18:00Z">
-              <w:r>
-                <w:rPr>
-                  <w:rFonts w:ascii="ＭＳ 明朝" w:eastAsia="ＭＳ 明朝" w:hAnsi="ＭＳ 明朝"/>
-                  <w:sz w:val="22"/>
-                  <w:rPrChange w:id="101" w:author="s s" w:date="2026-04-18T20:19:00Z" w16du:dateUtc="2026-04-18T11:19:00Z">
-                    <w:rPr/>
-                  </w:rPrChange>
-                </w:rPr>
-                <w:t>動画を視聴したうえで、富士山の大規模噴火およびそれに伴う降灰災害にどのように備えるべきかについて</w:t>
-              </w:r>
-            </w:ins>
-            <w:ins w:id="102" w:author="s s" w:date="2026-04-18T20:21:00Z" w16du:dateUtc="2026-04-18T11:21:00Z">
-              <w:r>
-                <w:rPr>
-                  <w:rFonts w:ascii="ＭＳ 明朝" w:eastAsia="ＭＳ 明朝" w:hAnsi="ＭＳ 明朝" w:hint="eastAsia"/>
-                  <w:sz w:val="22"/>
-                </w:rPr>
-                <w:t>、</w:t>
-              </w:r>
-            </w:ins>
-            <w:ins w:id="103" w:author="s s" w:date="2026-04-18T20:18:00Z">
-              <w:r>
-                <w:rPr>
-                  <w:rFonts w:ascii="ＭＳ 明朝" w:eastAsia="ＭＳ 明朝" w:hAnsi="ＭＳ 明朝"/>
-                  <w:sz w:val="22"/>
-                  <w:rPrChange w:id="104" w:author="s s" w:date="2026-04-18T20:19:00Z" w16du:dateUtc="2026-04-18T11:19:00Z">
-                    <w:rPr/>
-                  </w:rPrChange>
-                </w:rPr>
-                <w:t>以下の観点を踏まえて論じなさい。</w:t>
-              </w:r>
-              <w:r>
-                <w:rPr>
-                  <w:rFonts w:ascii="ＭＳ 明朝" w:eastAsia="ＭＳ 明朝" w:hAnsi="ＭＳ 明朝"/>
-                  <w:sz w:val="22"/>
-                  <w:rPrChange w:id="105" w:author="s s" w:date="2026-04-18T20:19:00Z" w16du:dateUtc="2026-04-18T11:19:00Z">
-                    <w:rPr/>
-                  </w:rPrChange>
-                </w:rPr>
-                <w:br/>
-                <w:t>① 富士山の大規模噴火・降灰の影響にはどのような特徴があるか。さらに、こうした被害想定は、</w:t>
-              </w:r>
-            </w:ins>
-            <w:ins w:id="106" w:author="s s" w:date="2026-04-18T20:21:00Z" w16du:dateUtc="2026-04-18T11:21:00Z">
-              <w:r>
-                <w:rPr>
-                  <w:rFonts w:ascii="ＭＳ 明朝" w:eastAsia="ＭＳ 明朝" w:hAnsi="ＭＳ 明朝" w:hint="eastAsia"/>
-                  <w:sz w:val="22"/>
-                </w:rPr>
-                <w:t xml:space="preserve">　</w:t>
-              </w:r>
-            </w:ins>
+            <w:r>
+              <w:rPr>
+                <w:rFonts w:ascii="ＭＳ 明朝" w:eastAsia="ＭＳ 明朝" w:hAnsi="ＭＳ 明朝"/>
+                <w:sz w:val="22"/>
+              </w:rPr>
+              <w:lastRenderedPageBreak/>
+              <w:t>5．以下の動画は</w:t>
+            </w:r>
+            <w:r>
+              <w:rPr>
+                <w:rFonts w:ascii="ＭＳ 明朝" w:eastAsia="ＭＳ 明朝" w:hAnsi="ＭＳ 明朝" w:hint="eastAsia"/>
+                <w:sz w:val="22"/>
+              </w:rPr>
+              <w:t>、</w:t>
+            </w:r>
+            <w:r>
+              <w:rPr>
+                <w:rFonts w:ascii="ＭＳ 明朝" w:eastAsia="ＭＳ 明朝" w:hAnsi="ＭＳ 明朝"/>
+                <w:sz w:val="22"/>
+              </w:rPr>
+              <w:t>富士山の大規模噴火（宝永噴火規模）を想定し</w:t>
+            </w:r>
+            <w:r>
+              <w:rPr>
+                <w:rFonts w:ascii="ＭＳ 明朝" w:eastAsia="ＭＳ 明朝" w:hAnsi="ＭＳ 明朝" w:hint="eastAsia"/>
+                <w:sz w:val="22"/>
+              </w:rPr>
+              <w:t>、</w:t>
+            </w:r>
+            <w:r>
+              <w:rPr>
+                <w:rFonts w:ascii="ＭＳ 明朝" w:eastAsia="ＭＳ 明朝" w:hAnsi="ＭＳ 明朝"/>
+                <w:sz w:val="22"/>
+              </w:rPr>
+              <w:t>噴火現象および広域に及ぶ降灰の影響について</w:t>
+            </w:r>
+            <w:r>
+              <w:rPr>
+                <w:rFonts w:ascii="ＭＳ 明朝" w:eastAsia="ＭＳ 明朝" w:hAnsi="ＭＳ 明朝" w:hint="eastAsia"/>
+                <w:sz w:val="22"/>
+              </w:rPr>
+              <w:t>、</w:t>
+            </w:r>
+            <w:r>
+              <w:rPr>
+                <w:rFonts w:ascii="ＭＳ 明朝" w:eastAsia="ＭＳ 明朝" w:hAnsi="ＭＳ 明朝"/>
+                <w:sz w:val="22"/>
+              </w:rPr>
+              <w:t>科学的な知見に基づいて整理した内閣府防災の資料映像です。</w:t>
+            </w:r>
+            <w:r>
+              <w:rPr>
+                <w:rFonts w:ascii="ＭＳ 明朝" w:eastAsia="ＭＳ 明朝" w:hAnsi="ＭＳ 明朝"/>
+                <w:sz w:val="22"/>
+              </w:rPr>
+              <w:br/>
+            </w:r>
+            <w:r>
+              <w:rPr>
+                <w:rFonts w:ascii="ＭＳ 明朝" w:eastAsia="ＭＳ 明朝" w:hAnsi="ＭＳ 明朝"/>
+                <w:sz w:val="22"/>
+              </w:rPr>
+              <w:fldChar w:fldCharType="begin"/>
+            </w:r>
+            <w:r>
+              <w:rPr>
+                <w:rFonts w:ascii="ＭＳ 明朝" w:eastAsia="ＭＳ 明朝" w:hAnsi="ＭＳ 明朝"/>
+                <w:sz w:val="22"/>
+              </w:rPr>
+              <w:instrText>HYPERLINK "</w:instrText>
+            </w:r>
+            <w:r>
+              <w:rPr>
+                <w:rFonts w:ascii="ＭＳ 明朝" w:eastAsia="ＭＳ 明朝" w:hAnsi="ＭＳ 明朝"/>
+                <w:sz w:val="22"/>
+              </w:rPr>
+              <w:instrText>https://www.youtube.com/watch?v=2tYpUXiw4-0</w:instrText>
+            </w:r>
+            <w:r>
+              <w:rPr>
+                <w:rFonts w:ascii="ＭＳ 明朝" w:eastAsia="ＭＳ 明朝" w:hAnsi="ＭＳ 明朝"/>
+                <w:sz w:val="22"/>
+              </w:rPr>
+              <w:instrText>"</w:instrText>
+            </w:r>
+            <w:r>
+              <w:rPr>
+                <w:rFonts w:ascii="ＭＳ 明朝" w:eastAsia="ＭＳ 明朝" w:hAnsi="ＭＳ 明朝"/>
+                <w:sz w:val="22"/>
+              </w:rPr>
+              <w:fldChar w:fldCharType="separate"/>
+            </w:r>
+            <w:r>
+              <w:rPr>
+                <w:rStyle w:val="a9"/>
+                <w:rFonts w:ascii="ＭＳ 明朝" w:eastAsia="ＭＳ 明朝" w:hAnsi="ＭＳ 明朝"/>
+                <w:sz w:val="22"/>
+              </w:rPr>
+              <w:t>https://www.youtube.com/watch?v=2tYpUXiw4-0</w:t>
+            </w:r>
+            <w:r>
+              <w:rPr>
+                <w:rFonts w:ascii="ＭＳ 明朝" w:eastAsia="ＭＳ 明朝" w:hAnsi="ＭＳ 明朝"/>
+                <w:sz w:val="22"/>
+              </w:rPr>
+              <w:fldChar w:fldCharType="end"/>
+            </w:r>
+            <w:r>
+              <w:rPr>
+                <w:rFonts w:ascii="ＭＳ 明朝" w:eastAsia="ＭＳ 明朝" w:hAnsi="ＭＳ 明朝"/>
+                <w:szCs w:val="21"/>
+              </w:rPr>
+              <w:t>「富士山の大規模噴火と降灰の影響（内閣府防災）」</w:t>
+            </w:r>
+            <w:r>
+              <w:rPr>
+                <w:rFonts w:ascii="ＭＳ 明朝" w:eastAsia="ＭＳ 明朝" w:hAnsi="ＭＳ 明朝"/>
+                <w:szCs w:val="21"/>
+              </w:rPr>
+              <w:br/>
+            </w:r>
+            <w:r>
+              <w:rPr>
+                <w:rFonts w:ascii="ＭＳ 明朝" w:eastAsia="ＭＳ 明朝" w:hAnsi="ＭＳ 明朝" w:hint="eastAsia"/>
+                <w:sz w:val="22"/>
+              </w:rPr>
+              <w:t xml:space="preserve">　</w:t>
+            </w:r>
+            <w:r>
+              <w:rPr>
+                <w:rFonts w:ascii="ＭＳ 明朝" w:eastAsia="ＭＳ 明朝" w:hAnsi="ＭＳ 明朝"/>
+                <w:sz w:val="22"/>
+              </w:rPr>
+              <w:t>動画を視聴したうえで、富士山の大規模噴火およびそれに伴う降灰災害にどのように備えるべきかについて</w:t>
+            </w:r>
+            <w:r>
+              <w:rPr>
+                <w:rFonts w:ascii="ＭＳ 明朝" w:eastAsia="ＭＳ 明朝" w:hAnsi="ＭＳ 明朝" w:hint="eastAsia"/>
+                <w:sz w:val="22"/>
+              </w:rPr>
+              <w:t>、</w:t>
+            </w:r>
+            <w:r>
+              <w:rPr>
+                <w:rFonts w:ascii="ＭＳ 明朝" w:eastAsia="ＭＳ 明朝" w:hAnsi="ＭＳ 明朝"/>
+                <w:sz w:val="22"/>
+              </w:rPr>
+              <w:t>以下の観点を踏まえて論じなさい。</w:t>
+            </w:r>
+            <w:r>
+              <w:rPr>
+                <w:rFonts w:ascii="ＭＳ 明朝" w:eastAsia="ＭＳ 明朝" w:hAnsi="ＭＳ 明朝"/>
+                <w:sz w:val="22"/>
+              </w:rPr>
+              <w:br/>
+              <w:t>① 富士山の大規模噴火・降灰の影響にはどのような特徴があるか。さらに、こうした被害想定は、</w:t>
+            </w:r>
+            <w:r>
+              <w:rPr>
+                <w:rFonts w:ascii="ＭＳ 明朝" w:eastAsia="ＭＳ 明朝" w:hAnsi="ＭＳ 明朝" w:hint="eastAsia"/>
+                <w:sz w:val="22"/>
+              </w:rPr>
+              <w:t xml:space="preserve">　</w:t>
+            </w:r>
           </w:p>
           <w:p>
             <w:pPr>
               <w:ind w:left="210" w:firstLineChars="200" w:firstLine="440"/>
               <w:rPr>
-                <w:ins w:id="107" w:author="s s" w:date="2026-04-18T20:22:00Z" w16du:dateUtc="2026-04-18T11:22:00Z"/>
                 <w:rFonts w:ascii="ＭＳ 明朝" w:eastAsia="ＭＳ 明朝" w:hAnsi="ＭＳ 明朝"/>
                 <w:sz w:val="22"/>
               </w:rPr>
             </w:pPr>
-            <w:ins w:id="108" w:author="s s" w:date="2026-04-18T20:18:00Z">
-              <w:r>
-                <w:rPr>
-                  <w:rFonts w:ascii="ＭＳ 明朝" w:eastAsia="ＭＳ 明朝" w:hAnsi="ＭＳ 明朝"/>
-                  <w:sz w:val="22"/>
-                  <w:rPrChange w:id="109" w:author="s s" w:date="2026-04-18T20:19:00Z" w16du:dateUtc="2026-04-18T11:19:00Z">
-                    <w:rPr/>
-                  </w:rPrChange>
-                </w:rPr>
-                <w:t>火山防災や社会の備えにおいてどのような役割を果たすと考えられるか。</w:t>
-              </w:r>
-              <w:r>
-                <w:rPr>
-                  <w:rFonts w:ascii="ＭＳ 明朝" w:eastAsia="ＭＳ 明朝" w:hAnsi="ＭＳ 明朝"/>
-                  <w:sz w:val="22"/>
-                  <w:rPrChange w:id="110" w:author="s s" w:date="2026-04-18T20:19:00Z" w16du:dateUtc="2026-04-18T11:19:00Z">
-                    <w:rPr/>
-                  </w:rPrChange>
-                </w:rPr>
-                <w:br/>
-                <w:t>② 噴火規模や降灰の影響を想定することには、どのような不確実性や限界があるか。</w:t>
-              </w:r>
-            </w:ins>
+            <w:r>
+              <w:rPr>
+                <w:rFonts w:ascii="ＭＳ 明朝" w:eastAsia="ＭＳ 明朝" w:hAnsi="ＭＳ 明朝"/>
+                <w:sz w:val="22"/>
+              </w:rPr>
+              <w:t>火山防災や社会の備えにおいてどのような役割を果たすと考えられるか。</w:t>
+            </w:r>
+            <w:r>
+              <w:rPr>
+                <w:rFonts w:ascii="ＭＳ 明朝" w:eastAsia="ＭＳ 明朝" w:hAnsi="ＭＳ 明朝"/>
+                <w:sz w:val="22"/>
+              </w:rPr>
+              <w:br/>
+              <w:t>② 噴火規模や降灰の影響を想定することには、どのような不確実性や限界があるか。</w:t>
+            </w:r>
           </w:p>
           <w:p>
             <w:pPr>
               <w:ind w:left="210" w:firstLineChars="200" w:firstLine="440"/>
               <w:rPr>
-                <w:ins w:id="111" w:author="石塚吉浩" w:date="2026-04-17T19:06:00Z" w16du:dateUtc="2026-04-17T10:06:00Z"/>
-                <w:del w:id="112" w:author="s s" w:date="2026-04-18T15:45:00Z" w16du:dateUtc="2026-04-18T06:45:00Z"/>
                 <w:rFonts w:ascii="ＭＳ 明朝" w:eastAsia="ＭＳ 明朝" w:hAnsi="ＭＳ 明朝"/>
                 <w:sz w:val="22"/>
-                <w:rPrChange w:id="113" w:author="s s" w:date="2026-04-18T20:19:00Z" w16du:dateUtc="2026-04-18T11:19:00Z">
-                  <w:rPr>
-                    <w:ins w:id="114" w:author="石塚吉浩" w:date="2026-04-17T19:06:00Z" w16du:dateUtc="2026-04-17T10:06:00Z"/>
-                    <w:del w:id="115" w:author="s s" w:date="2026-04-18T15:45:00Z" w16du:dateUtc="2026-04-18T06:45:00Z"/>
-                    <w:kern w:val="0"/>
-                    <w:szCs w:val="21"/>
-                  </w:rPr>
-                </w:rPrChange>
-              </w:rPr>
-              <w:pPrChange w:id="116" w:author="s s" w:date="2026-04-18T20:21:00Z" w16du:dateUtc="2026-04-18T11:21:00Z">
-                <w:pPr>
-                  <w:pStyle w:val="a4"/>
-                  <w:widowControl/>
-                  <w:numPr>
-                    <w:numId w:val="3"/>
-                  </w:numPr>
-                  <w:ind w:leftChars="0" w:left="360" w:hanging="360"/>
-                  <w:contextualSpacing/>
-                </w:pPr>
-              </w:pPrChange>
-            </w:pPr>
-            <w:ins w:id="117" w:author="s s" w:date="2026-04-18T20:22:00Z" w16du:dateUtc="2026-04-18T11:22:00Z">
-              <w:r>
-                <w:rPr>
-                  <w:rFonts w:ascii="ＭＳ 明朝" w:eastAsia="ＭＳ 明朝" w:hAnsi="ＭＳ 明朝" w:hint="eastAsia"/>
-                  <w:sz w:val="22"/>
-                </w:rPr>
-                <w:t>それらを前提に</w:t>
-              </w:r>
-            </w:ins>
-            <w:ins w:id="118" w:author="s s" w:date="2026-04-18T20:18:00Z">
-              <w:r>
-                <w:rPr>
-                  <w:rFonts w:ascii="ＭＳ 明朝" w:eastAsia="ＭＳ 明朝" w:hAnsi="ＭＳ 明朝"/>
-                  <w:sz w:val="22"/>
-                  <w:rPrChange w:id="119" w:author="s s" w:date="2026-04-18T20:19:00Z" w16du:dateUtc="2026-04-18T11:19:00Z">
-                    <w:rPr/>
-                  </w:rPrChange>
-                </w:rPr>
-                <w:t>、</w:t>
-              </w:r>
-            </w:ins>
-            <w:ins w:id="120" w:author="s s" w:date="2026-04-18T20:22:00Z" w16du:dateUtc="2026-04-18T11:22:00Z">
-              <w:r>
-                <w:rPr>
-                  <w:rFonts w:ascii="ＭＳ 明朝" w:eastAsia="ＭＳ 明朝" w:hAnsi="ＭＳ 明朝" w:hint="eastAsia"/>
-                  <w:sz w:val="22"/>
-                </w:rPr>
-                <w:t>火山学的知見は、</w:t>
-              </w:r>
-            </w:ins>
-            <w:ins w:id="121" w:author="s s" w:date="2026-04-18T20:18:00Z">
-              <w:r>
-                <w:rPr>
-                  <w:rFonts w:ascii="ＭＳ 明朝" w:eastAsia="ＭＳ 明朝" w:hAnsi="ＭＳ 明朝"/>
-                  <w:sz w:val="22"/>
-                  <w:rPrChange w:id="122" w:author="s s" w:date="2026-04-18T20:19:00Z" w16du:dateUtc="2026-04-18T11:19:00Z">
-                    <w:rPr/>
-                  </w:rPrChange>
-                </w:rPr>
-                <w:t>社会の中でどのように位置づけられるべきか。</w:t>
-              </w:r>
-            </w:ins>
-            <w:ins w:id="123" w:author="石塚吉浩" w:date="2026-04-17T19:06:00Z" w16du:dateUtc="2026-04-17T10:06:00Z">
-              <w:del w:id="124" w:author="s s" w:date="2026-04-18T15:45:00Z" w16du:dateUtc="2026-04-18T06:45:00Z">
-                <w:r>
-                  <w:rPr>
-                    <w:rFonts w:ascii="ＭＳ 明朝" w:eastAsia="ＭＳ 明朝" w:hAnsi="ＭＳ 明朝" w:hint="eastAsia"/>
-                    <w:sz w:val="22"/>
-                    <w:rPrChange w:id="125" w:author="s s" w:date="2026-04-18T20:19:00Z" w16du:dateUtc="2026-04-18T11:19:00Z">
-                      <w:rPr>
-                        <w:rFonts w:hint="eastAsia"/>
-                      </w:rPr>
-                    </w:rPrChange>
-                  </w:rPr>
-                  <w:delText>以下の動画は、富士山の大規模噴火（宝永噴火規模）を想定し、噴火現象および広域降灰の影響を、科学的知見に基づいて整理した内閣府防災の資料映像である。</w:delText>
-                </w:r>
-              </w:del>
-            </w:ins>
+              </w:rPr>
+            </w:pPr>
+            <w:r>
+              <w:rPr>
+                <w:rFonts w:ascii="ＭＳ 明朝" w:eastAsia="ＭＳ 明朝" w:hAnsi="ＭＳ 明朝" w:hint="eastAsia"/>
+                <w:sz w:val="22"/>
+              </w:rPr>
+              <w:t>それらを前提に</w:t>
+            </w:r>
+            <w:r>
+              <w:rPr>
+                <w:rFonts w:ascii="ＭＳ 明朝" w:eastAsia="ＭＳ 明朝" w:hAnsi="ＭＳ 明朝"/>
+                <w:sz w:val="22"/>
+              </w:rPr>
+              <w:t>、</w:t>
+            </w:r>
+            <w:r>
+              <w:rPr>
+                <w:rFonts w:ascii="ＭＳ 明朝" w:eastAsia="ＭＳ 明朝" w:hAnsi="ＭＳ 明朝" w:hint="eastAsia"/>
+                <w:sz w:val="22"/>
+              </w:rPr>
+              <w:t>火山学的知見は、</w:t>
+            </w:r>
+            <w:r>
+              <w:rPr>
+                <w:rFonts w:ascii="ＭＳ 明朝" w:eastAsia="ＭＳ 明朝" w:hAnsi="ＭＳ 明朝"/>
+                <w:sz w:val="22"/>
+              </w:rPr>
+              <w:t>社会の中でどのように位置づけられるべきか。</w:t>
+            </w:r>
           </w:p>
           <w:p>
             <w:pPr>
               <w:ind w:left="210" w:firstLineChars="200" w:firstLine="400"/>
               <w:rPr>
-                <w:ins w:id="126" w:author="石塚吉浩" w:date="2026-04-17T19:06:00Z" w16du:dateUtc="2026-04-17T10:06:00Z"/>
-                <w:del w:id="127" w:author="s s" w:date="2026-04-18T15:45:00Z" w16du:dateUtc="2026-04-18T06:45:00Z"/>
                 <w:kern w:val="0"/>
                 <w:szCs w:val="21"/>
               </w:rPr>
-              <w:pPrChange w:id="128" w:author="s s" w:date="2026-04-18T20:21:00Z" w16du:dateUtc="2026-04-18T11:21:00Z">
-                <w:pPr>
-                  <w:spacing w:line="324" w:lineRule="auto"/>
-                </w:pPr>
-              </w:pPrChange>
-            </w:pPr>
-            <w:ins w:id="129" w:author="石塚吉浩" w:date="2026-04-17T19:06:00Z" w16du:dateUtc="2026-04-17T10:06:00Z">
-              <w:del w:id="130" w:author="s s" w:date="2026-04-18T15:45:00Z" w16du:dateUtc="2026-04-18T06:45:00Z">
-                <w:r>
-                  <w:rPr>
-                    <w:rFonts w:ascii="Century" w:hAnsi="Century"/>
-                    <w:sz w:val="20"/>
-                    <w:szCs w:val="20"/>
-                  </w:rPr>
-                  <w:delText>https://www.youtube.com/watch?v=2tYpUXiw4-0</w:delText>
-                </w:r>
-                <w:r>
-                  <w:rPr>
-                    <w:rFonts w:hint="eastAsia"/>
-                    <w:sz w:val="20"/>
-                    <w:szCs w:val="20"/>
-                  </w:rPr>
-                  <w:delText>（「富士山の大規模噴火と降灰の影響（内閣府防災）」）</w:delText>
-                </w:r>
-              </w:del>
-            </w:ins>
+            </w:pPr>
           </w:p>
           <w:p>
             <w:pPr>
               <w:ind w:left="210" w:firstLineChars="200" w:firstLine="420"/>
               <w:rPr>
-                <w:ins w:id="131" w:author="石塚吉浩" w:date="2026-04-17T19:06:00Z" w16du:dateUtc="2026-04-17T10:06:00Z"/>
-                <w:del w:id="132" w:author="s s" w:date="2026-04-18T15:45:00Z" w16du:dateUtc="2026-04-18T06:45:00Z"/>
                 <w:kern w:val="0"/>
                 <w:szCs w:val="21"/>
               </w:rPr>
-              <w:pPrChange w:id="133" w:author="s s" w:date="2026-04-18T20:21:00Z" w16du:dateUtc="2026-04-18T11:21:00Z">
-                <w:pPr>
-                  <w:spacing w:line="324" w:lineRule="auto"/>
-                </w:pPr>
-              </w:pPrChange>
-            </w:pPr>
-            <w:ins w:id="134" w:author="石塚吉浩" w:date="2026-04-17T19:06:00Z" w16du:dateUtc="2026-04-17T10:06:00Z">
-              <w:del w:id="135" w:author="s s" w:date="2026-04-18T15:45:00Z" w16du:dateUtc="2026-04-18T06:45:00Z">
-                <w:r>
-                  <w:rPr>
-                    <w:rFonts w:hint="eastAsia"/>
-                  </w:rPr>
-                  <w:delText>動画を視聴したうえで、富士山の大規模噴火および降灰災害への備えについて、自身の研究テーマと関連付けながら、下記①②に沿って述べなさい。なお、影響（被害）と備え（対策）について、それぞれ2つ以上挙げ、具体例と理由を添えること。</w:delText>
-                </w:r>
-              </w:del>
-            </w:ins>
+            </w:pPr>
           </w:p>
           <w:p>
             <w:pPr>
               <w:ind w:left="210" w:firstLineChars="200" w:firstLine="420"/>
               <w:rPr>
-                <w:ins w:id="136" w:author="石塚吉浩" w:date="2026-04-17T19:06:00Z" w16du:dateUtc="2026-04-17T10:06:00Z"/>
-                <w:del w:id="137" w:author="s s" w:date="2026-04-18T15:45:00Z" w16du:dateUtc="2026-04-18T06:45:00Z"/>
                 <w:kern w:val="0"/>
                 <w:szCs w:val="21"/>
               </w:rPr>
-              <w:pPrChange w:id="138" w:author="s s" w:date="2026-04-18T20:21:00Z" w16du:dateUtc="2026-04-18T11:21:00Z">
-                <w:pPr>
-                  <w:spacing w:line="324" w:lineRule="auto"/>
-                  <w:ind w:left="360"/>
-                </w:pPr>
-              </w:pPrChange>
-            </w:pPr>
-            <w:ins w:id="139" w:author="石塚吉浩" w:date="2026-04-17T19:06:00Z" w16du:dateUtc="2026-04-17T10:06:00Z">
-              <w:del w:id="140" w:author="s s" w:date="2026-04-18T15:45:00Z" w16du:dateUtc="2026-04-18T06:45:00Z">
-                <w:r>
-                  <w:rPr>
-                    <w:rFonts w:hint="eastAsia"/>
-                    <w:b/>
-                    <w:bCs/>
-                  </w:rPr>
-                  <w:delText>① 大規模噴火・広域降灰の影響と被害想定の意味</w:delText>
-                </w:r>
-              </w:del>
-            </w:ins>
+            </w:pPr>
           </w:p>
           <w:p>
             <w:pPr>
               <w:ind w:left="210" w:firstLineChars="200" w:firstLine="420"/>
               <w:rPr>
-                <w:ins w:id="141" w:author="石塚吉浩" w:date="2026-04-17T19:06:00Z" w16du:dateUtc="2026-04-17T10:06:00Z"/>
-                <w:del w:id="142" w:author="s s" w:date="2026-04-18T15:45:00Z" w16du:dateUtc="2026-04-18T06:45:00Z"/>
                 <w:kern w:val="0"/>
                 <w:szCs w:val="21"/>
               </w:rPr>
-              <w:pPrChange w:id="143" w:author="s s" w:date="2026-04-18T20:21:00Z" w16du:dateUtc="2026-04-18T11:21:00Z">
-                <w:pPr>
-                  <w:spacing w:line="324" w:lineRule="auto"/>
-                  <w:ind w:left="360"/>
-                </w:pPr>
-              </w:pPrChange>
-            </w:pPr>
-            <w:ins w:id="144" w:author="石塚吉浩" w:date="2026-04-17T19:06:00Z" w16du:dateUtc="2026-04-17T10:06:00Z">
-              <w:del w:id="145" w:author="s s" w:date="2026-04-18T15:45:00Z" w16du:dateUtc="2026-04-18T06:45:00Z">
-                <w:r>
-                  <w:rPr>
-                    <w:rFonts w:hint="eastAsia"/>
-                  </w:rPr>
-                  <w:delText>動画で示された大規模噴火・広域降灰の影響の特徴を述べなさい。あわせて、被害想定が火山防災および社会の備えに果たす役割について論じなさい。</w:delText>
-                </w:r>
-              </w:del>
-            </w:ins>
+            </w:pPr>
           </w:p>
           <w:p>
             <w:pPr>
               <w:ind w:left="210" w:firstLineChars="200" w:firstLine="420"/>
               <w:rPr>
-                <w:ins w:id="146" w:author="石塚吉浩" w:date="2026-04-17T19:06:00Z" w16du:dateUtc="2026-04-17T10:06:00Z"/>
-                <w:del w:id="147" w:author="s s" w:date="2026-04-18T15:45:00Z" w16du:dateUtc="2026-04-18T06:45:00Z"/>
                 <w:kern w:val="0"/>
                 <w:szCs w:val="21"/>
               </w:rPr>
-              <w:pPrChange w:id="148" w:author="s s" w:date="2026-04-18T20:21:00Z" w16du:dateUtc="2026-04-18T11:21:00Z">
-                <w:pPr>
-                  <w:spacing w:line="324" w:lineRule="auto"/>
-                  <w:ind w:left="360"/>
-                </w:pPr>
-              </w:pPrChange>
-            </w:pPr>
-            <w:ins w:id="149" w:author="石塚吉浩" w:date="2026-04-17T19:06:00Z" w16du:dateUtc="2026-04-17T10:06:00Z">
-              <w:del w:id="150" w:author="s s" w:date="2026-04-18T15:45:00Z" w16du:dateUtc="2026-04-18T06:45:00Z">
-                <w:r>
-                  <w:rPr>
-                    <w:rFonts w:hint="eastAsia"/>
-                    <w:b/>
-                    <w:bCs/>
-                  </w:rPr>
-                  <w:delText>② 想定の限界を踏まえた防災と科学の役割</w:delText>
-                </w:r>
-              </w:del>
-            </w:ins>
+            </w:pPr>
           </w:p>
           <w:p>
             <w:pPr>
               <w:ind w:left="210" w:firstLineChars="200" w:firstLine="420"/>
               <w:rPr>
-                <w:ins w:id="151" w:author="石塚吉浩" w:date="2026-04-17T19:06:00Z" w16du:dateUtc="2026-04-17T10:06:00Z"/>
-                <w:del w:id="152" w:author="s s" w:date="2026-04-18T20:18:00Z" w16du:dateUtc="2026-04-18T11:18:00Z"/>
                 <w:kern w:val="0"/>
                 <w:szCs w:val="21"/>
               </w:rPr>
-              <w:pPrChange w:id="153" w:author="s s" w:date="2026-04-18T20:21:00Z" w16du:dateUtc="2026-04-18T11:21:00Z">
-                <w:pPr>
-                  <w:spacing w:line="324" w:lineRule="auto"/>
-                  <w:ind w:left="360"/>
-                </w:pPr>
-              </w:pPrChange>
-            </w:pPr>
-            <w:ins w:id="154" w:author="石塚吉浩" w:date="2026-04-17T19:06:00Z" w16du:dateUtc="2026-04-17T10:06:00Z">
-              <w:del w:id="155" w:author="s s" w:date="2026-04-18T15:45:00Z" w16du:dateUtc="2026-04-18T06:45:00Z">
-                <w:r>
-                  <w:rPr>
-                    <w:rFonts w:hint="eastAsia"/>
-                  </w:rPr>
-                  <w:delText>噴火規模および降灰影響の想定に伴う不確実性・限界を、2つ以上挙げて述べなさい。そのうえで、火山学的知見を社会の中でどのように位置付け、防災に生かすべきかを論じなさい。</w:delText>
-                </w:r>
-              </w:del>
-            </w:ins>
+            </w:pPr>
           </w:p>
           <w:p>
             <w:pPr>
               <w:ind w:left="210" w:firstLineChars="200" w:firstLine="420"/>
-              <w:pPrChange w:id="156" w:author="s s" w:date="2026-04-18T20:21:00Z" w16du:dateUtc="2026-04-18T11:21:00Z">
-                <w:pPr>
-                  <w:pStyle w:val="a4"/>
-                  <w:snapToGrid w:val="0"/>
-                  <w:spacing w:line="324" w:lineRule="auto"/>
-                  <w:ind w:leftChars="0" w:left="360"/>
-                </w:pPr>
-              </w:pPrChange>
             </w:pPr>
           </w:p>
         </w:tc>
@@ -2453,90 +1878,88 @@
           <w:bdr w:val="single" w:sz="4" w:space="0" w:color="auto"/>
         </w:rPr>
       </w:pPr>
-      <w:ins w:id="157" w:author="石塚吉浩" w:date="2026-04-17T18:44:00Z" w16du:dateUtc="2026-04-17T09:44:00Z">
-        <w:r>
-          <w:rPr>
-            <w:rFonts w:ascii="Century" w:eastAsia="ＭＳ 明朝" w:hAnsi="Century"/>
-            <w:noProof/>
-            <w:color w:val="000000" w:themeColor="text1"/>
-            <w:sz w:val="22"/>
-            <w:bdr w:val="single" w:sz="4" w:space="0" w:color="auto"/>
-          </w:rPr>
-          <w:lastRenderedPageBreak/>
-          <mc:AlternateContent>
-            <mc:Choice Requires="wps">
-              <w:drawing>
-                <wp:anchor distT="0" distB="0" distL="114300" distR="114300" simplePos="0" relativeHeight="251659264" behindDoc="0" locked="0" layoutInCell="1" allowOverlap="1" wp14:anchorId="2B12CD68" wp14:editId="320F51FB">
-                  <wp:simplePos x="0" y="0"/>
-                  <wp:positionH relativeFrom="column">
-                    <wp:posOffset>-451982</wp:posOffset>
-                  </wp:positionH>
-                  <wp:positionV relativeFrom="paragraph">
-                    <wp:posOffset>-171146</wp:posOffset>
-                  </wp:positionV>
-                  <wp:extent cx="6328907" cy="8507481"/>
-                  <wp:effectExtent l="0" t="0" r="8890" b="14605"/>
-                  <wp:wrapNone/>
-                  <wp:docPr id="625074268" name="正方形/長方形 1"/>
-                  <wp:cNvGraphicFramePr/>
-                  <a:graphic xmlns:a="http://schemas.openxmlformats.org/drawingml/2006/main">
-                    <a:graphicData uri="http://schemas.microsoft.com/office/word/2010/wordprocessingShape">
-                      <wps:wsp>
-                        <wps:cNvSpPr/>
-                        <wps:spPr>
-                          <a:xfrm>
-                            <a:off x="0" y="0"/>
-                            <a:ext cx="6328907" cy="8507481"/>
-                          </a:xfrm>
-                          <a:prstGeom prst="rect">
-                            <a:avLst/>
-                          </a:prstGeom>
-                          <a:ln w="6350">
-                            <a:solidFill>
-                              <a:schemeClr val="tx1"/>
-                            </a:solidFill>
-                          </a:ln>
-                        </wps:spPr>
-                        <wps:style>
-                          <a:lnRef idx="2">
-                            <a:schemeClr val="accent6"/>
-                          </a:lnRef>
-                          <a:fillRef idx="1">
-                            <a:schemeClr val="lt1"/>
-                          </a:fillRef>
-                          <a:effectRef idx="0">
-                            <a:schemeClr val="accent6"/>
-                          </a:effectRef>
-                          <a:fontRef idx="minor">
-                            <a:schemeClr val="dk1"/>
-                          </a:fontRef>
-                        </wps:style>
-                        <wps:bodyPr rot="0" spcFirstLastPara="0" vertOverflow="overflow" horzOverflow="overflow" vert="horz" wrap="square" lIns="91440" tIns="45720" rIns="91440" bIns="45720" numCol="1" spcCol="0" rtlCol="0" fromWordArt="0" anchor="ctr" anchorCtr="0" forceAA="0" compatLnSpc="1">
-                          <a:prstTxWarp prst="textNoShape">
-                            <a:avLst/>
-                          </a:prstTxWarp>
-                          <a:noAutofit/>
-                        </wps:bodyPr>
-                      </wps:wsp>
-                    </a:graphicData>
-                  </a:graphic>
-                  <wp14:sizeRelH relativeFrom="margin">
-                    <wp14:pctWidth>0</wp14:pctWidth>
-                  </wp14:sizeRelH>
-                  <wp14:sizeRelV relativeFrom="margin">
-                    <wp14:pctHeight>0</wp14:pctHeight>
-                  </wp14:sizeRelV>
-                </wp:anchor>
-              </w:drawing>
-            </mc:Choice>
-            <mc:Fallback>
-              <w:pict>
-                <v:rect w14:anchorId="3B5F9284" id="正方形/長方形 1" o:spid="_x0000_s1026" style="position:absolute;margin-left:-35.6pt;margin-top:-13.5pt;width:498.35pt;height:669.9pt;z-index:251659264;visibility:visible;mso-wrap-style:square;mso-width-percent:0;mso-height-percent:0;mso-wrap-distance-left:9pt;mso-wrap-distance-top:0;mso-wrap-distance-right:9pt;mso-wrap-distance-bottom:0;mso-position-horizontal:absolute;mso-position-horizontal-relative:text;mso-position-vertical:absolute;mso-position-vertical-relative:text;mso-width-percent:0;mso-height-percent:0;mso-width-relative:margin;mso-height-relative:margin;v-text-anchor:middle" o:gfxdata="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" fillcolor="white [3201]" strokecolor="black [3213]" strokeweight=".5pt"/>
-              </w:pict>
-            </mc:Fallback>
-          </mc:AlternateContent>
-        </w:r>
-      </w:ins>
+      <w:r>
+        <w:rPr>
+          <w:rFonts w:ascii="Century" w:eastAsia="ＭＳ 明朝" w:hAnsi="Century"/>
+          <w:noProof/>
+          <w:color w:val="000000" w:themeColor="text1"/>
+          <w:sz w:val="22"/>
+          <w:bdr w:val="single" w:sz="4" w:space="0" w:color="auto"/>
+        </w:rPr>
+        <w:lastRenderedPageBreak/>
+        <mc:AlternateContent>
+          <mc:Choice Requires="wps">
+            <w:drawing>
+              <wp:anchor distT="0" distB="0" distL="114300" distR="114300" simplePos="0" relativeHeight="251659264" behindDoc="0" locked="0" layoutInCell="1" allowOverlap="1" ns4:anchorId="2B12CD68" ns4:editId="320F51FB">
+                <wp:simplePos x="0" y="0"/>
+                <wp:positionH relativeFrom="column">
+                  <wp:posOffset>-451982</wp:posOffset>
+                </wp:positionH>
+                <wp:positionV relativeFrom="paragraph">
+                  <wp:posOffset>-171146</wp:posOffset>
+                </wp:positionV>
+                <wp:extent cx="6328907" cy="8507481"/>
+                <wp:effectExtent l="0" t="0" r="8890" b="14605"/>
+                <wp:wrapNone/>
+                <wp:docPr id="625074268" name="正方形/長方形 1"/>
+                <wp:cNvGraphicFramePr/>
+                <a:graphic>
+                  <a:graphicData uri="http://schemas.microsoft.com/office/word/2010/wordprocessingShape">
+                    <ns6:wsp>
+                      <ns6:cNvSpPr/>
+                      <ns6:spPr>
+                        <a:xfrm>
+                          <a:off x="0" y="0"/>
+                          <a:ext cx="6328907" cy="8507481"/>
+                        </a:xfrm>
+                        <a:prstGeom prst="rect">
+                          <a:avLst/>
+                        </a:prstGeom>
+                        <a:ln w="6350">
+                          <a:solidFill>
+                            <a:schemeClr val="tx1"/>
+                          </a:solidFill>
+                        </a:ln>
+                      </ns6:spPr>
+                      <ns6:style>
+                        <a:lnRef idx="2">
+                          <a:schemeClr val="accent6"/>
+                        </a:lnRef>
+                        <a:fillRef idx="1">
+                          <a:schemeClr val="lt1"/>
+                        </a:fillRef>
+                        <a:effectRef idx="0">
+                          <a:schemeClr val="accent6"/>
+                        </a:effectRef>
+                        <a:fontRef idx="minor">
+                          <a:schemeClr val="dk1"/>
+                        </a:fontRef>
+                      </ns6:style>
+                      <ns6:bodyPr rot="0" spcFirstLastPara="0" vertOverflow="overflow" horzOverflow="overflow" vert="horz" wrap="square" lIns="91440" tIns="45720" rIns="91440" bIns="45720" numCol="1" spcCol="0" rtlCol="0" fromWordArt="0" anchor="ctr" anchorCtr="0" forceAA="0" compatLnSpc="1">
+                        <a:prstTxWarp prst="textNoShape">
+                          <a:avLst/>
+                        </a:prstTxWarp>
+                        <a:noAutofit/>
+                      </ns6:bodyPr>
+                    </ns6:wsp>
+                  </a:graphicData>
+                </a:graphic>
+                <ns4:sizeRelH relativeFrom="margin">
+                  <ns4:pctWidth>0</ns4:pctWidth>
+                </ns4:sizeRelH>
+                <ns4:sizeRelV relativeFrom="margin">
+                  <ns4:pctHeight>0</ns4:pctHeight>
+                </ns4:sizeRelV>
+              </wp:anchor>
+            </w:drawing>
+          </mc:Choice>
+          <mc:Fallback>
+            <w:pict>
+              <v:rect w14:anchorId="3B5F9284" id="正方形/長方形 1" o:spid="_x0000_s1026" style="position:absolute;margin-left:-35.6pt;margin-top:-13.5pt;width:498.35pt;height:669.9pt;z-index:251659264;visibility:visible;mso-wrap-style:square;mso-width-percent:0;mso-height-percent:0;mso-wrap-distance-left:9pt;mso-wrap-distance-top:0;mso-wrap-distance-right:9pt;mso-wrap-distance-bottom:0;mso-position-horizontal:absolute;mso-position-horizontal-relative:text;mso-position-vertical:absolute;mso-position-vertical-relative:text;mso-width-percent:0;mso-height-percent:0;mso-width-relative:margin;mso-height-relative:margin;v-text-anchor:middle" o:gfxdata="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" fillcolor="white [3201]" strokecolor="black [3213]" strokeweight=".5pt"/>
+            </w:pict>
+          </mc:Fallback>
+        </mc:AlternateContent>
+      </w:r>
     </w:p>
     <w:sectPr>
       <w:headerReference w:type="default" r:id="rId7"/>
@@ -2551,7 +1974,7 @@
 </file>
 
 <file path=word/endnotes.xml><?xml version="1.0" encoding="utf-8"?>
-<w:endnotes xmlns:wpc="http://schemas.microsoft.com/office/word/2010/wordprocessingCanvas" xmlns:cx="http://schemas.microsoft.com/office/drawing/2014/chartex" xmlns:cx1="http://schemas.microsoft.com/office/drawing/2015/9/8/chartex" xmlns:cx2="http://schemas.microsoft.com/office/drawing/2015/10/21/chartex" xmlns:cx3="http://schemas.microsoft.com/office/drawing/2016/5/9/chartex" xmlns:cx4="http://schemas.microsoft.com/office/drawing/2016/5/10/chartex" xmlns:cx5="http://schemas.microsoft.com/office/drawing/2016/5/11/chartex" xmlns:cx6="http://schemas.microsoft.com/office/drawing/2016/5/12/chartex" xmlns:cx7="http://schemas.microsoft.com/office/drawing/2016/5/13/chartex" xmlns:cx8="http://schemas.microsoft.com/office/drawing/2016/5/14/chartex" xmlns:mc="http://schemas.openxmlformats.org/markup-compatibility/2006" xmlns:aink="http://schemas.microsoft.com/office/drawing/2016/ink" xmlns:am3d="http://schemas.microsoft.com/office/drawing/2017/model3d" xmlns:o="urn:schemas-microsoft-com:office:office" xmlns:oel="http://schemas.microsoft.com/office/2019/extlst" xmlns:r="http://schemas.openxmlformats.org/officeDocument/2006/relationships" xmlns:m="http://schemas.openxmlformats.org/officeDocument/2006/math" xmlns:v="urn:schemas-microsoft-com:vml" xmlns:wp14="http://schemas.microsoft.com/office/word/2010/wordprocessingDrawing" xmlns:wp="http://schemas.openxmlformats.org/drawingml/2006/wordprocessingDrawing" xmlns:w10="urn:schemas-microsoft-com:office:word" xmlns:w="http://schemas.openxmlformats.org/wordprocessingml/2006/main" xmlns:w14="http://schemas.microsoft.com/office/word/2010/wordml" xmlns:w15="http://schemas.microsoft.com/office/word/2012/wordml" xmlns:w16cex="http://schemas.microsoft.com/office/word/2018/wordml/cex" xmlns:w16cid="http://schemas.microsoft.com/office/word/2016/wordml/cid" xmlns:w16="http://schemas.microsoft.com/office/word/2018/wordml" xmlns:w16du="http://schemas.microsoft.com/office/word/2023/wordml/word16du" xmlns:w16sdtdh="http://schemas.microsoft.com/office/word/2020/wordml/sdtdatahash" xmlns:w16sdtfl="http://schemas.microsoft.com/office/word/2024/wordml/sdtformatlock" xmlns:w16se="http://schemas.microsoft.com/office/word/2015/wordml/symex" xmlns:wpg="http://schemas.microsoft.com/office/word/2010/wordprocessingGroup" xmlns:wpi="http://schemas.microsoft.com/office/word/2010/wordprocessingInk" xmlns:wne="http://schemas.microsoft.com/office/word/2006/wordml" xmlns:wps="http://schemas.microsoft.com/office/word/2010/wordprocessingShape" mc:Ignorable="w14 w15 w16se w16cid w16 w16cex w16sdtdh w16sdtfl w16du wp14">
+<w:endnotes xmlns:mc="http://schemas.openxmlformats.org/markup-compatibility/2006" xmlns:w="http://schemas.openxmlformats.org/wordprocessingml/2006/main" xmlns:w14="http://schemas.microsoft.com/office/word/2010/wordml" mc:Ignorable="w14 w15 w16se w16cid w16 w16cex w16sdtdh w16sdtfl w16du wp14">
   <w:endnote w:type="separator" w:id="-1">
     <w:p>
       <w:r>
@@ -2570,7 +1993,7 @@
 </file>
 
 <file path=word/footer1.xml><?xml version="1.0" encoding="utf-8"?>
-<w:ftr xmlns:wpc="http://schemas.microsoft.com/office/word/2010/wordprocessingCanvas" xmlns:cx="http://schemas.microsoft.com/office/drawing/2014/chartex" xmlns:cx1="http://schemas.microsoft.com/office/drawing/2015/9/8/chartex" xmlns:cx2="http://schemas.microsoft.com/office/drawing/2015/10/21/chartex" xmlns:cx3="http://schemas.microsoft.com/office/drawing/2016/5/9/chartex" xmlns:cx4="http://schemas.microsoft.com/office/drawing/2016/5/10/chartex" xmlns:cx5="http://schemas.microsoft.com/office/drawing/2016/5/11/chartex" xmlns:cx6="http://schemas.microsoft.com/office/drawing/2016/5/12/chartex" xmlns:cx7="http://schemas.microsoft.com/office/drawing/2016/5/13/chartex" xmlns:cx8="http://schemas.microsoft.com/office/drawing/2016/5/14/chartex" xmlns:mc="http://schemas.openxmlformats.org/markup-compatibility/2006" xmlns:aink="http://schemas.microsoft.com/office/drawing/2016/ink" xmlns:am3d="http://schemas.microsoft.com/office/drawing/2017/model3d" xmlns:o="urn:schemas-microsoft-com:office:office" xmlns:oel="http://schemas.microsoft.com/office/2019/extlst" xmlns:r="http://schemas.openxmlformats.org/officeDocument/2006/relationships" xmlns:m="http://schemas.openxmlformats.org/officeDocument/2006/math" xmlns:v="urn:schemas-microsoft-com:vml" xmlns:wp14="http://schemas.microsoft.com/office/word/2010/wordprocessingDrawing" xmlns:wp="http://schemas.openxmlformats.org/drawingml/2006/wordprocessingDrawing" xmlns:w10="urn:schemas-microsoft-com:office:word" xmlns:w="http://schemas.openxmlformats.org/wordprocessingml/2006/main" xmlns:w14="http://schemas.microsoft.com/office/word/2010/wordml" xmlns:w15="http://schemas.microsoft.com/office/word/2012/wordml" xmlns:w16cex="http://schemas.microsoft.com/office/word/2018/wordml/cex" xmlns:w16cid="http://schemas.microsoft.com/office/word/2016/wordml/cid" xmlns:w16="http://schemas.microsoft.com/office/word/2018/wordml" xmlns:w16du="http://schemas.microsoft.com/office/word/2023/wordml/word16du" xmlns:w16sdtdh="http://schemas.microsoft.com/office/word/2020/wordml/sdtdatahash" xmlns:w16sdtfl="http://schemas.microsoft.com/office/word/2024/wordml/sdtformatlock" xmlns:w16se="http://schemas.microsoft.com/office/word/2015/wordml/symex" xmlns:wpg="http://schemas.microsoft.com/office/word/2010/wordprocessingGroup" xmlns:wpi="http://schemas.microsoft.com/office/word/2010/wordprocessingInk" xmlns:wne="http://schemas.microsoft.com/office/word/2006/wordml" xmlns:wps="http://schemas.microsoft.com/office/word/2010/wordprocessingShape" mc:Ignorable="w14 w15 w16se w16cid w16 w16cex w16sdtdh w16sdtfl w16du wp14">
+<w:ftr xmlns:mc="http://schemas.openxmlformats.org/markup-compatibility/2006" xmlns:w="http://schemas.openxmlformats.org/wordprocessingml/2006/main" xmlns:w14="http://schemas.microsoft.com/office/word/2010/wordml" mc:Ignorable="w14 w15 w16se w16cid w16 w16cex w16sdtdh w16sdtfl w16du wp14">
   <w:sdt>
     <w:sdtPr>
       <w:id w:val="356314425"/>
@@ -2616,7 +2039,7 @@
 </file>
 
 <file path=word/footnotes.xml><?xml version="1.0" encoding="utf-8"?>
-<w:footnotes xmlns:wpc="http://schemas.microsoft.com/office/word/2010/wordprocessingCanvas" xmlns:cx="http://schemas.microsoft.com/office/drawing/2014/chartex" xmlns:cx1="http://schemas.microsoft.com/office/drawing/2015/9/8/chartex" xmlns:cx2="http://schemas.microsoft.com/office/drawing/2015/10/21/chartex" xmlns:cx3="http://schemas.microsoft.com/office/drawing/2016/5/9/chartex" xmlns:cx4="http://schemas.microsoft.com/office/drawing/2016/5/10/chartex" xmlns:cx5="http://schemas.microsoft.com/office/drawing/2016/5/11/chartex" xmlns:cx6="http://schemas.microsoft.com/office/drawing/2016/5/12/chartex" xmlns:cx7="http://schemas.microsoft.com/office/drawing/2016/5/13/chartex" xmlns:cx8="http://schemas.microsoft.com/office/drawing/2016/5/14/chartex" xmlns:mc="http://schemas.openxmlformats.org/markup-compatibility/2006" xmlns:aink="http://schemas.microsoft.com/office/drawing/2016/ink" xmlns:am3d="http://schemas.microsoft.com/office/drawing/2017/model3d" xmlns:o="urn:schemas-microsoft-com:office:office" xmlns:oel="http://schemas.microsoft.com/office/2019/extlst" xmlns:r="http://schemas.openxmlformats.org/officeDocument/2006/relationships" xmlns:m="http://schemas.openxmlformats.org/officeDocument/2006/math" xmlns:v="urn:schemas-microsoft-com:vml" xmlns:wp14="http://schemas.microsoft.com/office/word/2010/wordprocessingDrawing" xmlns:wp="http://schemas.openxmlformats.org/drawingml/2006/wordprocessingDrawing" xmlns:w10="urn:schemas-microsoft-com:office:word" xmlns:w="http://schemas.openxmlformats.org/wordprocessingml/2006/main" xmlns:w14="http://schemas.microsoft.com/office/word/2010/wordml" xmlns:w15="http://schemas.microsoft.com/office/word/2012/wordml" xmlns:w16cex="http://schemas.microsoft.com/office/word/2018/wordml/cex" xmlns:w16cid="http://schemas.microsoft.com/office/word/2016/wordml/cid" xmlns:w16="http://schemas.microsoft.com/office/word/2018/wordml" xmlns:w16du="http://schemas.microsoft.com/office/word/2023/wordml/word16du" xmlns:w16sdtdh="http://schemas.microsoft.com/office/word/2020/wordml/sdtdatahash" xmlns:w16sdtfl="http://schemas.microsoft.com/office/word/2024/wordml/sdtformatlock" xmlns:w16se="http://schemas.microsoft.com/office/word/2015/wordml/symex" xmlns:wpg="http://schemas.microsoft.com/office/word/2010/wordprocessingGroup" xmlns:wpi="http://schemas.microsoft.com/office/word/2010/wordprocessingInk" xmlns:wne="http://schemas.microsoft.com/office/word/2006/wordml" xmlns:wps="http://schemas.microsoft.com/office/word/2010/wordprocessingShape" mc:Ignorable="w14 w15 w16se w16cid w16 w16cex w16sdtdh w16sdtfl w16du wp14">
+<w:footnotes xmlns:mc="http://schemas.openxmlformats.org/markup-compatibility/2006" xmlns:w="http://schemas.openxmlformats.org/wordprocessingml/2006/main" xmlns:w14="http://schemas.microsoft.com/office/word/2010/wordml" mc:Ignorable="w14 w15 w16se w16cid w16 w16cex w16sdtdh w16sdtfl w16du wp14">
   <w:footnote w:type="separator" w:id="-1">
     <w:p>
       <w:r>
@@ -2635,7 +2058,7 @@
 </file>
 
 <file path=word/header1.xml><?xml version="1.0" encoding="utf-8"?>
-<w:hdr xmlns:wpc="http://schemas.microsoft.com/office/word/2010/wordprocessingCanvas" xmlns:cx="http://schemas.microsoft.com/office/drawing/2014/chartex" xmlns:cx1="http://schemas.microsoft.com/office/drawing/2015/9/8/chartex" xmlns:cx2="http://schemas.microsoft.com/office/drawing/2015/10/21/chartex" xmlns:cx3="http://schemas.microsoft.com/office/drawing/2016/5/9/chartex" xmlns:cx4="http://schemas.microsoft.com/office/drawing/2016/5/10/chartex" xmlns:cx5="http://schemas.microsoft.com/office/drawing/2016/5/11/chartex" xmlns:cx6="http://schemas.microsoft.com/office/drawing/2016/5/12/chartex" xmlns:cx7="http://schemas.microsoft.com/office/drawing/2016/5/13/chartex" xmlns:cx8="http://schemas.microsoft.com/office/drawing/2016/5/14/chartex" xmlns:mc="http://schemas.openxmlformats.org/markup-compatibility/2006" xmlns:aink="http://schemas.microsoft.com/office/drawing/2016/ink" xmlns:am3d="http://schemas.microsoft.com/office/drawing/2017/model3d" xmlns:o="urn:schemas-microsoft-com:office:office" xmlns:oel="http://schemas.microsoft.com/office/2019/extlst" xmlns:r="http://schemas.openxmlformats.org/officeDocument/2006/relationships" xmlns:m="http://schemas.openxmlformats.org/officeDocument/2006/math" xmlns:v="urn:schemas-microsoft-com:vml" xmlns:wp14="http://schemas.microsoft.com/office/word/2010/wordprocessingDrawing" xmlns:wp="http://schemas.openxmlformats.org/drawingml/2006/wordprocessingDrawing" xmlns:w10="urn:schemas-microsoft-com:office:word" xmlns:w="http://schemas.openxmlformats.org/wordprocessingml/2006/main" xmlns:w14="http://schemas.microsoft.com/office/word/2010/wordml" xmlns:w15="http://schemas.microsoft.com/office/word/2012/wordml" xmlns:w16cex="http://schemas.microsoft.com/office/word/2018/wordml/cex" xmlns:w16cid="http://schemas.microsoft.com/office/word/2016/wordml/cid" xmlns:w16="http://schemas.microsoft.com/office/word/2018/wordml" xmlns:w16du="http://schemas.microsoft.com/office/word/2023/wordml/word16du" xmlns:w16sdtdh="http://schemas.microsoft.com/office/word/2020/wordml/sdtdatahash" xmlns:w16sdtfl="http://schemas.microsoft.com/office/word/2024/wordml/sdtformatlock" xmlns:w16se="http://schemas.microsoft.com/office/word/2015/wordml/symex" xmlns:wpg="http://schemas.microsoft.com/office/word/2010/wordprocessingGroup" xmlns:wpi="http://schemas.microsoft.com/office/word/2010/wordprocessingInk" xmlns:wne="http://schemas.microsoft.com/office/word/2006/wordml" xmlns:wps="http://schemas.microsoft.com/office/word/2010/wordprocessingShape" mc:Ignorable="w14 w15 w16se w16cid w16 w16cex w16sdtdh w16sdtfl w16du wp14">
+<w:hdr xmlns:mc="http://schemas.openxmlformats.org/markup-compatibility/2006" xmlns:w="http://schemas.openxmlformats.org/wordprocessingml/2006/main" xmlns:w14="http://schemas.microsoft.com/office/word/2010/wordml" mc:Ignorable="w14 w15 w16se w16cid w16 w16cex w16sdtdh w16sdtfl w16du wp14">
   <w:tbl>
     <w:tblPr>
       <w:tblStyle w:val="a3"/>
@@ -2721,7 +2144,7 @@
 </file>
 
 <file path=word/numbering.xml><?xml version="1.0" encoding="utf-8"?>
-<w:numbering xmlns:wpc="http://schemas.microsoft.com/office/word/2010/wordprocessingCanvas" xmlns:cx="http://schemas.microsoft.com/office/drawing/2014/chartex" xmlns:cx1="http://schemas.microsoft.com/office/drawing/2015/9/8/chartex" xmlns:cx2="http://schemas.microsoft.com/office/drawing/2015/10/21/chartex" xmlns:cx3="http://schemas.microsoft.com/office/drawing/2016/5/9/chartex" xmlns:cx4="http://schemas.microsoft.com/office/drawing/2016/5/10/chartex" xmlns:cx5="http://schemas.microsoft.com/office/drawing/2016/5/11/chartex" xmlns:cx6="http://schemas.microsoft.com/office/drawing/2016/5/12/chartex" xmlns:cx7="http://schemas.microsoft.com/office/drawing/2016/5/13/chartex" xmlns:cx8="http://schemas.microsoft.com/office/drawing/2016/5/14/chartex" xmlns:mc="http://schemas.openxmlformats.org/markup-compatibility/2006" xmlns:aink="http://schemas.microsoft.com/office/drawing/2016/ink" xmlns:am3d="http://schemas.microsoft.com/office/drawing/2017/model3d" xmlns:o="urn:schemas-microsoft-com:office:office" xmlns:oel="http://schemas.microsoft.com/office/2019/extlst" xmlns:r="http://schemas.openxmlformats.org/officeDocument/2006/relationships" xmlns:m="http://schemas.openxmlformats.org/officeDocument/2006/math" xmlns:v="urn:schemas-microsoft-com:vml" xmlns:wp14="http://schemas.microsoft.com/office/word/2010/wordprocessingDrawing" xmlns:wp="http://schemas.openxmlformats.org/drawingml/2006/wordprocessingDrawing" xmlns:w10="urn:schemas-microsoft-com:office:word" xmlns:w="http://schemas.openxmlformats.org/wordprocessingml/2006/main" xmlns:w14="http://schemas.microsoft.com/office/word/2010/wordml" xmlns:w15="http://schemas.microsoft.com/office/word/2012/wordml" xmlns:w16cex="http://schemas.microsoft.com/office/word/2018/wordml/cex" xmlns:w16cid="http://schemas.microsoft.com/office/word/2016/wordml/cid" xmlns:w16="http://schemas.microsoft.com/office/word/2018/wordml" xmlns:w16du="http://schemas.microsoft.com/office/word/2023/wordml/word16du" xmlns:w16sdtdh="http://schemas.microsoft.com/office/word/2020/wordml/sdtdatahash" xmlns:w16sdtfl="http://schemas.microsoft.com/office/word/2024/wordml/sdtformatlock" xmlns:w16se="http://schemas.microsoft.com/office/word/2015/wordml/symex" xmlns:wpg="http://schemas.microsoft.com/office/word/2010/wordprocessingGroup" xmlns:wpi="http://schemas.microsoft.com/office/word/2010/wordprocessingInk" xmlns:wne="http://schemas.microsoft.com/office/word/2006/wordml" xmlns:wps="http://schemas.microsoft.com/office/word/2010/wordprocessingShape" mc:Ignorable="w14 w15 w16se w16cid w16 w16cex w16sdtdh w16sdtfl w16du wp14">
+<w:numbering xmlns:mc="http://schemas.openxmlformats.org/markup-compatibility/2006" xmlns:w="http://schemas.openxmlformats.org/wordprocessingml/2006/main" xmlns:w15="http://schemas.microsoft.com/office/word/2012/wordml" xmlns:w16cid="http://schemas.microsoft.com/office/word/2016/wordml/cid" mc:Ignorable="w14 w15 w16se w16cid w16 w16cex w16sdtdh w16sdtfl w16du wp14">
   <w:abstractNum w:abstractNumId="0" w15:restartNumberingAfterBreak="0">
     <w:nsid w:val="01EE3AAF"/>
     <w:multiLevelType w:val="hybridMultilevel"/>
@@ -3366,7 +2789,7 @@
 </file>
 
 <file path=word/people.xml><?xml version="1.0" encoding="utf-8"?>
-<w15:people xmlns:wpc="http://schemas.microsoft.com/office/word/2010/wordprocessingCanvas" xmlns:cx="http://schemas.microsoft.com/office/drawing/2014/chartex" xmlns:cx1="http://schemas.microsoft.com/office/drawing/2015/9/8/chartex" xmlns:cx2="http://schemas.microsoft.com/office/drawing/2015/10/21/chartex" xmlns:cx3="http://schemas.microsoft.com/office/drawing/2016/5/9/chartex" xmlns:cx4="http://schemas.microsoft.com/office/drawing/2016/5/10/chartex" xmlns:cx5="http://schemas.microsoft.com/office/drawing/2016/5/11/chartex" xmlns:cx6="http://schemas.microsoft.com/office/drawing/2016/5/12/chartex" xmlns:cx7="http://schemas.microsoft.com/office/drawing/2016/5/13/chartex" xmlns:cx8="http://schemas.microsoft.com/office/drawing/2016/5/14/chartex" xmlns:mc="http://schemas.openxmlformats.org/markup-compatibility/2006" xmlns:aink="http://schemas.microsoft.com/office/drawing/2016/ink" xmlns:am3d="http://schemas.microsoft.com/office/drawing/2017/model3d" xmlns:o="urn:schemas-microsoft-com:office:office" xmlns:oel="http://schemas.microsoft.com/office/2019/extlst" xmlns:r="http://schemas.openxmlformats.org/officeDocument/2006/relationships" xmlns:m="http://schemas.openxmlformats.org/officeDocument/2006/math" xmlns:v="urn:schemas-microsoft-com:vml" xmlns:wp14="http://schemas.microsoft.com/office/word/2010/wordprocessingDrawing" xmlns:wp="http://schemas.openxmlformats.org/drawingml/2006/wordprocessingDrawing" xmlns:w10="urn:schemas-microsoft-com:office:word" xmlns:w="http://schemas.openxmlformats.org/wordprocessingml/2006/main" xmlns:w14="http://schemas.microsoft.com/office/word/2010/wordml" xmlns:w15="http://schemas.microsoft.com/office/word/2012/wordml" xmlns:w16cex="http://schemas.microsoft.com/office/word/2018/wordml/cex" xmlns:w16cid="http://schemas.microsoft.com/office/word/2016/wordml/cid" xmlns:w16="http://schemas.microsoft.com/office/word/2018/wordml" xmlns:w16du="http://schemas.microsoft.com/office/word/2023/wordml/word16du" xmlns:w16sdtdh="http://schemas.microsoft.com/office/word/2020/wordml/sdtdatahash" xmlns:w16sdtfl="http://schemas.microsoft.com/office/word/2024/wordml/sdtformatlock" xmlns:w16se="http://schemas.microsoft.com/office/word/2015/wordml/symex" xmlns:wpg="http://schemas.microsoft.com/office/word/2010/wordprocessingGroup" xmlns:wpi="http://schemas.microsoft.com/office/word/2010/wordprocessingInk" xmlns:wne="http://schemas.microsoft.com/office/word/2006/wordml" xmlns:wps="http://schemas.microsoft.com/office/word/2010/wordprocessingShape" mc:Ignorable="w14 w15 w16se w16cid w16 w16cex w16sdtdh w16sdtfl w16du wp14">
+<w15:people xmlns:mc="http://schemas.openxmlformats.org/markup-compatibility/2006" xmlns:w15="http://schemas.microsoft.com/office/word/2012/wordml" mc:Ignorable="w14 w15 w16se w16cid w16 w16cex w16sdtdh w16sdtfl w16du wp14">
   <w15:person w15:author="s s">
     <w15:presenceInfo w15:providerId="Windows Live" w15:userId="6bd97d7f750e84bb"/>
   </w15:person>
@@ -3377,7 +2800,7 @@
 </file>
 
 <file path=word/styles.xml><?xml version="1.0" encoding="utf-8"?>
-<w:styles xmlns:mc="http://schemas.openxmlformats.org/markup-compatibility/2006" xmlns:r="http://schemas.openxmlformats.org/officeDocument/2006/relationships" xmlns:w="http://schemas.openxmlformats.org/wordprocessingml/2006/main" xmlns:w14="http://schemas.microsoft.com/office/word/2010/wordml" xmlns:w15="http://schemas.microsoft.com/office/word/2012/wordml" xmlns:w16cex="http://schemas.microsoft.com/office/word/2018/wordml/cex" xmlns:w16cid="http://schemas.microsoft.com/office/word/2016/wordml/cid" xmlns:w16="http://schemas.microsoft.com/office/word/2018/wordml" xmlns:w16du="http://schemas.microsoft.com/office/word/2023/wordml/word16du" xmlns:w16sdtdh="http://schemas.microsoft.com/office/word/2020/wordml/sdtdatahash" xmlns:w16sdtfl="http://schemas.microsoft.com/office/word/2024/wordml/sdtformatlock" xmlns:w16se="http://schemas.microsoft.com/office/word/2015/wordml/symex" mc:Ignorable="w14 w15 w16se w16cid w16 w16cex w16sdtdh w16sdtfl w16du">
+<w:styles xmlns:mc="http://schemas.openxmlformats.org/markup-compatibility/2006" xmlns:w="http://schemas.openxmlformats.org/wordprocessingml/2006/main" mc:Ignorable="w14 w15 w16se w16cid w16 w16cex w16sdtdh w16sdtfl w16du">
   <w:docDefaults>
     <w:rPrDefault>
       <w:rPr>
@@ -4052,7 +3475,7 @@
 </file>
 
 <file path=word/theme/theme1.xml><?xml version="1.0" encoding="utf-8"?>
-<a:theme xmlns:a="http://schemas.openxmlformats.org/drawingml/2006/main" name="Office テーマ">
+<a:theme xmlns:a="http://schemas.openxmlformats.org/drawingml/2006/main" xmlns:ns1="http://schemas.microsoft.com/office/thememl/2012/main" name="Office テーマ">
   <a:themeElements>
     <a:clrScheme name="Office">
       <a:dk1>
@@ -4340,7 +3763,7 @@
   <a:extraClrSchemeLst/>
   <a:extLst>
     <a:ext uri="{05A4C25C-085E-4340-85A3-A5531E510DB2}">
-      <thm15:themeFamily xmlns:thm15="http://schemas.microsoft.com/office/thememl/2012/main" name="Office Theme" id="{62F939B6-93AF-4DB8-9C6B-D6C7DFDC589F}" vid="{4A3C46E8-61CC-4603-A589-7422A47A8E4A}"/>
+      <ns1:themeFamily name="Office Theme" id="{62F939B6-93AF-4DB8-9C6B-D6C7DFDC589F}" vid="{4A3C46E8-61CC-4603-A589-7422A47A8E4A}"/>
     </a:ext>
   </a:extLst>
 </a:theme>

</xml_diff>

<commit_message>
Update repaired base course survey form
</commit_message>
<xml_diff>
--- a/downloads/2026_V-LEAD_kiso-chousahyo.docx
+++ b/downloads/2026_V-LEAD_kiso-chousahyo.docx
@@ -1,6 +1,6 @@
 
 <file path=word/document.xml><?xml version="1.0" encoding="utf-8"?>
-<w:document xmlns:a="http://schemas.openxmlformats.org/drawingml/2006/main" xmlns:mc="http://schemas.openxmlformats.org/markup-compatibility/2006" xmlns:ns4="http://schemas.microsoft.com/office/word/2010/wordprocessingDrawing" xmlns:ns6="http://schemas.microsoft.com/office/word/2010/wordprocessingShape" xmlns:o="urn:schemas-microsoft-com:office:office" xmlns:r="http://schemas.openxmlformats.org/officeDocument/2006/relationships" xmlns:v="urn:schemas-microsoft-com:vml" xmlns:w="http://schemas.openxmlformats.org/wordprocessingml/2006/main" xmlns:w14="http://schemas.microsoft.com/office/word/2010/wordml" xmlns:wp="http://schemas.openxmlformats.org/drawingml/2006/wordprocessingDrawing" xmlns:w15="http://schemas.microsoft.com/office/word/2012/wordml" xmlns:w16se="http://schemas.microsoft.com/office/word/2015/wordml/symex" xmlns:w16cid="http://schemas.microsoft.com/office/word/2016/wordml/cid" xmlns:w16="http://schemas.microsoft.com/office/word/2018/wordml" xmlns:w16cex="http://schemas.microsoft.com/office/word/2018/wordml/cex" xmlns:w16sdtdh="http://schemas.microsoft.com/office/word/2020/wordml/sdtdatahash" xmlns:w16sdtfl="http://schemas.microsoft.com/office/word/2024/wordml/sdtformatlock" xmlns:w16du="http://schemas.microsoft.com/office/word/2023/wordml/word16du" xmlns:wp14="http://schemas.microsoft.com/office/word/2010/wordprocessingDrawing" mc:Ignorable="w14 w15 w16se w16cid w16 w16cex w16sdtdh w16sdtfl w16du wp14">
+<w:document xmlns:wpc="http://schemas.microsoft.com/office/word/2010/wordprocessingCanvas" xmlns:cx="http://schemas.microsoft.com/office/drawing/2014/chartex" xmlns:cx1="http://schemas.microsoft.com/office/drawing/2015/9/8/chartex" xmlns:cx2="http://schemas.microsoft.com/office/drawing/2015/10/21/chartex" xmlns:cx3="http://schemas.microsoft.com/office/drawing/2016/5/9/chartex" xmlns:cx4="http://schemas.microsoft.com/office/drawing/2016/5/10/chartex" xmlns:cx5="http://schemas.microsoft.com/office/drawing/2016/5/11/chartex" xmlns:cx6="http://schemas.microsoft.com/office/drawing/2016/5/12/chartex" xmlns:cx7="http://schemas.microsoft.com/office/drawing/2016/5/13/chartex" xmlns:cx8="http://schemas.microsoft.com/office/drawing/2016/5/14/chartex" xmlns:mc="http://schemas.openxmlformats.org/markup-compatibility/2006" xmlns:aink="http://schemas.microsoft.com/office/drawing/2016/ink" xmlns:am3d="http://schemas.microsoft.com/office/drawing/2017/model3d" xmlns:o="urn:schemas-microsoft-com:office:office" xmlns:oel="http://schemas.microsoft.com/office/2019/extlst" xmlns:r="http://schemas.openxmlformats.org/officeDocument/2006/relationships" xmlns:m="http://schemas.openxmlformats.org/officeDocument/2006/math" xmlns:v="urn:schemas-microsoft-com:vml" xmlns:wp14="http://schemas.microsoft.com/office/word/2010/wordprocessingDrawing" xmlns:wp="http://schemas.openxmlformats.org/drawingml/2006/wordprocessingDrawing" xmlns:w10="urn:schemas-microsoft-com:office:word" xmlns:w="http://schemas.openxmlformats.org/wordprocessingml/2006/main" xmlns:w14="http://schemas.microsoft.com/office/word/2010/wordml" xmlns:w15="http://schemas.microsoft.com/office/word/2012/wordml" xmlns:w16cex="http://schemas.microsoft.com/office/word/2018/wordml/cex" xmlns:w16cid="http://schemas.microsoft.com/office/word/2016/wordml/cid" xmlns:w16="http://schemas.microsoft.com/office/word/2018/wordml" xmlns:w16du="http://schemas.microsoft.com/office/word/2023/wordml/word16du" xmlns:w16sdtdh="http://schemas.microsoft.com/office/word/2020/wordml/sdtdatahash" xmlns:w16sdtfl="http://schemas.microsoft.com/office/word/2024/wordml/sdtformatlock" xmlns:w16se="http://schemas.microsoft.com/office/word/2015/wordml/symex" xmlns:wpg="http://schemas.microsoft.com/office/word/2010/wordprocessingGroup" xmlns:wpi="http://schemas.microsoft.com/office/word/2010/wordprocessingInk" xmlns:wne="http://schemas.microsoft.com/office/word/2006/wordml" xmlns:wps="http://schemas.microsoft.com/office/word/2010/wordprocessingShape" mc:Ignorable="w14 w15 w16se w16cid w16 w16cex w16sdtdh w16sdtfl w16du wp14">
   <w:body>
     <w:p>
       <w:pPr>
@@ -29,7 +29,7 @@
           <w:szCs w:val="28"/>
         </w:rPr>
       </w:pPr>
-      <w:bookmarkStart w:id="1" w:name="_Hlk495997791"/>
+      <w:bookmarkStart w:id="0" w:name="_Hlk495997791"/>
       <w:r>
         <w:rPr>
           <w:rFonts w:ascii="Century" w:eastAsia="ＭＳ 明朝" w:hAnsi="Century" w:hint="eastAsia"/>
@@ -65,17 +65,7 @@
         </w:rPr>
         <w:t>（基礎・応用コース）</w:t>
       </w:r>
-      <w:bookmarkEnd w:id="1"/>
-    </w:p>
-    <w:p>
-      <w:pPr>
-        <w:spacing w:line="324" w:lineRule="auto"/>
-        <w:jc w:val="center"/>
-        <w:rPr>
-          <w:rFonts w:ascii="Century" w:eastAsia="ＭＳ 明朝" w:hAnsi="Century"/>
-          <w:sz w:val="22"/>
-        </w:rPr>
-      </w:pPr>
+      <w:bookmarkEnd w:id="0"/>
     </w:p>
     <w:p>
       <w:pPr>
@@ -533,6 +523,7 @@
       <w:pPr>
         <w:snapToGrid w:val="0"/>
         <w:spacing w:line="324" w:lineRule="auto"/>
+        <w:ind w:leftChars="86" w:left="181"/>
         <w:rPr>
           <w:rFonts w:ascii="Century" w:eastAsia="ＭＳ 明朝" w:hAnsi="Century"/>
           <w:sz w:val="22"/>
@@ -543,6 +534,7 @@
       <w:pPr>
         <w:snapToGrid w:val="0"/>
         <w:spacing w:line="324" w:lineRule="auto"/>
+        <w:ind w:leftChars="86" w:left="181"/>
         <w:rPr>
           <w:rFonts w:ascii="Century" w:eastAsia="ＭＳ 明朝" w:hAnsi="Century"/>
           <w:sz w:val="22"/>
@@ -651,7 +643,7 @@
       <w:pPr>
         <w:snapToGrid w:val="0"/>
         <w:spacing w:line="324" w:lineRule="auto"/>
-        <w:ind w:left="220" w:hangingChars="100" w:hanging="220"/>
+        <w:ind w:leftChars="86" w:left="401" w:hangingChars="100" w:hanging="220"/>
         <w:rPr>
           <w:rFonts w:ascii="Century" w:eastAsia="ＭＳ 明朝" w:hAnsi="Century"/>
           <w:sz w:val="22"/>
@@ -732,7 +724,7 @@
       <w:pPr>
         <w:snapToGrid w:val="0"/>
         <w:spacing w:line="324" w:lineRule="auto"/>
-        <w:ind w:left="220" w:hangingChars="100" w:hanging="220"/>
+        <w:ind w:leftChars="86" w:left="401" w:hangingChars="100" w:hanging="220"/>
         <w:rPr>
           <w:rFonts w:ascii="Century" w:eastAsia="ＭＳ 明朝" w:hAnsi="Century"/>
           <w:sz w:val="22"/>
@@ -813,14 +805,7 @@
           <w:rFonts w:ascii="Century" w:eastAsia="ＭＳ 明朝" w:hAnsi="Century" w:hint="eastAsia"/>
           <w:sz w:val="22"/>
         </w:rPr>
-        <w:t>て</w:t>
-      </w:r>
-      <w:r>
-        <w:rPr>
-          <w:rFonts w:ascii="Century" w:eastAsia="ＭＳ 明朝" w:hAnsi="Century" w:hint="eastAsia"/>
-          <w:sz w:val="22"/>
-        </w:rPr>
-        <w:t>いません（</w:t>
+        <w:t>ていません（</w:t>
       </w:r>
       <w:r>
         <w:rPr>
@@ -841,7 +826,7 @@
       <w:pPr>
         <w:snapToGrid w:val="0"/>
         <w:spacing w:line="324" w:lineRule="auto"/>
-        <w:ind w:left="220" w:hangingChars="100" w:hanging="220"/>
+        <w:ind w:leftChars="86" w:left="401" w:hangingChars="100" w:hanging="220"/>
         <w:rPr>
           <w:rFonts w:ascii="Century" w:eastAsia="ＭＳ 明朝" w:hAnsi="Century"/>
           <w:szCs w:val="21"/>
@@ -914,7 +899,7 @@
     <w:p>
       <w:pPr>
         <w:snapToGrid w:val="0"/>
-        <w:spacing w:beforeLines="50" w:before="180" w:line="324" w:lineRule="auto"/>
+        <w:spacing w:line="324" w:lineRule="auto"/>
         <w:rPr>
           <w:rFonts w:ascii="Century" w:eastAsia="ＭＳ 明朝" w:hAnsi="Century"/>
           <w:sz w:val="22"/>
@@ -930,6 +915,76 @@
           <w:sz w:val="22"/>
         </w:rPr>
       </w:pPr>
+      <w:r>
+        <w:rPr>
+          <w:rFonts w:ascii="Century" w:eastAsia="ＭＳ 明朝" w:hAnsi="Century" w:hint="eastAsia"/>
+          <w:sz w:val="22"/>
+        </w:rPr>
+        <w:t>2</w:t>
+      </w:r>
+      <w:r>
+        <w:rPr>
+          <w:rFonts w:ascii="Century" w:eastAsia="ＭＳ 明朝" w:hAnsi="Century" w:hint="eastAsia"/>
+          <w:sz w:val="22"/>
+        </w:rPr>
+        <w:t>～</w:t>
+      </w:r>
+      <w:r>
+        <w:rPr>
+          <w:rFonts w:ascii="Century" w:eastAsia="ＭＳ 明朝" w:hAnsi="Century" w:hint="eastAsia"/>
+          <w:sz w:val="22"/>
+        </w:rPr>
+        <w:t>4</w:t>
+      </w:r>
+      <w:r>
+        <w:rPr>
+          <w:rFonts w:ascii="Century" w:eastAsia="ＭＳ 明朝" w:hAnsi="Century" w:hint="eastAsia"/>
+          <w:sz w:val="22"/>
+        </w:rPr>
+        <w:t>ページにある</w:t>
+      </w:r>
+      <w:r>
+        <w:rPr>
+          <w:rFonts w:ascii="Century" w:eastAsia="ＭＳ 明朝" w:hAnsi="Century" w:hint="eastAsia"/>
+          <w:sz w:val="22"/>
+        </w:rPr>
+        <w:t>1</w:t>
+      </w:r>
+      <w:r>
+        <w:rPr>
+          <w:rFonts w:ascii="Century" w:eastAsia="ＭＳ 明朝" w:hAnsi="Century" w:hint="eastAsia"/>
+          <w:sz w:val="22"/>
+        </w:rPr>
+        <w:t>－</w:t>
+      </w:r>
+      <w:r>
+        <w:rPr>
+          <w:rFonts w:ascii="Century" w:eastAsia="ＭＳ 明朝" w:hAnsi="Century" w:hint="eastAsia"/>
+          <w:sz w:val="22"/>
+        </w:rPr>
+        <w:t>5</w:t>
+      </w:r>
+      <w:r>
+        <w:rPr>
+          <w:rFonts w:ascii="Century" w:eastAsia="ＭＳ 明朝" w:hAnsi="Century" w:hint="eastAsia"/>
+          <w:sz w:val="22"/>
+        </w:rPr>
+        <w:t>の質問に回答してくださ</w:t>
+      </w:r>
+      <w:r>
+        <w:rPr>
+          <w:rFonts w:ascii="Century" w:eastAsia="ＭＳ 明朝" w:hAnsi="Century" w:hint="eastAsia"/>
+          <w:sz w:val="22"/>
+        </w:rPr>
+        <w:t>い</w:t>
+      </w:r>
+      <w:r>
+        <w:rPr>
+          <w:rFonts w:ascii="Century" w:eastAsia="ＭＳ 明朝" w:hAnsi="Century" w:hint="eastAsia"/>
+          <w:sz w:val="22"/>
+        </w:rPr>
+        <w:t>。受講生選抜の際の審査資料となりますので、本プログラムの趣旨をよく理解し、記述してください。</w:t>
+      </w:r>
     </w:p>
     <w:p>
       <w:pPr>
@@ -940,96 +995,6 @@
           <w:sz w:val="22"/>
         </w:rPr>
       </w:pPr>
-    </w:p>
-    <w:p>
-      <w:pPr>
-        <w:snapToGrid w:val="0"/>
-        <w:spacing w:line="324" w:lineRule="auto"/>
-        <w:rPr>
-          <w:rFonts w:ascii="Century" w:eastAsia="ＭＳ 明朝" w:hAnsi="Century"/>
-          <w:sz w:val="22"/>
-        </w:rPr>
-      </w:pPr>
-      <w:r>
-        <w:rPr>
-          <w:rFonts w:ascii="Century" w:eastAsia="ＭＳ 明朝" w:hAnsi="Century" w:hint="eastAsia"/>
-          <w:sz w:val="22"/>
-        </w:rPr>
-        <w:t>2</w:t>
-      </w:r>
-      <w:r>
-        <w:rPr>
-          <w:rFonts w:ascii="Century" w:eastAsia="ＭＳ 明朝" w:hAnsi="Century" w:hint="eastAsia"/>
-          <w:sz w:val="22"/>
-        </w:rPr>
-        <w:t>～</w:t>
-      </w:r>
-      <w:r>
-        <w:rPr>
-          <w:rFonts w:ascii="Century" w:eastAsia="ＭＳ 明朝" w:hAnsi="Century" w:hint="eastAsia"/>
-          <w:sz w:val="22"/>
-        </w:rPr>
-        <w:t>4</w:t>
-      </w:r>
-      <w:r>
-        <w:rPr>
-          <w:rFonts w:ascii="Century" w:eastAsia="ＭＳ 明朝" w:hAnsi="Century" w:hint="eastAsia"/>
-          <w:sz w:val="22"/>
-        </w:rPr>
-        <w:t>ページにある</w:t>
-      </w:r>
-      <w:r>
-        <w:rPr>
-          <w:rFonts w:ascii="Century" w:eastAsia="ＭＳ 明朝" w:hAnsi="Century" w:hint="eastAsia"/>
-          <w:sz w:val="22"/>
-        </w:rPr>
-        <w:t>1</w:t>
-      </w:r>
-      <w:r>
-        <w:rPr>
-          <w:rFonts w:ascii="Century" w:eastAsia="ＭＳ 明朝" w:hAnsi="Century" w:hint="eastAsia"/>
-          <w:sz w:val="22"/>
-        </w:rPr>
-        <w:t>－</w:t>
-      </w:r>
-      <w:r>
-        <w:rPr>
-          <w:rFonts w:ascii="Century" w:eastAsia="ＭＳ 明朝" w:hAnsi="Century" w:hint="eastAsia"/>
-          <w:sz w:val="22"/>
-        </w:rPr>
-        <w:t>5</w:t>
-      </w:r>
-      <w:r>
-        <w:rPr>
-          <w:rFonts w:ascii="Century" w:eastAsia="ＭＳ 明朝" w:hAnsi="Century" w:hint="eastAsia"/>
-          <w:sz w:val="22"/>
-        </w:rPr>
-        <w:t>の質問に回答してくださ</w:t>
-      </w:r>
-      <w:r>
-        <w:rPr>
-          <w:rFonts w:ascii="Century" w:eastAsia="ＭＳ 明朝" w:hAnsi="Century" w:hint="eastAsia"/>
-          <w:sz w:val="22"/>
-        </w:rPr>
-        <w:t>い</w:t>
-      </w:r>
-      <w:r>
-        <w:rPr>
-          <w:rFonts w:ascii="Century" w:eastAsia="ＭＳ 明朝" w:hAnsi="Century" w:hint="eastAsia"/>
-          <w:sz w:val="22"/>
-        </w:rPr>
-        <w:t>。受講生選抜の際の審査資料となりますので、本プログラムの趣旨をよく理解し、記述してください。</w:t>
-      </w:r>
-    </w:p>
-    <w:p>
-      <w:pPr>
-        <w:snapToGrid w:val="0"/>
-        <w:spacing w:line="324" w:lineRule="auto"/>
-        <w:rPr>
-          <w:rFonts w:ascii="Century" w:eastAsia="ＭＳ 明朝" w:hAnsi="Century"/>
-          <w:sz w:val="22"/>
-        </w:rPr>
-      </w:pPr>
       <w:r>
         <w:rPr>
           <w:rFonts w:ascii="Century" w:eastAsia="ＭＳ 明朝" w:hAnsi="Century" w:hint="eastAsia"/>
@@ -1079,46 +1044,6 @@
         </w:rPr>
         <w:t>に収まる分量で記載してください。</w:t>
       </w:r>
-    </w:p>
-    <w:p>
-      <w:pPr>
-        <w:snapToGrid w:val="0"/>
-        <w:spacing w:line="324" w:lineRule="auto"/>
-        <w:rPr>
-          <w:rFonts w:ascii="Century" w:eastAsia="ＭＳ 明朝" w:hAnsi="Century"/>
-          <w:sz w:val="22"/>
-        </w:rPr>
-      </w:pPr>
-    </w:p>
-    <w:p>
-      <w:pPr>
-        <w:snapToGrid w:val="0"/>
-        <w:spacing w:line="324" w:lineRule="auto"/>
-        <w:rPr>
-          <w:rFonts w:ascii="Century" w:eastAsia="ＭＳ 明朝" w:hAnsi="Century"/>
-          <w:sz w:val="22"/>
-        </w:rPr>
-      </w:pPr>
-    </w:p>
-    <w:p>
-      <w:pPr>
-        <w:snapToGrid w:val="0"/>
-        <w:spacing w:line="324" w:lineRule="auto"/>
-        <w:rPr>
-          <w:rFonts w:ascii="Century" w:eastAsia="ＭＳ 明朝" w:hAnsi="Century"/>
-          <w:sz w:val="22"/>
-        </w:rPr>
-      </w:pPr>
-    </w:p>
-    <w:p>
-      <w:pPr>
-        <w:snapToGrid w:val="0"/>
-        <w:spacing w:line="324" w:lineRule="auto"/>
-        <w:rPr>
-          <w:rFonts w:ascii="Century" w:eastAsia="ＭＳ 明朝" w:hAnsi="Century"/>
-          <w:sz w:val="22"/>
-        </w:rPr>
-      </w:pPr>
     </w:p>
     <w:tbl>
       <w:tblPr>
@@ -1216,74 +1141,6 @@
       </w:tblGrid>
       <w:tr>
         <w:trPr>
-          <w:trHeight w:val="6416"/>
-        </w:trPr>
-        <w:tc>
-          <w:tcPr>
-            <w:tcW w:w="9639" w:type="dxa"/>
-          </w:tcPr>
-          <w:p>
-            <w:pPr>
-              <w:pStyle w:val="a4"/>
-              <w:numPr>
-                <w:ilvl w:val="0"/>
-                <w:numId w:val="3"/>
-              </w:numPr>
-              <w:snapToGrid w:val="0"/>
-              <w:spacing w:line="324" w:lineRule="auto"/>
-              <w:ind w:leftChars="0"/>
-              <w:rPr>
-                <w:rFonts w:ascii="Century" w:eastAsia="ＭＳ 明朝" w:hAnsi="Century"/>
-                <w:sz w:val="22"/>
-              </w:rPr>
-            </w:pPr>
-          </w:p>
-          <w:p>
-            <w:pPr>
-              <w:snapToGrid w:val="0"/>
-              <w:spacing w:line="324" w:lineRule="auto"/>
-              <w:rPr>
-                <w:rFonts w:ascii="Century" w:eastAsia="ＭＳ 明朝" w:hAnsi="Century"/>
-                <w:sz w:val="22"/>
-              </w:rPr>
-            </w:pPr>
-          </w:p>
-          <w:p>
-            <w:pPr>
-              <w:snapToGrid w:val="0"/>
-              <w:spacing w:line="324" w:lineRule="auto"/>
-              <w:rPr>
-                <w:rFonts w:ascii="Century" w:eastAsia="ＭＳ 明朝" w:hAnsi="Century"/>
-                <w:sz w:val="22"/>
-              </w:rPr>
-            </w:pPr>
-          </w:p>
-        </w:tc>
-      </w:tr>
-    </w:tbl>
-    <w:p>
-      <w:pPr>
-        <w:snapToGrid w:val="0"/>
-        <w:spacing w:line="276" w:lineRule="auto"/>
-        <w:rPr>
-          <w:rFonts w:ascii="Century" w:eastAsia="ＭＳ 明朝" w:hAnsi="Century"/>
-          <w:sz w:val="22"/>
-        </w:rPr>
-      </w:pPr>
-    </w:p>
-    <w:tbl>
-      <w:tblPr>
-        <w:tblStyle w:val="a3"/>
-        <w:tblW w:w="9639" w:type="dxa"/>
-        <w:tblInd w:w="-459" w:type="dxa"/>
-        <w:tblLayout w:type="fixed"/>
-        <w:tblLook w:val="04A0" w:firstRow="1" w:lastRow="0" w:firstColumn="1" w:lastColumn="0" w:noHBand="0" w:noVBand="1"/>
-      </w:tblPr>
-      <w:tblGrid>
-        <w:gridCol w:w="9639"/>
-      </w:tblGrid>
-      <w:tr>
-        <w:trPr>
           <w:trHeight w:val="3534"/>
         </w:trPr>
         <w:tc>
@@ -1636,56 +1493,16 @@
               </w:rPr>
               <w:br/>
             </w:r>
-            <w:r>
-              <w:rPr>
-                <w:rFonts w:ascii="ＭＳ 明朝" w:eastAsia="ＭＳ 明朝" w:hAnsi="ＭＳ 明朝"/>
-                <w:sz w:val="22"/>
-              </w:rPr>
-              <w:fldChar w:fldCharType="begin"/>
-            </w:r>
-            <w:r>
-              <w:rPr>
-                <w:rFonts w:ascii="ＭＳ 明朝" w:eastAsia="ＭＳ 明朝" w:hAnsi="ＭＳ 明朝"/>
-                <w:sz w:val="22"/>
-              </w:rPr>
-              <w:instrText>HYPERLINK "</w:instrText>
-            </w:r>
-            <w:r>
-              <w:rPr>
-                <w:rFonts w:ascii="ＭＳ 明朝" w:eastAsia="ＭＳ 明朝" w:hAnsi="ＭＳ 明朝"/>
-                <w:sz w:val="22"/>
-              </w:rPr>
-              <w:instrText>https://www.youtube.com/watch?v=2tYpUXiw4-0</w:instrText>
-            </w:r>
-            <w:r>
-              <w:rPr>
-                <w:rFonts w:ascii="ＭＳ 明朝" w:eastAsia="ＭＳ 明朝" w:hAnsi="ＭＳ 明朝"/>
-                <w:sz w:val="22"/>
-              </w:rPr>
-              <w:instrText>"</w:instrText>
-            </w:r>
-            <w:r>
-              <w:rPr>
-                <w:rFonts w:ascii="ＭＳ 明朝" w:eastAsia="ＭＳ 明朝" w:hAnsi="ＭＳ 明朝"/>
-                <w:sz w:val="22"/>
-              </w:rPr>
-              <w:fldChar w:fldCharType="separate"/>
-            </w:r>
-            <w:r>
-              <w:rPr>
-                <w:rStyle w:val="a9"/>
-                <w:rFonts w:ascii="ＭＳ 明朝" w:eastAsia="ＭＳ 明朝" w:hAnsi="ＭＳ 明朝"/>
-                <w:sz w:val="22"/>
-              </w:rPr>
-              <w:t>https://www.youtube.com/watch?v=2tYpUXiw4-0</w:t>
-            </w:r>
-            <w:r>
-              <w:rPr>
-                <w:rFonts w:ascii="ＭＳ 明朝" w:eastAsia="ＭＳ 明朝" w:hAnsi="ＭＳ 明朝"/>
-                <w:sz w:val="22"/>
-              </w:rPr>
-              <w:fldChar w:fldCharType="end"/>
-            </w:r>
+            <w:hyperlink r:id="rId7" w:history="1">
+              <w:r>
+                <w:rPr>
+                  <w:rStyle w:val="a9"/>
+                  <w:rFonts w:ascii="ＭＳ 明朝" w:eastAsia="ＭＳ 明朝" w:hAnsi="ＭＳ 明朝"/>
+                  <w:sz w:val="22"/>
+                </w:rPr>
+                <w:t>https://www.youtube.com/watch?v=2tYpUXiw4-0</w:t>
+              </w:r>
+            </w:hyperlink>
             <w:r>
               <w:rPr>
                 <w:rFonts w:ascii="ＭＳ 明朝" w:eastAsia="ＭＳ 明朝" w:hAnsi="ＭＳ 明朝"/>
@@ -1771,98 +1588,35 @@
           <w:p>
             <w:pPr>
               <w:ind w:left="210" w:firstLineChars="200" w:firstLine="440"/>
+            </w:pPr>
+            <w:r>
+              <w:rPr>
+                <w:rFonts w:ascii="ＭＳ 明朝" w:eastAsia="ＭＳ 明朝" w:hAnsi="ＭＳ 明朝" w:hint="eastAsia"/>
+                <w:sz w:val="22"/>
+              </w:rPr>
+              <w:t>それらを前提に</w:t>
+            </w:r>
+            <w:r>
               <w:rPr>
                 <w:rFonts w:ascii="ＭＳ 明朝" w:eastAsia="ＭＳ 明朝" w:hAnsi="ＭＳ 明朝"/>
                 <w:sz w:val="22"/>
               </w:rPr>
-            </w:pPr>
+              <w:t>、</w:t>
+            </w:r>
             <w:r>
               <w:rPr>
                 <w:rFonts w:ascii="ＭＳ 明朝" w:eastAsia="ＭＳ 明朝" w:hAnsi="ＭＳ 明朝" w:hint="eastAsia"/>
                 <w:sz w:val="22"/>
               </w:rPr>
-              <w:t>それらを前提に</w:t>
+              <w:t>火山学的知見は、</w:t>
             </w:r>
             <w:r>
               <w:rPr>
                 <w:rFonts w:ascii="ＭＳ 明朝" w:eastAsia="ＭＳ 明朝" w:hAnsi="ＭＳ 明朝"/>
                 <w:sz w:val="22"/>
               </w:rPr>
-              <w:t>、</w:t>
-            </w:r>
-            <w:r>
-              <w:rPr>
-                <w:rFonts w:ascii="ＭＳ 明朝" w:eastAsia="ＭＳ 明朝" w:hAnsi="ＭＳ 明朝" w:hint="eastAsia"/>
-                <w:sz w:val="22"/>
-              </w:rPr>
-              <w:t>火山学的知見は、</w:t>
-            </w:r>
-            <w:r>
-              <w:rPr>
-                <w:rFonts w:ascii="ＭＳ 明朝" w:eastAsia="ＭＳ 明朝" w:hAnsi="ＭＳ 明朝"/>
-                <w:sz w:val="22"/>
-              </w:rPr>
               <w:t>社会の中でどのように位置づけられるべきか。</w:t>
             </w:r>
-          </w:p>
-          <w:p>
-            <w:pPr>
-              <w:ind w:left="210" w:firstLineChars="200" w:firstLine="400"/>
-              <w:rPr>
-                <w:kern w:val="0"/>
-                <w:szCs w:val="21"/>
-              </w:rPr>
-            </w:pPr>
-          </w:p>
-          <w:p>
-            <w:pPr>
-              <w:ind w:left="210" w:firstLineChars="200" w:firstLine="420"/>
-              <w:rPr>
-                <w:kern w:val="0"/>
-                <w:szCs w:val="21"/>
-              </w:rPr>
-            </w:pPr>
-          </w:p>
-          <w:p>
-            <w:pPr>
-              <w:ind w:left="210" w:firstLineChars="200" w:firstLine="420"/>
-              <w:rPr>
-                <w:kern w:val="0"/>
-                <w:szCs w:val="21"/>
-              </w:rPr>
-            </w:pPr>
-          </w:p>
-          <w:p>
-            <w:pPr>
-              <w:ind w:left="210" w:firstLineChars="200" w:firstLine="420"/>
-              <w:rPr>
-                <w:kern w:val="0"/>
-                <w:szCs w:val="21"/>
-              </w:rPr>
-            </w:pPr>
-          </w:p>
-          <w:p>
-            <w:pPr>
-              <w:ind w:left="210" w:firstLineChars="200" w:firstLine="420"/>
-              <w:rPr>
-                <w:kern w:val="0"/>
-                <w:szCs w:val="21"/>
-              </w:rPr>
-            </w:pPr>
-          </w:p>
-          <w:p>
-            <w:pPr>
-              <w:ind w:left="210" w:firstLineChars="200" w:firstLine="420"/>
-              <w:rPr>
-                <w:kern w:val="0"/>
-                <w:szCs w:val="21"/>
-              </w:rPr>
-            </w:pPr>
-          </w:p>
-          <w:p>
-            <w:pPr>
-              <w:ind w:left="210" w:firstLineChars="200" w:firstLine="420"/>
-            </w:pPr>
           </w:p>
         </w:tc>
       </w:tr>
@@ -1890,7 +1644,7 @@
         <mc:AlternateContent>
           <mc:Choice Requires="wps">
             <w:drawing>
-              <wp:anchor distT="0" distB="0" distL="114300" distR="114300" simplePos="0" relativeHeight="251659264" behindDoc="0" locked="0" layoutInCell="1" allowOverlap="1" ns4:anchorId="2B12CD68" ns4:editId="320F51FB">
+              <wp:anchor distT="0" distB="0" distL="114300" distR="114300" simplePos="0" relativeHeight="251659264" behindDoc="0" locked="0" layoutInCell="1" allowOverlap="1" wp14:anchorId="2B12CD68" wp14:editId="320F51FB">
                 <wp:simplePos x="0" y="0"/>
                 <wp:positionH relativeFrom="column">
                   <wp:posOffset>-451982</wp:posOffset>
@@ -1903,11 +1657,11 @@
                 <wp:wrapNone/>
                 <wp:docPr id="625074268" name="正方形/長方形 1"/>
                 <wp:cNvGraphicFramePr/>
-                <a:graphic>
+                <a:graphic xmlns:a="http://schemas.openxmlformats.org/drawingml/2006/main">
                   <a:graphicData uri="http://schemas.microsoft.com/office/word/2010/wordprocessingShape">
-                    <ns6:wsp>
-                      <ns6:cNvSpPr/>
-                      <ns6:spPr>
+                    <wps:wsp>
+                      <wps:cNvSpPr/>
+                      <wps:spPr>
                         <a:xfrm>
                           <a:off x="0" y="0"/>
                           <a:ext cx="6328907" cy="8507481"/>
@@ -1920,8 +1674,8 @@
                             <a:schemeClr val="tx1"/>
                           </a:solidFill>
                         </a:ln>
-                      </ns6:spPr>
-                      <ns6:style>
+                      </wps:spPr>
+                      <wps:style>
                         <a:lnRef idx="2">
                           <a:schemeClr val="accent6"/>
                         </a:lnRef>
@@ -1934,22 +1688,22 @@
                         <a:fontRef idx="minor">
                           <a:schemeClr val="dk1"/>
                         </a:fontRef>
-                      </ns6:style>
-                      <ns6:bodyPr rot="0" spcFirstLastPara="0" vertOverflow="overflow" horzOverflow="overflow" vert="horz" wrap="square" lIns="91440" tIns="45720" rIns="91440" bIns="45720" numCol="1" spcCol="0" rtlCol="0" fromWordArt="0" anchor="ctr" anchorCtr="0" forceAA="0" compatLnSpc="1">
+                      </wps:style>
+                      <wps:bodyPr rot="0" spcFirstLastPara="0" vertOverflow="overflow" horzOverflow="overflow" vert="horz" wrap="square" lIns="91440" tIns="45720" rIns="91440" bIns="45720" numCol="1" spcCol="0" rtlCol="0" fromWordArt="0" anchor="ctr" anchorCtr="0" forceAA="0" compatLnSpc="1">
                         <a:prstTxWarp prst="textNoShape">
                           <a:avLst/>
                         </a:prstTxWarp>
                         <a:noAutofit/>
-                      </ns6:bodyPr>
-                    </ns6:wsp>
+                      </wps:bodyPr>
+                    </wps:wsp>
                   </a:graphicData>
                 </a:graphic>
-                <ns4:sizeRelH relativeFrom="margin">
-                  <ns4:pctWidth>0</ns4:pctWidth>
-                </ns4:sizeRelH>
-                <ns4:sizeRelV relativeFrom="margin">
-                  <ns4:pctHeight>0</ns4:pctHeight>
-                </ns4:sizeRelV>
+                <wp14:sizeRelH relativeFrom="margin">
+                  <wp14:pctWidth>0</wp14:pctWidth>
+                </wp14:sizeRelH>
+                <wp14:sizeRelV relativeFrom="margin">
+                  <wp14:pctHeight>0</wp14:pctHeight>
+                </wp14:sizeRelV>
               </wp:anchor>
             </w:drawing>
           </mc:Choice>
@@ -1962,8 +1716,8 @@
       </w:r>
     </w:p>
     <w:sectPr>
-      <w:headerReference w:type="default" r:id="rId7"/>
-      <w:footerReference w:type="default" r:id="rId8"/>
+      <w:headerReference w:type="default" r:id="rId8"/>
+      <w:footerReference w:type="default" r:id="rId9"/>
       <w:pgSz w:w="11906" w:h="16838"/>
       <w:pgMar w:top="1985" w:right="1701" w:bottom="1701" w:left="1701" w:header="851" w:footer="992" w:gutter="0"/>
       <w:cols w:space="425"/>
@@ -1974,7 +1728,7 @@
 </file>
 
 <file path=word/endnotes.xml><?xml version="1.0" encoding="utf-8"?>
-<w:endnotes xmlns:mc="http://schemas.openxmlformats.org/markup-compatibility/2006" xmlns:w="http://schemas.openxmlformats.org/wordprocessingml/2006/main" xmlns:w14="http://schemas.microsoft.com/office/word/2010/wordml" xmlns:w15="http://schemas.microsoft.com/office/word/2012/wordml" xmlns:w16se="http://schemas.microsoft.com/office/word/2015/wordml/symex" xmlns:w16cid="http://schemas.microsoft.com/office/word/2016/wordml/cid" xmlns:w16="http://schemas.microsoft.com/office/word/2018/wordml" xmlns:w16cex="http://schemas.microsoft.com/office/word/2018/wordml/cex" xmlns:w16sdtdh="http://schemas.microsoft.com/office/word/2020/wordml/sdtdatahash" xmlns:w16sdtfl="http://schemas.microsoft.com/office/word/2024/wordml/sdtformatlock" xmlns:w16du="http://schemas.microsoft.com/office/word/2023/wordml/word16du" xmlns:wp14="http://schemas.microsoft.com/office/word/2010/wordprocessingDrawing" mc:Ignorable="w14 w15 w16se w16cid w16 w16cex w16sdtdh w16sdtfl w16du wp14">
+<w:endnotes xmlns:wpc="http://schemas.microsoft.com/office/word/2010/wordprocessingCanvas" xmlns:cx="http://schemas.microsoft.com/office/drawing/2014/chartex" xmlns:cx1="http://schemas.microsoft.com/office/drawing/2015/9/8/chartex" xmlns:cx2="http://schemas.microsoft.com/office/drawing/2015/10/21/chartex" xmlns:cx3="http://schemas.microsoft.com/office/drawing/2016/5/9/chartex" xmlns:cx4="http://schemas.microsoft.com/office/drawing/2016/5/10/chartex" xmlns:cx5="http://schemas.microsoft.com/office/drawing/2016/5/11/chartex" xmlns:cx6="http://schemas.microsoft.com/office/drawing/2016/5/12/chartex" xmlns:cx7="http://schemas.microsoft.com/office/drawing/2016/5/13/chartex" xmlns:cx8="http://schemas.microsoft.com/office/drawing/2016/5/14/chartex" xmlns:mc="http://schemas.openxmlformats.org/markup-compatibility/2006" xmlns:aink="http://schemas.microsoft.com/office/drawing/2016/ink" xmlns:am3d="http://schemas.microsoft.com/office/drawing/2017/model3d" xmlns:o="urn:schemas-microsoft-com:office:office" xmlns:oel="http://schemas.microsoft.com/office/2019/extlst" xmlns:r="http://schemas.openxmlformats.org/officeDocument/2006/relationships" xmlns:m="http://schemas.openxmlformats.org/officeDocument/2006/math" xmlns:v="urn:schemas-microsoft-com:vml" xmlns:wp14="http://schemas.microsoft.com/office/word/2010/wordprocessingDrawing" xmlns:wp="http://schemas.openxmlformats.org/drawingml/2006/wordprocessingDrawing" xmlns:w10="urn:schemas-microsoft-com:office:word" xmlns:w="http://schemas.openxmlformats.org/wordprocessingml/2006/main" xmlns:w14="http://schemas.microsoft.com/office/word/2010/wordml" xmlns:w15="http://schemas.microsoft.com/office/word/2012/wordml" xmlns:w16cex="http://schemas.microsoft.com/office/word/2018/wordml/cex" xmlns:w16cid="http://schemas.microsoft.com/office/word/2016/wordml/cid" xmlns:w16="http://schemas.microsoft.com/office/word/2018/wordml" xmlns:w16du="http://schemas.microsoft.com/office/word/2023/wordml/word16du" xmlns:w16sdtdh="http://schemas.microsoft.com/office/word/2020/wordml/sdtdatahash" xmlns:w16sdtfl="http://schemas.microsoft.com/office/word/2024/wordml/sdtformatlock" xmlns:w16se="http://schemas.microsoft.com/office/word/2015/wordml/symex" xmlns:wpg="http://schemas.microsoft.com/office/word/2010/wordprocessingGroup" xmlns:wpi="http://schemas.microsoft.com/office/word/2010/wordprocessingInk" xmlns:wne="http://schemas.microsoft.com/office/word/2006/wordml" xmlns:wps="http://schemas.microsoft.com/office/word/2010/wordprocessingShape" mc:Ignorable="w14 w15 w16se w16cid w16 w16cex w16sdtdh w16sdtfl w16du wp14">
   <w:endnote w:type="separator" w:id="-1">
     <w:p>
       <w:r>
@@ -1993,7 +1747,7 @@
 </file>
 
 <file path=word/footer1.xml><?xml version="1.0" encoding="utf-8"?>
-<w:ftr xmlns:mc="http://schemas.openxmlformats.org/markup-compatibility/2006" xmlns:w="http://schemas.openxmlformats.org/wordprocessingml/2006/main" xmlns:w14="http://schemas.microsoft.com/office/word/2010/wordml" xmlns:w15="http://schemas.microsoft.com/office/word/2012/wordml" xmlns:w16se="http://schemas.microsoft.com/office/word/2015/wordml/symex" xmlns:w16cid="http://schemas.microsoft.com/office/word/2016/wordml/cid" xmlns:w16="http://schemas.microsoft.com/office/word/2018/wordml" xmlns:w16cex="http://schemas.microsoft.com/office/word/2018/wordml/cex" xmlns:w16sdtdh="http://schemas.microsoft.com/office/word/2020/wordml/sdtdatahash" xmlns:w16sdtfl="http://schemas.microsoft.com/office/word/2024/wordml/sdtformatlock" xmlns:w16du="http://schemas.microsoft.com/office/word/2023/wordml/word16du" xmlns:wp14="http://schemas.microsoft.com/office/word/2010/wordprocessingDrawing" mc:Ignorable="w14 w15 w16se w16cid w16 w16cex w16sdtdh w16sdtfl w16du wp14">
+<w:ftr xmlns:wpc="http://schemas.microsoft.com/office/word/2010/wordprocessingCanvas" xmlns:cx="http://schemas.microsoft.com/office/drawing/2014/chartex" xmlns:cx1="http://schemas.microsoft.com/office/drawing/2015/9/8/chartex" xmlns:cx2="http://schemas.microsoft.com/office/drawing/2015/10/21/chartex" xmlns:cx3="http://schemas.microsoft.com/office/drawing/2016/5/9/chartex" xmlns:cx4="http://schemas.microsoft.com/office/drawing/2016/5/10/chartex" xmlns:cx5="http://schemas.microsoft.com/office/drawing/2016/5/11/chartex" xmlns:cx6="http://schemas.microsoft.com/office/drawing/2016/5/12/chartex" xmlns:cx7="http://schemas.microsoft.com/office/drawing/2016/5/13/chartex" xmlns:cx8="http://schemas.microsoft.com/office/drawing/2016/5/14/chartex" xmlns:mc="http://schemas.openxmlformats.org/markup-compatibility/2006" xmlns:aink="http://schemas.microsoft.com/office/drawing/2016/ink" xmlns:am3d="http://schemas.microsoft.com/office/drawing/2017/model3d" xmlns:o="urn:schemas-microsoft-com:office:office" xmlns:oel="http://schemas.microsoft.com/office/2019/extlst" xmlns:r="http://schemas.openxmlformats.org/officeDocument/2006/relationships" xmlns:m="http://schemas.openxmlformats.org/officeDocument/2006/math" xmlns:v="urn:schemas-microsoft-com:vml" xmlns:wp14="http://schemas.microsoft.com/office/word/2010/wordprocessingDrawing" xmlns:wp="http://schemas.openxmlformats.org/drawingml/2006/wordprocessingDrawing" xmlns:w10="urn:schemas-microsoft-com:office:word" xmlns:w="http://schemas.openxmlformats.org/wordprocessingml/2006/main" xmlns:w14="http://schemas.microsoft.com/office/word/2010/wordml" xmlns:w15="http://schemas.microsoft.com/office/word/2012/wordml" xmlns:w16cex="http://schemas.microsoft.com/office/word/2018/wordml/cex" xmlns:w16cid="http://schemas.microsoft.com/office/word/2016/wordml/cid" xmlns:w16="http://schemas.microsoft.com/office/word/2018/wordml" xmlns:w16du="http://schemas.microsoft.com/office/word/2023/wordml/word16du" xmlns:w16sdtdh="http://schemas.microsoft.com/office/word/2020/wordml/sdtdatahash" xmlns:w16sdtfl="http://schemas.microsoft.com/office/word/2024/wordml/sdtformatlock" xmlns:w16se="http://schemas.microsoft.com/office/word/2015/wordml/symex" xmlns:wpg="http://schemas.microsoft.com/office/word/2010/wordprocessingGroup" xmlns:wpi="http://schemas.microsoft.com/office/word/2010/wordprocessingInk" xmlns:wne="http://schemas.microsoft.com/office/word/2006/wordml" xmlns:wps="http://schemas.microsoft.com/office/word/2010/wordprocessingShape" mc:Ignorable="w14 w15 w16se w16cid w16 w16cex w16sdtdh w16sdtfl w16du wp14">
   <w:sdt>
     <w:sdtPr>
       <w:id w:val="356314425"/>
@@ -2039,7 +1793,7 @@
 </file>
 
 <file path=word/footnotes.xml><?xml version="1.0" encoding="utf-8"?>
-<w:footnotes xmlns:mc="http://schemas.openxmlformats.org/markup-compatibility/2006" xmlns:w="http://schemas.openxmlformats.org/wordprocessingml/2006/main" xmlns:w14="http://schemas.microsoft.com/office/word/2010/wordml" xmlns:w15="http://schemas.microsoft.com/office/word/2012/wordml" xmlns:w16se="http://schemas.microsoft.com/office/word/2015/wordml/symex" xmlns:w16cid="http://schemas.microsoft.com/office/word/2016/wordml/cid" xmlns:w16="http://schemas.microsoft.com/office/word/2018/wordml" xmlns:w16cex="http://schemas.microsoft.com/office/word/2018/wordml/cex" xmlns:w16sdtdh="http://schemas.microsoft.com/office/word/2020/wordml/sdtdatahash" xmlns:w16sdtfl="http://schemas.microsoft.com/office/word/2024/wordml/sdtformatlock" xmlns:w16du="http://schemas.microsoft.com/office/word/2023/wordml/word16du" xmlns:wp14="http://schemas.microsoft.com/office/word/2010/wordprocessingDrawing" mc:Ignorable="w14 w15 w16se w16cid w16 w16cex w16sdtdh w16sdtfl w16du wp14">
+<w:footnotes xmlns:wpc="http://schemas.microsoft.com/office/word/2010/wordprocessingCanvas" xmlns:cx="http://schemas.microsoft.com/office/drawing/2014/chartex" xmlns:cx1="http://schemas.microsoft.com/office/drawing/2015/9/8/chartex" xmlns:cx2="http://schemas.microsoft.com/office/drawing/2015/10/21/chartex" xmlns:cx3="http://schemas.microsoft.com/office/drawing/2016/5/9/chartex" xmlns:cx4="http://schemas.microsoft.com/office/drawing/2016/5/10/chartex" xmlns:cx5="http://schemas.microsoft.com/office/drawing/2016/5/11/chartex" xmlns:cx6="http://schemas.microsoft.com/office/drawing/2016/5/12/chartex" xmlns:cx7="http://schemas.microsoft.com/office/drawing/2016/5/13/chartex" xmlns:cx8="http://schemas.microsoft.com/office/drawing/2016/5/14/chartex" xmlns:mc="http://schemas.openxmlformats.org/markup-compatibility/2006" xmlns:aink="http://schemas.microsoft.com/office/drawing/2016/ink" xmlns:am3d="http://schemas.microsoft.com/office/drawing/2017/model3d" xmlns:o="urn:schemas-microsoft-com:office:office" xmlns:oel="http://schemas.microsoft.com/office/2019/extlst" xmlns:r="http://schemas.openxmlformats.org/officeDocument/2006/relationships" xmlns:m="http://schemas.openxmlformats.org/officeDocument/2006/math" xmlns:v="urn:schemas-microsoft-com:vml" xmlns:wp14="http://schemas.microsoft.com/office/word/2010/wordprocessingDrawing" xmlns:wp="http://schemas.openxmlformats.org/drawingml/2006/wordprocessingDrawing" xmlns:w10="urn:schemas-microsoft-com:office:word" xmlns:w="http://schemas.openxmlformats.org/wordprocessingml/2006/main" xmlns:w14="http://schemas.microsoft.com/office/word/2010/wordml" xmlns:w15="http://schemas.microsoft.com/office/word/2012/wordml" xmlns:w16cex="http://schemas.microsoft.com/office/word/2018/wordml/cex" xmlns:w16cid="http://schemas.microsoft.com/office/word/2016/wordml/cid" xmlns:w16="http://schemas.microsoft.com/office/word/2018/wordml" xmlns:w16du="http://schemas.microsoft.com/office/word/2023/wordml/word16du" xmlns:w16sdtdh="http://schemas.microsoft.com/office/word/2020/wordml/sdtdatahash" xmlns:w16sdtfl="http://schemas.microsoft.com/office/word/2024/wordml/sdtformatlock" xmlns:w16se="http://schemas.microsoft.com/office/word/2015/wordml/symex" xmlns:wpg="http://schemas.microsoft.com/office/word/2010/wordprocessingGroup" xmlns:wpi="http://schemas.microsoft.com/office/word/2010/wordprocessingInk" xmlns:wne="http://schemas.microsoft.com/office/word/2006/wordml" xmlns:wps="http://schemas.microsoft.com/office/word/2010/wordprocessingShape" mc:Ignorable="w14 w15 w16se w16cid w16 w16cex w16sdtdh w16sdtfl w16du wp14">
   <w:footnote w:type="separator" w:id="-1">
     <w:p>
       <w:r>
@@ -2058,7 +1812,7 @@
 </file>
 
 <file path=word/header1.xml><?xml version="1.0" encoding="utf-8"?>
-<w:hdr xmlns:mc="http://schemas.openxmlformats.org/markup-compatibility/2006" xmlns:w="http://schemas.openxmlformats.org/wordprocessingml/2006/main" xmlns:w14="http://schemas.microsoft.com/office/word/2010/wordml" xmlns:w15="http://schemas.microsoft.com/office/word/2012/wordml" xmlns:w16se="http://schemas.microsoft.com/office/word/2015/wordml/symex" xmlns:w16cid="http://schemas.microsoft.com/office/word/2016/wordml/cid" xmlns:w16="http://schemas.microsoft.com/office/word/2018/wordml" xmlns:w16cex="http://schemas.microsoft.com/office/word/2018/wordml/cex" xmlns:w16sdtdh="http://schemas.microsoft.com/office/word/2020/wordml/sdtdatahash" xmlns:w16sdtfl="http://schemas.microsoft.com/office/word/2024/wordml/sdtformatlock" xmlns:w16du="http://schemas.microsoft.com/office/word/2023/wordml/word16du" xmlns:wp14="http://schemas.microsoft.com/office/word/2010/wordprocessingDrawing" mc:Ignorable="w14 w15 w16se w16cid w16 w16cex w16sdtdh w16sdtfl w16du wp14">
+<w:hdr xmlns:wpc="http://schemas.microsoft.com/office/word/2010/wordprocessingCanvas" xmlns:cx="http://schemas.microsoft.com/office/drawing/2014/chartex" xmlns:cx1="http://schemas.microsoft.com/office/drawing/2015/9/8/chartex" xmlns:cx2="http://schemas.microsoft.com/office/drawing/2015/10/21/chartex" xmlns:cx3="http://schemas.microsoft.com/office/drawing/2016/5/9/chartex" xmlns:cx4="http://schemas.microsoft.com/office/drawing/2016/5/10/chartex" xmlns:cx5="http://schemas.microsoft.com/office/drawing/2016/5/11/chartex" xmlns:cx6="http://schemas.microsoft.com/office/drawing/2016/5/12/chartex" xmlns:cx7="http://schemas.microsoft.com/office/drawing/2016/5/13/chartex" xmlns:cx8="http://schemas.microsoft.com/office/drawing/2016/5/14/chartex" xmlns:mc="http://schemas.openxmlformats.org/markup-compatibility/2006" xmlns:aink="http://schemas.microsoft.com/office/drawing/2016/ink" xmlns:am3d="http://schemas.microsoft.com/office/drawing/2017/model3d" xmlns:o="urn:schemas-microsoft-com:office:office" xmlns:oel="http://schemas.microsoft.com/office/2019/extlst" xmlns:r="http://schemas.openxmlformats.org/officeDocument/2006/relationships" xmlns:m="http://schemas.openxmlformats.org/officeDocument/2006/math" xmlns:v="urn:schemas-microsoft-com:vml" xmlns:wp14="http://schemas.microsoft.com/office/word/2010/wordprocessingDrawing" xmlns:wp="http://schemas.openxmlformats.org/drawingml/2006/wordprocessingDrawing" xmlns:w10="urn:schemas-microsoft-com:office:word" xmlns:w="http://schemas.openxmlformats.org/wordprocessingml/2006/main" xmlns:w14="http://schemas.microsoft.com/office/word/2010/wordml" xmlns:w15="http://schemas.microsoft.com/office/word/2012/wordml" xmlns:w16cex="http://schemas.microsoft.com/office/word/2018/wordml/cex" xmlns:w16cid="http://schemas.microsoft.com/office/word/2016/wordml/cid" xmlns:w16="http://schemas.microsoft.com/office/word/2018/wordml" xmlns:w16du="http://schemas.microsoft.com/office/word/2023/wordml/word16du" xmlns:w16sdtdh="http://schemas.microsoft.com/office/word/2020/wordml/sdtdatahash" xmlns:w16sdtfl="http://schemas.microsoft.com/office/word/2024/wordml/sdtformatlock" xmlns:w16se="http://schemas.microsoft.com/office/word/2015/wordml/symex" xmlns:wpg="http://schemas.microsoft.com/office/word/2010/wordprocessingGroup" xmlns:wpi="http://schemas.microsoft.com/office/word/2010/wordprocessingInk" xmlns:wne="http://schemas.microsoft.com/office/word/2006/wordml" xmlns:wps="http://schemas.microsoft.com/office/word/2010/wordprocessingShape" mc:Ignorable="w14 w15 w16se w16cid w16 w16cex w16sdtdh w16sdtfl w16du wp14">
   <w:tbl>
     <w:tblPr>
       <w:tblStyle w:val="a3"/>
@@ -2144,7 +1898,7 @@
 </file>
 
 <file path=word/numbering.xml><?xml version="1.0" encoding="utf-8"?>
-<w:numbering xmlns:mc="http://schemas.openxmlformats.org/markup-compatibility/2006" xmlns:w="http://schemas.openxmlformats.org/wordprocessingml/2006/main" xmlns:w15="http://schemas.microsoft.com/office/word/2012/wordml" xmlns:w16cid="http://schemas.microsoft.com/office/word/2016/wordml/cid" xmlns:w14="http://schemas.microsoft.com/office/word/2010/wordml" xmlns:w16se="http://schemas.microsoft.com/office/word/2015/wordml/symex" xmlns:w16="http://schemas.microsoft.com/office/word/2018/wordml" xmlns:w16cex="http://schemas.microsoft.com/office/word/2018/wordml/cex" xmlns:w16sdtdh="http://schemas.microsoft.com/office/word/2020/wordml/sdtdatahash" xmlns:w16sdtfl="http://schemas.microsoft.com/office/word/2024/wordml/sdtformatlock" xmlns:w16du="http://schemas.microsoft.com/office/word/2023/wordml/word16du" xmlns:wp14="http://schemas.microsoft.com/office/word/2010/wordprocessingDrawing" mc:Ignorable="w14 w15 w16se w16cid w16 w16cex w16sdtdh w16sdtfl w16du wp14">
+<w:numbering xmlns:wpc="http://schemas.microsoft.com/office/word/2010/wordprocessingCanvas" xmlns:cx="http://schemas.microsoft.com/office/drawing/2014/chartex" xmlns:cx1="http://schemas.microsoft.com/office/drawing/2015/9/8/chartex" xmlns:cx2="http://schemas.microsoft.com/office/drawing/2015/10/21/chartex" xmlns:cx3="http://schemas.microsoft.com/office/drawing/2016/5/9/chartex" xmlns:cx4="http://schemas.microsoft.com/office/drawing/2016/5/10/chartex" xmlns:cx5="http://schemas.microsoft.com/office/drawing/2016/5/11/chartex" xmlns:cx6="http://schemas.microsoft.com/office/drawing/2016/5/12/chartex" xmlns:cx7="http://schemas.microsoft.com/office/drawing/2016/5/13/chartex" xmlns:cx8="http://schemas.microsoft.com/office/drawing/2016/5/14/chartex" xmlns:mc="http://schemas.openxmlformats.org/markup-compatibility/2006" xmlns:aink="http://schemas.microsoft.com/office/drawing/2016/ink" xmlns:am3d="http://schemas.microsoft.com/office/drawing/2017/model3d" xmlns:o="urn:schemas-microsoft-com:office:office" xmlns:oel="http://schemas.microsoft.com/office/2019/extlst" xmlns:r="http://schemas.openxmlformats.org/officeDocument/2006/relationships" xmlns:m="http://schemas.openxmlformats.org/officeDocument/2006/math" xmlns:v="urn:schemas-microsoft-com:vml" xmlns:wp14="http://schemas.microsoft.com/office/word/2010/wordprocessingDrawing" xmlns:wp="http://schemas.openxmlformats.org/drawingml/2006/wordprocessingDrawing" xmlns:w10="urn:schemas-microsoft-com:office:word" xmlns:w="http://schemas.openxmlformats.org/wordprocessingml/2006/main" xmlns:w14="http://schemas.microsoft.com/office/word/2010/wordml" xmlns:w15="http://schemas.microsoft.com/office/word/2012/wordml" xmlns:w16cex="http://schemas.microsoft.com/office/word/2018/wordml/cex" xmlns:w16cid="http://schemas.microsoft.com/office/word/2016/wordml/cid" xmlns:w16="http://schemas.microsoft.com/office/word/2018/wordml" xmlns:w16du="http://schemas.microsoft.com/office/word/2023/wordml/word16du" xmlns:w16sdtdh="http://schemas.microsoft.com/office/word/2020/wordml/sdtdatahash" xmlns:w16sdtfl="http://schemas.microsoft.com/office/word/2024/wordml/sdtformatlock" xmlns:w16se="http://schemas.microsoft.com/office/word/2015/wordml/symex" xmlns:wpg="http://schemas.microsoft.com/office/word/2010/wordprocessingGroup" xmlns:wpi="http://schemas.microsoft.com/office/word/2010/wordprocessingInk" xmlns:wne="http://schemas.microsoft.com/office/word/2006/wordml" xmlns:wps="http://schemas.microsoft.com/office/word/2010/wordprocessingShape" mc:Ignorable="w14 w15 w16se w16cid w16 w16cex w16sdtdh w16sdtfl w16du wp14">
   <w:abstractNum w:abstractNumId="0" w15:restartNumberingAfterBreak="0">
     <w:nsid w:val="01EE3AAF"/>
     <w:multiLevelType w:val="hybridMultilevel"/>
@@ -2788,19 +2542,8 @@
 </w:numbering>
 </file>
 
-<file path=word/people.xml><?xml version="1.0" encoding="utf-8"?>
-<w15:people xmlns:mc="http://schemas.openxmlformats.org/markup-compatibility/2006" xmlns:w15="http://schemas.microsoft.com/office/word/2012/wordml" xmlns:w14="http://schemas.microsoft.com/office/word/2010/wordml" xmlns:w16se="http://schemas.microsoft.com/office/word/2015/wordml/symex" xmlns:w16cid="http://schemas.microsoft.com/office/word/2016/wordml/cid" xmlns:w16="http://schemas.microsoft.com/office/word/2018/wordml" xmlns:w16cex="http://schemas.microsoft.com/office/word/2018/wordml/cex" xmlns:w16sdtdh="http://schemas.microsoft.com/office/word/2020/wordml/sdtdatahash" xmlns:w16sdtfl="http://schemas.microsoft.com/office/word/2024/wordml/sdtformatlock" xmlns:w16du="http://schemas.microsoft.com/office/word/2023/wordml/word16du" xmlns:wp14="http://schemas.microsoft.com/office/word/2010/wordprocessingDrawing" mc:Ignorable="w14 w15 w16se w16cid w16 w16cex w16sdtdh w16sdtfl w16du wp14">
-  <w15:person w15:author="s s">
-    <w15:presenceInfo w15:providerId="Windows Live" w15:userId="6bd97d7f750e84bb"/>
-  </w15:person>
-  <w15:person w15:author="石塚吉浩">
-    <w15:presenceInfo w15:providerId="None" w15:userId="石塚吉浩"/>
-  </w15:person>
-</w15:people>
-</file>
-
 <file path=word/styles.xml><?xml version="1.0" encoding="utf-8"?>
-<w:styles xmlns:mc="http://schemas.openxmlformats.org/markup-compatibility/2006" xmlns:w="http://schemas.openxmlformats.org/wordprocessingml/2006/main" xmlns:w14="http://schemas.microsoft.com/office/word/2010/wordml" xmlns:w15="http://schemas.microsoft.com/office/word/2012/wordml" xmlns:w16se="http://schemas.microsoft.com/office/word/2015/wordml/symex" xmlns:w16cid="http://schemas.microsoft.com/office/word/2016/wordml/cid" xmlns:w16="http://schemas.microsoft.com/office/word/2018/wordml" xmlns:w16cex="http://schemas.microsoft.com/office/word/2018/wordml/cex" xmlns:w16sdtdh="http://schemas.microsoft.com/office/word/2020/wordml/sdtdatahash" xmlns:w16sdtfl="http://schemas.microsoft.com/office/word/2024/wordml/sdtformatlock" xmlns:w16du="http://schemas.microsoft.com/office/word/2023/wordml/word16du" mc:Ignorable="w14 w15 w16se w16cid w16 w16cex w16sdtdh w16sdtfl w16du">
+<w:styles xmlns:mc="http://schemas.openxmlformats.org/markup-compatibility/2006" xmlns:r="http://schemas.openxmlformats.org/officeDocument/2006/relationships" xmlns:w="http://schemas.openxmlformats.org/wordprocessingml/2006/main" xmlns:w14="http://schemas.microsoft.com/office/word/2010/wordml" xmlns:w15="http://schemas.microsoft.com/office/word/2012/wordml" xmlns:w16cex="http://schemas.microsoft.com/office/word/2018/wordml/cex" xmlns:w16cid="http://schemas.microsoft.com/office/word/2016/wordml/cid" xmlns:w16="http://schemas.microsoft.com/office/word/2018/wordml" xmlns:w16du="http://schemas.microsoft.com/office/word/2023/wordml/word16du" xmlns:w16sdtdh="http://schemas.microsoft.com/office/word/2020/wordml/sdtdatahash" xmlns:w16sdtfl="http://schemas.microsoft.com/office/word/2024/wordml/sdtformatlock" xmlns:w16se="http://schemas.microsoft.com/office/word/2015/wordml/symex" mc:Ignorable="w14 w15 w16se w16cid w16 w16cex w16sdtdh w16sdtfl w16du">
   <w:docDefaults>
     <w:rPrDefault>
       <w:rPr>
@@ -3203,6 +2946,7 @@
   <w:style w:type="character" w:default="1" w:styleId="a0">
     <w:name w:val="Default Paragraph Font"/>
     <w:uiPriority w:val="1"/>
+    <w:semiHidden/>
     <w:unhideWhenUsed/>
   </w:style>
   <w:style w:type="table" w:default="1" w:styleId="a1">
@@ -3475,7 +3219,7 @@
 </file>
 
 <file path=word/theme/theme1.xml><?xml version="1.0" encoding="utf-8"?>
-<a:theme xmlns:a="http://schemas.openxmlformats.org/drawingml/2006/main" xmlns:ns1="http://schemas.microsoft.com/office/thememl/2012/main" name="Office テーマ">
+<a:theme xmlns:a="http://schemas.openxmlformats.org/drawingml/2006/main" name="Office テーマ">
   <a:themeElements>
     <a:clrScheme name="Office">
       <a:dk1>
@@ -3763,7 +3507,7 @@
   <a:extraClrSchemeLst/>
   <a:extLst>
     <a:ext uri="{05A4C25C-085E-4340-85A3-A5531E510DB2}">
-      <ns1:themeFamily name="Office Theme" id="{62F939B6-93AF-4DB8-9C6B-D6C7DFDC589F}" vid="{4A3C46E8-61CC-4603-A589-7422A47A8E4A}"/>
+      <thm15:themeFamily xmlns:thm15="http://schemas.microsoft.com/office/thememl/2012/main" name="Office Theme" id="{62F939B6-93AF-4DB8-9C6B-D6C7DFDC589F}" vid="{4A3C46E8-61CC-4603-A589-7422A47A8E4A}"/>
     </a:ext>
   </a:extLst>
 </a:theme>

</xml_diff>